<commit_message>
add the scripts for the ai projects and also for the voting machine project for 4 th class children
</commit_message>
<xml_diff>
--- a/QTPI/Scripts for exhibiton.docx
+++ b/QTPI/Scripts for exhibiton.docx
@@ -4124,18 +4124,7 @@
           <w:szCs w:val="28"/>
           <w:lang w:val="en"/>
         </w:rPr>
-        <w:t xml:space="preserve"> using the following components. The components which we have used for building the base are five h</w:t>
-      </w:r>
-      <w:bookmarkStart w:id="0" w:name="_GoBack"/>
-      <w:bookmarkEnd w:id="0"/>
-      <w:r>
-        <w:rPr>
-          <w:rFonts w:ascii="Calibri" w:hAnsi="Calibri" w:cs="Calibri"/>
-          <w:sz w:val="28"/>
-          <w:szCs w:val="28"/>
-          <w:lang w:val="en"/>
-        </w:rPr>
-        <w:t>ole pillar, I block, 45 degree block, T connector, connector and L block.</w:t>
+        <w:t xml:space="preserve"> using the following components. The components which we have used for building the base are five hole pillar, I block, 45 degree block, T connector, connector and L block.</w:t>
       </w:r>
     </w:p>
     <w:p>
@@ -7202,6 +7191,1283 @@
     <w:p/>
     <w:p/>
     <w:p/>
+    <w:p>
+      <w:pPr>
+        <w:widowControl w:val="0"/>
+        <w:autoSpaceDE w:val="0"/>
+        <w:autoSpaceDN w:val="0"/>
+        <w:adjustRightInd w:val="0"/>
+        <w:jc w:val="center"/>
+        <w:rPr>
+          <w:rFonts w:cstheme="minorHAnsi"/>
+          <w:b/>
+          <w:bCs/>
+          <w:sz w:val="28"/>
+          <w:szCs w:val="28"/>
+          <w:lang w:val="en"/>
+        </w:rPr>
+      </w:pPr>
+      <w:r>
+        <w:rPr>
+          <w:rFonts w:cstheme="minorHAnsi"/>
+          <w:b/>
+          <w:bCs/>
+          <w:sz w:val="28"/>
+          <w:szCs w:val="28"/>
+          <w:lang w:val="en"/>
+        </w:rPr>
+        <w:lastRenderedPageBreak/>
+        <w:t>PROJECT 10</w:t>
+      </w:r>
+    </w:p>
+    <w:p>
+      <w:pPr>
+        <w:spacing w:before="100" w:beforeAutospacing="1" w:after="100" w:afterAutospacing="1" w:line="240" w:lineRule="auto"/>
+        <w:jc w:val="center"/>
+        <w:outlineLvl w:val="1"/>
+        <w:rPr>
+          <w:rFonts w:eastAsia="Times New Roman" w:cstheme="minorHAnsi"/>
+          <w:b/>
+          <w:bCs/>
+          <w:sz w:val="28"/>
+          <w:szCs w:val="28"/>
+        </w:rPr>
+      </w:pPr>
+      <w:r>
+        <w:rPr>
+          <w:rFonts w:eastAsia="Times New Roman" w:cstheme="minorHAnsi"/>
+          <w:b/>
+          <w:bCs/>
+          <w:sz w:val="28"/>
+          <w:szCs w:val="28"/>
+        </w:rPr>
+        <w:t>Principal Victor’s Voting Machine</w:t>
+      </w:r>
+    </w:p>
+    <w:p>
+      <w:pPr>
+        <w:spacing w:before="100" w:beforeAutospacing="1" w:after="100" w:afterAutospacing="1" w:line="240" w:lineRule="auto"/>
+        <w:outlineLvl w:val="2"/>
+        <w:rPr>
+          <w:rFonts w:eastAsia="Times New Roman" w:cstheme="minorHAnsi"/>
+          <w:b/>
+          <w:bCs/>
+          <w:sz w:val="28"/>
+          <w:szCs w:val="28"/>
+        </w:rPr>
+      </w:pPr>
+      <w:r>
+        <w:rPr>
+          <w:rFonts w:eastAsia="Times New Roman" w:cstheme="minorHAnsi"/>
+          <w:b/>
+          <w:bCs/>
+          <w:sz w:val="28"/>
+          <w:szCs w:val="28"/>
+        </w:rPr>
+        <w:t>Introduction</w:t>
+      </w:r>
+    </w:p>
+    <w:p>
+      <w:pPr>
+        <w:spacing w:before="100" w:beforeAutospacing="1" w:after="100" w:afterAutospacing="1" w:line="240" w:lineRule="auto"/>
+        <w:rPr>
+          <w:rFonts w:eastAsia="Times New Roman" w:cstheme="minorHAnsi"/>
+          <w:sz w:val="28"/>
+          <w:szCs w:val="28"/>
+        </w:rPr>
+      </w:pPr>
+      <w:r>
+        <w:rPr>
+          <w:rFonts w:eastAsia="Times New Roman" w:cstheme="minorHAnsi"/>
+          <w:b/>
+          <w:bCs/>
+          <w:sz w:val="28"/>
+          <w:szCs w:val="28"/>
+        </w:rPr>
+        <w:t>Student 1:</w:t>
+      </w:r>
+      <w:r>
+        <w:rPr>
+          <w:rFonts w:eastAsia="Times New Roman" w:cstheme="minorHAnsi"/>
+          <w:sz w:val="28"/>
+          <w:szCs w:val="28"/>
+        </w:rPr>
+        <w:br/>
+        <w:t xml:space="preserve">Good morning / Good afternoon. My name is </w:t>
+      </w:r>
+      <w:r>
+        <w:rPr>
+          <w:rFonts w:eastAsia="Times New Roman" w:cstheme="minorHAnsi"/>
+          <w:b/>
+          <w:bCs/>
+          <w:sz w:val="28"/>
+          <w:szCs w:val="28"/>
+        </w:rPr>
+        <w:t>(Student's Name)</w:t>
+      </w:r>
+      <w:r>
+        <w:rPr>
+          <w:rFonts w:eastAsia="Times New Roman" w:cstheme="minorHAnsi"/>
+          <w:sz w:val="28"/>
+          <w:szCs w:val="28"/>
+        </w:rPr>
+        <w:t xml:space="preserve"> and I am studying in </w:t>
+      </w:r>
+      <w:r>
+        <w:rPr>
+          <w:rFonts w:eastAsia="Times New Roman" w:cstheme="minorHAnsi"/>
+          <w:b/>
+          <w:bCs/>
+          <w:sz w:val="28"/>
+          <w:szCs w:val="28"/>
+        </w:rPr>
+        <w:t>Grade (Student's Grade)</w:t>
+      </w:r>
+      <w:r>
+        <w:rPr>
+          <w:rFonts w:eastAsia="Times New Roman" w:cstheme="minorHAnsi"/>
+          <w:sz w:val="28"/>
+          <w:szCs w:val="28"/>
+        </w:rPr>
+        <w:t>.</w:t>
+      </w:r>
+    </w:p>
+    <w:p>
+      <w:pPr>
+        <w:spacing w:before="100" w:beforeAutospacing="1" w:after="100" w:afterAutospacing="1" w:line="240" w:lineRule="auto"/>
+        <w:rPr>
+          <w:rFonts w:eastAsia="Times New Roman" w:cstheme="minorHAnsi"/>
+          <w:sz w:val="28"/>
+          <w:szCs w:val="28"/>
+        </w:rPr>
+      </w:pPr>
+      <w:r>
+        <w:rPr>
+          <w:rFonts w:eastAsia="Times New Roman" w:cstheme="minorHAnsi"/>
+          <w:sz w:val="28"/>
+          <w:szCs w:val="28"/>
+        </w:rPr>
+        <w:t xml:space="preserve">Our project is titled </w:t>
+      </w:r>
+      <w:r>
+        <w:rPr>
+          <w:rFonts w:eastAsia="Times New Roman" w:cstheme="minorHAnsi"/>
+          <w:b/>
+          <w:bCs/>
+          <w:sz w:val="28"/>
+          <w:szCs w:val="28"/>
+        </w:rPr>
+        <w:t>Principal Victor’s Voting Machine</w:t>
+      </w:r>
+      <w:r>
+        <w:rPr>
+          <w:rFonts w:eastAsia="Times New Roman" w:cstheme="minorHAnsi"/>
+          <w:sz w:val="28"/>
+          <w:szCs w:val="28"/>
+        </w:rPr>
+        <w:t xml:space="preserve">, and we have built it using the </w:t>
+      </w:r>
+      <w:r>
+        <w:rPr>
+          <w:rFonts w:eastAsia="Times New Roman" w:cstheme="minorHAnsi"/>
+          <w:b/>
+          <w:bCs/>
+          <w:sz w:val="28"/>
+          <w:szCs w:val="28"/>
+        </w:rPr>
+        <w:t>QTpi</w:t>
+      </w:r>
+      <w:bookmarkStart w:id="0" w:name="_GoBack"/>
+      <w:bookmarkEnd w:id="0"/>
+      <w:r>
+        <w:rPr>
+          <w:rFonts w:eastAsia="Times New Roman" w:cstheme="minorHAnsi"/>
+          <w:b/>
+          <w:bCs/>
+          <w:sz w:val="28"/>
+          <w:szCs w:val="28"/>
+        </w:rPr>
+        <w:t xml:space="preserve"> Robotics Kit</w:t>
+      </w:r>
+      <w:r>
+        <w:rPr>
+          <w:rFonts w:eastAsia="Times New Roman" w:cstheme="minorHAnsi"/>
+          <w:sz w:val="28"/>
+          <w:szCs w:val="28"/>
+        </w:rPr>
+        <w:t>.</w:t>
+      </w:r>
+    </w:p>
+    <w:p>
+      <w:pPr>
+        <w:spacing w:before="100" w:beforeAutospacing="1" w:after="100" w:afterAutospacing="1" w:line="240" w:lineRule="auto"/>
+        <w:rPr>
+          <w:rFonts w:eastAsia="Times New Roman" w:cstheme="minorHAnsi"/>
+          <w:sz w:val="28"/>
+          <w:szCs w:val="28"/>
+        </w:rPr>
+      </w:pPr>
+      <w:r>
+        <w:rPr>
+          <w:rFonts w:eastAsia="Times New Roman" w:cstheme="minorHAnsi"/>
+          <w:sz w:val="28"/>
+          <w:szCs w:val="28"/>
+        </w:rPr>
+        <w:t xml:space="preserve">The </w:t>
+      </w:r>
+      <w:r>
+        <w:rPr>
+          <w:rFonts w:eastAsia="Times New Roman" w:cstheme="minorHAnsi"/>
+          <w:b/>
+          <w:bCs/>
+          <w:sz w:val="28"/>
+          <w:szCs w:val="28"/>
+        </w:rPr>
+        <w:t>aim</w:t>
+      </w:r>
+      <w:r>
+        <w:rPr>
+          <w:rFonts w:eastAsia="Times New Roman" w:cstheme="minorHAnsi"/>
+          <w:sz w:val="28"/>
+          <w:szCs w:val="28"/>
+        </w:rPr>
+        <w:t xml:space="preserve"> of this project is to understand how </w:t>
+      </w:r>
+      <w:r>
+        <w:rPr>
+          <w:rFonts w:eastAsia="Times New Roman" w:cstheme="minorHAnsi"/>
+          <w:b/>
+          <w:bCs/>
+          <w:sz w:val="28"/>
+          <w:szCs w:val="28"/>
+        </w:rPr>
+        <w:t>electronic voting systems</w:t>
+      </w:r>
+      <w:r>
+        <w:rPr>
+          <w:rFonts w:eastAsia="Times New Roman" w:cstheme="minorHAnsi"/>
+          <w:sz w:val="28"/>
+          <w:szCs w:val="28"/>
+        </w:rPr>
+        <w:t xml:space="preserve"> function—where users can cast their votes safely and the system automatically </w:t>
+      </w:r>
+      <w:r>
+        <w:rPr>
+          <w:rFonts w:eastAsia="Times New Roman" w:cstheme="minorHAnsi"/>
+          <w:b/>
+          <w:bCs/>
+          <w:sz w:val="28"/>
+          <w:szCs w:val="28"/>
+        </w:rPr>
+        <w:t>records and counts</w:t>
+      </w:r>
+      <w:r>
+        <w:rPr>
+          <w:rFonts w:eastAsia="Times New Roman" w:cstheme="minorHAnsi"/>
+          <w:sz w:val="28"/>
+          <w:szCs w:val="28"/>
+        </w:rPr>
+        <w:t xml:space="preserve"> each vote. This is similar to how real electronic voting machines are used in national elections.</w:t>
+      </w:r>
+    </w:p>
+    <w:p>
+      <w:pPr>
+        <w:spacing w:before="100" w:beforeAutospacing="1" w:after="100" w:afterAutospacing="1" w:line="240" w:lineRule="auto"/>
+        <w:rPr>
+          <w:rFonts w:eastAsia="Times New Roman" w:cstheme="minorHAnsi"/>
+          <w:sz w:val="28"/>
+          <w:szCs w:val="28"/>
+        </w:rPr>
+      </w:pPr>
+      <w:r>
+        <w:rPr>
+          <w:rFonts w:eastAsia="Times New Roman" w:cstheme="minorHAnsi"/>
+          <w:sz w:val="28"/>
+          <w:szCs w:val="28"/>
+        </w:rPr>
+        <w:t>We constructed the base structure using components like:</w:t>
+      </w:r>
+    </w:p>
+    <w:p>
+      <w:pPr>
+        <w:numPr>
+          <w:ilvl w:val="0"/>
+          <w:numId w:val="3"/>
+        </w:numPr>
+        <w:spacing w:before="100" w:beforeAutospacing="1" w:after="100" w:afterAutospacing="1" w:line="240" w:lineRule="auto"/>
+        <w:rPr>
+          <w:rFonts w:eastAsia="Times New Roman" w:cstheme="minorHAnsi"/>
+          <w:sz w:val="28"/>
+          <w:szCs w:val="28"/>
+        </w:rPr>
+      </w:pPr>
+      <w:r>
+        <w:rPr>
+          <w:rFonts w:eastAsia="Times New Roman" w:cstheme="minorHAnsi"/>
+          <w:sz w:val="28"/>
+          <w:szCs w:val="28"/>
+        </w:rPr>
+        <w:t>Five-hole pillar</w:t>
+      </w:r>
+    </w:p>
+    <w:p>
+      <w:pPr>
+        <w:numPr>
+          <w:ilvl w:val="0"/>
+          <w:numId w:val="3"/>
+        </w:numPr>
+        <w:spacing w:before="100" w:beforeAutospacing="1" w:after="100" w:afterAutospacing="1" w:line="240" w:lineRule="auto"/>
+        <w:rPr>
+          <w:rFonts w:eastAsia="Times New Roman" w:cstheme="minorHAnsi"/>
+          <w:sz w:val="28"/>
+          <w:szCs w:val="28"/>
+        </w:rPr>
+      </w:pPr>
+      <w:r>
+        <w:rPr>
+          <w:rFonts w:eastAsia="Times New Roman" w:cstheme="minorHAnsi"/>
+          <w:sz w:val="28"/>
+          <w:szCs w:val="28"/>
+        </w:rPr>
+        <w:t>I block</w:t>
+      </w:r>
+    </w:p>
+    <w:p>
+      <w:pPr>
+        <w:numPr>
+          <w:ilvl w:val="0"/>
+          <w:numId w:val="3"/>
+        </w:numPr>
+        <w:spacing w:before="100" w:beforeAutospacing="1" w:after="100" w:afterAutospacing="1" w:line="240" w:lineRule="auto"/>
+        <w:rPr>
+          <w:rFonts w:eastAsia="Times New Roman" w:cstheme="minorHAnsi"/>
+          <w:sz w:val="28"/>
+          <w:szCs w:val="28"/>
+        </w:rPr>
+      </w:pPr>
+      <w:r>
+        <w:rPr>
+          <w:rFonts w:eastAsia="Times New Roman" w:cstheme="minorHAnsi"/>
+          <w:sz w:val="28"/>
+          <w:szCs w:val="28"/>
+        </w:rPr>
+        <w:t>T connector</w:t>
+      </w:r>
+    </w:p>
+    <w:p>
+      <w:pPr>
+        <w:numPr>
+          <w:ilvl w:val="0"/>
+          <w:numId w:val="3"/>
+        </w:numPr>
+        <w:spacing w:before="100" w:beforeAutospacing="1" w:after="100" w:afterAutospacing="1" w:line="240" w:lineRule="auto"/>
+        <w:rPr>
+          <w:rFonts w:eastAsia="Times New Roman" w:cstheme="minorHAnsi"/>
+          <w:sz w:val="28"/>
+          <w:szCs w:val="28"/>
+        </w:rPr>
+      </w:pPr>
+      <w:r>
+        <w:rPr>
+          <w:rFonts w:eastAsia="Times New Roman" w:cstheme="minorHAnsi"/>
+          <w:sz w:val="28"/>
+          <w:szCs w:val="28"/>
+        </w:rPr>
+        <w:t>L block</w:t>
+      </w:r>
+    </w:p>
+    <w:p>
+      <w:pPr>
+        <w:numPr>
+          <w:ilvl w:val="0"/>
+          <w:numId w:val="3"/>
+        </w:numPr>
+        <w:spacing w:before="100" w:beforeAutospacing="1" w:after="100" w:afterAutospacing="1" w:line="240" w:lineRule="auto"/>
+        <w:rPr>
+          <w:rFonts w:eastAsia="Times New Roman" w:cstheme="minorHAnsi"/>
+          <w:sz w:val="28"/>
+          <w:szCs w:val="28"/>
+        </w:rPr>
+      </w:pPr>
+      <w:r>
+        <w:rPr>
+          <w:rFonts w:eastAsia="Times New Roman" w:cstheme="minorHAnsi"/>
+          <w:sz w:val="28"/>
+          <w:szCs w:val="28"/>
+        </w:rPr>
+        <w:t>45° block</w:t>
+      </w:r>
+    </w:p>
+    <w:p>
+      <w:pPr>
+        <w:numPr>
+          <w:ilvl w:val="0"/>
+          <w:numId w:val="3"/>
+        </w:numPr>
+        <w:spacing w:before="100" w:beforeAutospacing="1" w:after="100" w:afterAutospacing="1" w:line="240" w:lineRule="auto"/>
+        <w:rPr>
+          <w:rFonts w:eastAsia="Times New Roman" w:cstheme="minorHAnsi"/>
+          <w:sz w:val="28"/>
+          <w:szCs w:val="28"/>
+        </w:rPr>
+      </w:pPr>
+      <w:r>
+        <w:rPr>
+          <w:rFonts w:eastAsia="Times New Roman" w:cstheme="minorHAnsi"/>
+          <w:sz w:val="28"/>
+          <w:szCs w:val="28"/>
+        </w:rPr>
+        <w:t>Additional connectors</w:t>
+      </w:r>
+    </w:p>
+    <w:p>
+      <w:pPr>
+        <w:spacing w:before="100" w:beforeAutospacing="1" w:after="100" w:afterAutospacing="1" w:line="240" w:lineRule="auto"/>
+        <w:rPr>
+          <w:rFonts w:eastAsia="Times New Roman" w:cstheme="minorHAnsi"/>
+          <w:sz w:val="28"/>
+          <w:szCs w:val="28"/>
+        </w:rPr>
+      </w:pPr>
+      <w:r>
+        <w:rPr>
+          <w:rFonts w:eastAsia="Times New Roman" w:cstheme="minorHAnsi"/>
+          <w:sz w:val="28"/>
+          <w:szCs w:val="28"/>
+        </w:rPr>
+        <w:t>Now my friend will explain the electronic components used.</w:t>
+      </w:r>
+    </w:p>
+    <w:p>
+      <w:pPr>
+        <w:spacing w:before="100" w:beforeAutospacing="1" w:after="100" w:afterAutospacing="1" w:line="240" w:lineRule="auto"/>
+        <w:outlineLvl w:val="2"/>
+        <w:rPr>
+          <w:rFonts w:eastAsia="Times New Roman" w:cstheme="minorHAnsi"/>
+          <w:b/>
+          <w:bCs/>
+          <w:sz w:val="28"/>
+          <w:szCs w:val="28"/>
+        </w:rPr>
+      </w:pPr>
+      <w:r>
+        <w:rPr>
+          <w:rFonts w:eastAsia="Times New Roman" w:cstheme="minorHAnsi"/>
+          <w:b/>
+          <w:bCs/>
+          <w:sz w:val="28"/>
+          <w:szCs w:val="28"/>
+        </w:rPr>
+        <w:t>Components Used</w:t>
+      </w:r>
+    </w:p>
+    <w:p>
+      <w:pPr>
+        <w:spacing w:before="100" w:beforeAutospacing="1" w:after="100" w:afterAutospacing="1" w:line="240" w:lineRule="auto"/>
+        <w:rPr>
+          <w:rFonts w:eastAsia="Times New Roman" w:cstheme="minorHAnsi"/>
+          <w:sz w:val="28"/>
+          <w:szCs w:val="28"/>
+        </w:rPr>
+      </w:pPr>
+      <w:r>
+        <w:rPr>
+          <w:rFonts w:eastAsia="Times New Roman" w:cstheme="minorHAnsi"/>
+          <w:b/>
+          <w:bCs/>
+          <w:sz w:val="28"/>
+          <w:szCs w:val="28"/>
+        </w:rPr>
+        <w:t>Student 2:</w:t>
+      </w:r>
+      <w:r>
+        <w:rPr>
+          <w:rFonts w:eastAsia="Times New Roman" w:cstheme="minorHAnsi"/>
+          <w:sz w:val="28"/>
+          <w:szCs w:val="28"/>
+        </w:rPr>
+        <w:br/>
+        <w:t xml:space="preserve">Hello, my name is </w:t>
+      </w:r>
+      <w:r>
+        <w:rPr>
+          <w:rFonts w:eastAsia="Times New Roman" w:cstheme="minorHAnsi"/>
+          <w:b/>
+          <w:bCs/>
+          <w:sz w:val="28"/>
+          <w:szCs w:val="28"/>
+        </w:rPr>
+        <w:t>(Student's Name)</w:t>
+      </w:r>
+      <w:r>
+        <w:rPr>
+          <w:rFonts w:eastAsia="Times New Roman" w:cstheme="minorHAnsi"/>
+          <w:sz w:val="28"/>
+          <w:szCs w:val="28"/>
+        </w:rPr>
+        <w:t xml:space="preserve">. These are the </w:t>
+      </w:r>
+      <w:r>
+        <w:rPr>
+          <w:rFonts w:eastAsia="Times New Roman" w:cstheme="minorHAnsi"/>
+          <w:b/>
+          <w:bCs/>
+          <w:sz w:val="28"/>
+          <w:szCs w:val="28"/>
+        </w:rPr>
+        <w:t>key components</w:t>
+      </w:r>
+      <w:r>
+        <w:rPr>
+          <w:rFonts w:eastAsia="Times New Roman" w:cstheme="minorHAnsi"/>
+          <w:sz w:val="28"/>
+          <w:szCs w:val="28"/>
+        </w:rPr>
+        <w:t xml:space="preserve"> used in our project:</w:t>
+      </w:r>
+    </w:p>
+    <w:p>
+      <w:pPr>
+        <w:numPr>
+          <w:ilvl w:val="0"/>
+          <w:numId w:val="4"/>
+        </w:numPr>
+        <w:spacing w:before="100" w:beforeAutospacing="1" w:after="100" w:afterAutospacing="1" w:line="240" w:lineRule="auto"/>
+        <w:rPr>
+          <w:rFonts w:eastAsia="Times New Roman" w:cstheme="minorHAnsi"/>
+          <w:sz w:val="28"/>
+          <w:szCs w:val="28"/>
+        </w:rPr>
+      </w:pPr>
+      <w:r>
+        <w:rPr>
+          <w:rFonts w:eastAsia="Times New Roman" w:cstheme="minorHAnsi"/>
+          <w:b/>
+          <w:bCs/>
+          <w:sz w:val="28"/>
+          <w:szCs w:val="28"/>
+        </w:rPr>
+        <w:t>QTpi Qbrick (Motherboard):</w:t>
+      </w:r>
+      <w:r>
+        <w:rPr>
+          <w:rFonts w:eastAsia="Times New Roman" w:cstheme="minorHAnsi"/>
+          <w:sz w:val="28"/>
+          <w:szCs w:val="28"/>
+        </w:rPr>
+        <w:t xml:space="preserve"> Acts as the </w:t>
+      </w:r>
+      <w:r>
+        <w:rPr>
+          <w:rFonts w:eastAsia="Times New Roman" w:cstheme="minorHAnsi"/>
+          <w:b/>
+          <w:bCs/>
+          <w:sz w:val="28"/>
+          <w:szCs w:val="28"/>
+        </w:rPr>
+        <w:t>brain</w:t>
+      </w:r>
+      <w:r>
+        <w:rPr>
+          <w:rFonts w:eastAsia="Times New Roman" w:cstheme="minorHAnsi"/>
+          <w:sz w:val="28"/>
+          <w:szCs w:val="28"/>
+        </w:rPr>
+        <w:t xml:space="preserve"> of our voting machine.</w:t>
+      </w:r>
+    </w:p>
+    <w:p>
+      <w:pPr>
+        <w:numPr>
+          <w:ilvl w:val="0"/>
+          <w:numId w:val="4"/>
+        </w:numPr>
+        <w:spacing w:before="100" w:beforeAutospacing="1" w:after="100" w:afterAutospacing="1" w:line="240" w:lineRule="auto"/>
+        <w:rPr>
+          <w:rFonts w:eastAsia="Times New Roman" w:cstheme="minorHAnsi"/>
+          <w:sz w:val="28"/>
+          <w:szCs w:val="28"/>
+        </w:rPr>
+      </w:pPr>
+      <w:r>
+        <w:rPr>
+          <w:rFonts w:eastAsia="Times New Roman" w:cstheme="minorHAnsi"/>
+          <w:b/>
+          <w:bCs/>
+          <w:sz w:val="28"/>
+          <w:szCs w:val="28"/>
+        </w:rPr>
+        <w:t>RJ Cables:</w:t>
+      </w:r>
+      <w:r>
+        <w:rPr>
+          <w:rFonts w:eastAsia="Times New Roman" w:cstheme="minorHAnsi"/>
+          <w:sz w:val="28"/>
+          <w:szCs w:val="28"/>
+        </w:rPr>
+        <w:t xml:space="preserve"> Connect all parts to the Qbrick for power and communication.</w:t>
+      </w:r>
+    </w:p>
+    <w:p>
+      <w:pPr>
+        <w:numPr>
+          <w:ilvl w:val="0"/>
+          <w:numId w:val="4"/>
+        </w:numPr>
+        <w:spacing w:before="100" w:beforeAutospacing="1" w:after="100" w:afterAutospacing="1" w:line="240" w:lineRule="auto"/>
+        <w:rPr>
+          <w:rFonts w:eastAsia="Times New Roman" w:cstheme="minorHAnsi"/>
+          <w:sz w:val="28"/>
+          <w:szCs w:val="28"/>
+        </w:rPr>
+      </w:pPr>
+      <w:r>
+        <w:rPr>
+          <w:rFonts w:eastAsia="Times New Roman" w:cstheme="minorHAnsi"/>
+          <w:b/>
+          <w:bCs/>
+          <w:sz w:val="28"/>
+          <w:szCs w:val="28"/>
+        </w:rPr>
+        <w:t>Limit Switches:</w:t>
+      </w:r>
+      <w:r>
+        <w:rPr>
+          <w:rFonts w:eastAsia="Times New Roman" w:cstheme="minorHAnsi"/>
+          <w:sz w:val="28"/>
+          <w:szCs w:val="28"/>
+        </w:rPr>
+        <w:t xml:space="preserve"> Used by voters to cast their vote. Each switch is assigned to one candidate.</w:t>
+      </w:r>
+    </w:p>
+    <w:p>
+      <w:pPr>
+        <w:numPr>
+          <w:ilvl w:val="0"/>
+          <w:numId w:val="4"/>
+        </w:numPr>
+        <w:spacing w:before="100" w:beforeAutospacing="1" w:after="100" w:afterAutospacing="1" w:line="240" w:lineRule="auto"/>
+        <w:rPr>
+          <w:rFonts w:eastAsia="Times New Roman" w:cstheme="minorHAnsi"/>
+          <w:sz w:val="28"/>
+          <w:szCs w:val="28"/>
+        </w:rPr>
+      </w:pPr>
+      <w:r>
+        <w:rPr>
+          <w:rFonts w:eastAsia="Times New Roman" w:cstheme="minorHAnsi"/>
+          <w:b/>
+          <w:bCs/>
+          <w:sz w:val="28"/>
+          <w:szCs w:val="28"/>
+        </w:rPr>
+        <w:t>RGB LED:</w:t>
+      </w:r>
+      <w:r>
+        <w:rPr>
+          <w:rFonts w:eastAsia="Times New Roman" w:cstheme="minorHAnsi"/>
+          <w:sz w:val="28"/>
+          <w:szCs w:val="28"/>
+        </w:rPr>
+        <w:t xml:space="preserve"> Lights up to indicate a successful vote.</w:t>
+      </w:r>
+    </w:p>
+    <w:p>
+      <w:pPr>
+        <w:spacing w:before="100" w:beforeAutospacing="1" w:after="100" w:afterAutospacing="1" w:line="240" w:lineRule="auto"/>
+        <w:rPr>
+          <w:rFonts w:eastAsia="Times New Roman" w:cstheme="minorHAnsi"/>
+          <w:sz w:val="28"/>
+          <w:szCs w:val="28"/>
+        </w:rPr>
+      </w:pPr>
+      <w:r>
+        <w:rPr>
+          <w:rFonts w:eastAsia="Times New Roman" w:cstheme="minorHAnsi"/>
+          <w:sz w:val="28"/>
+          <w:szCs w:val="28"/>
+        </w:rPr>
+        <w:t>My friend will now explain how the project works.</w:t>
+      </w:r>
+    </w:p>
+    <w:p>
+      <w:pPr>
+        <w:spacing w:before="100" w:beforeAutospacing="1" w:after="100" w:afterAutospacing="1" w:line="240" w:lineRule="auto"/>
+        <w:rPr>
+          <w:rFonts w:eastAsia="Times New Roman" w:cstheme="minorHAnsi"/>
+          <w:sz w:val="28"/>
+          <w:szCs w:val="28"/>
+        </w:rPr>
+      </w:pPr>
+    </w:p>
+    <w:p>
+      <w:pPr>
+        <w:spacing w:before="100" w:beforeAutospacing="1" w:after="100" w:afterAutospacing="1" w:line="240" w:lineRule="auto"/>
+        <w:rPr>
+          <w:rFonts w:eastAsia="Times New Roman" w:cstheme="minorHAnsi"/>
+          <w:sz w:val="28"/>
+          <w:szCs w:val="28"/>
+        </w:rPr>
+      </w:pPr>
+    </w:p>
+    <w:p>
+      <w:pPr>
+        <w:spacing w:before="100" w:beforeAutospacing="1" w:after="100" w:afterAutospacing="1" w:line="240" w:lineRule="auto"/>
+        <w:rPr>
+          <w:rFonts w:eastAsia="Times New Roman" w:cstheme="minorHAnsi"/>
+          <w:sz w:val="28"/>
+          <w:szCs w:val="28"/>
+        </w:rPr>
+      </w:pPr>
+    </w:p>
+    <w:p>
+      <w:pPr>
+        <w:spacing w:before="100" w:beforeAutospacing="1" w:after="100" w:afterAutospacing="1" w:line="240" w:lineRule="auto"/>
+        <w:outlineLvl w:val="2"/>
+        <w:rPr>
+          <w:rFonts w:eastAsia="Times New Roman" w:cstheme="minorHAnsi"/>
+          <w:b/>
+          <w:bCs/>
+          <w:sz w:val="28"/>
+          <w:szCs w:val="28"/>
+        </w:rPr>
+      </w:pPr>
+      <w:r>
+        <w:rPr>
+          <w:rFonts w:eastAsia="Times New Roman" w:cstheme="minorHAnsi"/>
+          <w:b/>
+          <w:bCs/>
+          <w:sz w:val="28"/>
+          <w:szCs w:val="28"/>
+        </w:rPr>
+        <w:t>Working of the Project</w:t>
+      </w:r>
+    </w:p>
+    <w:p>
+      <w:pPr>
+        <w:spacing w:before="100" w:beforeAutospacing="1" w:after="100" w:afterAutospacing="1" w:line="240" w:lineRule="auto"/>
+        <w:rPr>
+          <w:rFonts w:eastAsia="Times New Roman" w:cstheme="minorHAnsi"/>
+          <w:sz w:val="28"/>
+          <w:szCs w:val="28"/>
+        </w:rPr>
+      </w:pPr>
+      <w:r>
+        <w:rPr>
+          <w:rFonts w:eastAsia="Times New Roman" w:cstheme="minorHAnsi"/>
+          <w:b/>
+          <w:bCs/>
+          <w:sz w:val="28"/>
+          <w:szCs w:val="28"/>
+        </w:rPr>
+        <w:t>Student 3:</w:t>
+      </w:r>
+      <w:r>
+        <w:rPr>
+          <w:rFonts w:eastAsia="Times New Roman" w:cstheme="minorHAnsi"/>
+          <w:sz w:val="28"/>
+          <w:szCs w:val="28"/>
+        </w:rPr>
+        <w:br/>
+        <w:t xml:space="preserve">Hi, my name is </w:t>
+      </w:r>
+      <w:r>
+        <w:rPr>
+          <w:rFonts w:eastAsia="Times New Roman" w:cstheme="minorHAnsi"/>
+          <w:b/>
+          <w:bCs/>
+          <w:sz w:val="28"/>
+          <w:szCs w:val="28"/>
+        </w:rPr>
+        <w:t>(Student's Name)</w:t>
+      </w:r>
+      <w:r>
+        <w:rPr>
+          <w:rFonts w:eastAsia="Times New Roman" w:cstheme="minorHAnsi"/>
+          <w:sz w:val="28"/>
+          <w:szCs w:val="28"/>
+        </w:rPr>
+        <w:t xml:space="preserve">. I will now explain the </w:t>
+      </w:r>
+      <w:r>
+        <w:rPr>
+          <w:rFonts w:eastAsia="Times New Roman" w:cstheme="minorHAnsi"/>
+          <w:b/>
+          <w:bCs/>
+          <w:sz w:val="28"/>
+          <w:szCs w:val="28"/>
+        </w:rPr>
+        <w:t>working</w:t>
+      </w:r>
+      <w:r>
+        <w:rPr>
+          <w:rFonts w:eastAsia="Times New Roman" w:cstheme="minorHAnsi"/>
+          <w:sz w:val="28"/>
+          <w:szCs w:val="28"/>
+        </w:rPr>
+        <w:t xml:space="preserve"> of the voting machine.</w:t>
+      </w:r>
+    </w:p>
+    <w:p>
+      <w:pPr>
+        <w:numPr>
+          <w:ilvl w:val="0"/>
+          <w:numId w:val="5"/>
+        </w:numPr>
+        <w:spacing w:before="100" w:beforeAutospacing="1" w:after="100" w:afterAutospacing="1" w:line="240" w:lineRule="auto"/>
+        <w:rPr>
+          <w:rFonts w:eastAsia="Times New Roman" w:cstheme="minorHAnsi"/>
+          <w:sz w:val="28"/>
+          <w:szCs w:val="28"/>
+        </w:rPr>
+      </w:pPr>
+      <w:r>
+        <w:rPr>
+          <w:rFonts w:eastAsia="Times New Roman" w:cstheme="minorHAnsi"/>
+          <w:sz w:val="28"/>
+          <w:szCs w:val="28"/>
+        </w:rPr>
+        <w:t xml:space="preserve">The </w:t>
+      </w:r>
+      <w:r>
+        <w:rPr>
+          <w:rFonts w:eastAsia="Times New Roman" w:cstheme="minorHAnsi"/>
+          <w:b/>
+          <w:bCs/>
+          <w:sz w:val="28"/>
+          <w:szCs w:val="28"/>
+        </w:rPr>
+        <w:t>Qbrick</w:t>
+      </w:r>
+      <w:r>
+        <w:rPr>
+          <w:rFonts w:eastAsia="Times New Roman" w:cstheme="minorHAnsi"/>
+          <w:sz w:val="28"/>
+          <w:szCs w:val="28"/>
+        </w:rPr>
+        <w:t xml:space="preserve"> receives power and communicates with all components.</w:t>
+      </w:r>
+    </w:p>
+    <w:p>
+      <w:pPr>
+        <w:numPr>
+          <w:ilvl w:val="0"/>
+          <w:numId w:val="5"/>
+        </w:numPr>
+        <w:spacing w:before="100" w:beforeAutospacing="1" w:after="100" w:afterAutospacing="1" w:line="240" w:lineRule="auto"/>
+        <w:rPr>
+          <w:rFonts w:eastAsia="Times New Roman" w:cstheme="minorHAnsi"/>
+          <w:sz w:val="28"/>
+          <w:szCs w:val="28"/>
+        </w:rPr>
+      </w:pPr>
+      <w:r>
+        <w:rPr>
+          <w:rFonts w:eastAsia="Times New Roman" w:cstheme="minorHAnsi"/>
+          <w:sz w:val="28"/>
+          <w:szCs w:val="28"/>
+        </w:rPr>
+        <w:t xml:space="preserve">When a voter presses a </w:t>
+      </w:r>
+      <w:r>
+        <w:rPr>
+          <w:rFonts w:eastAsia="Times New Roman" w:cstheme="minorHAnsi"/>
+          <w:b/>
+          <w:bCs/>
+          <w:sz w:val="28"/>
+          <w:szCs w:val="28"/>
+        </w:rPr>
+        <w:t>limit switch</w:t>
+      </w:r>
+      <w:r>
+        <w:rPr>
+          <w:rFonts w:eastAsia="Times New Roman" w:cstheme="minorHAnsi"/>
+          <w:sz w:val="28"/>
+          <w:szCs w:val="28"/>
+        </w:rPr>
+        <w:t>, it sends a signal to the Qbrick.</w:t>
+      </w:r>
+    </w:p>
+    <w:p>
+      <w:pPr>
+        <w:numPr>
+          <w:ilvl w:val="0"/>
+          <w:numId w:val="5"/>
+        </w:numPr>
+        <w:spacing w:before="100" w:beforeAutospacing="1" w:after="100" w:afterAutospacing="1" w:line="240" w:lineRule="auto"/>
+        <w:rPr>
+          <w:rFonts w:eastAsia="Times New Roman" w:cstheme="minorHAnsi"/>
+          <w:sz w:val="28"/>
+          <w:szCs w:val="28"/>
+        </w:rPr>
+      </w:pPr>
+      <w:r>
+        <w:rPr>
+          <w:rFonts w:eastAsia="Times New Roman" w:cstheme="minorHAnsi"/>
+          <w:sz w:val="28"/>
+          <w:szCs w:val="28"/>
+        </w:rPr>
+        <w:t xml:space="preserve">Based on the program, the Qbrick identifies which switch was pressed and </w:t>
+      </w:r>
+      <w:r>
+        <w:rPr>
+          <w:rFonts w:eastAsia="Times New Roman" w:cstheme="minorHAnsi"/>
+          <w:b/>
+          <w:bCs/>
+          <w:sz w:val="28"/>
+          <w:szCs w:val="28"/>
+        </w:rPr>
+        <w:t>adds a vote to that candidate</w:t>
+      </w:r>
+      <w:r>
+        <w:rPr>
+          <w:rFonts w:eastAsia="Times New Roman" w:cstheme="minorHAnsi"/>
+          <w:sz w:val="28"/>
+          <w:szCs w:val="28"/>
+        </w:rPr>
+        <w:t>.</w:t>
+      </w:r>
+    </w:p>
+    <w:p>
+      <w:pPr>
+        <w:numPr>
+          <w:ilvl w:val="0"/>
+          <w:numId w:val="5"/>
+        </w:numPr>
+        <w:spacing w:before="100" w:beforeAutospacing="1" w:after="100" w:afterAutospacing="1" w:line="240" w:lineRule="auto"/>
+        <w:rPr>
+          <w:rFonts w:eastAsia="Times New Roman" w:cstheme="minorHAnsi"/>
+          <w:sz w:val="28"/>
+          <w:szCs w:val="28"/>
+        </w:rPr>
+      </w:pPr>
+      <w:r>
+        <w:rPr>
+          <w:rFonts w:eastAsia="Times New Roman" w:cstheme="minorHAnsi"/>
+          <w:sz w:val="28"/>
+          <w:szCs w:val="28"/>
+        </w:rPr>
+        <w:t xml:space="preserve">The </w:t>
+      </w:r>
+      <w:r>
+        <w:rPr>
+          <w:rFonts w:eastAsia="Times New Roman" w:cstheme="minorHAnsi"/>
+          <w:b/>
+          <w:bCs/>
+          <w:sz w:val="28"/>
+          <w:szCs w:val="28"/>
+        </w:rPr>
+        <w:t>RGB LED</w:t>
+      </w:r>
+      <w:r>
+        <w:rPr>
+          <w:rFonts w:eastAsia="Times New Roman" w:cstheme="minorHAnsi"/>
+          <w:sz w:val="28"/>
+          <w:szCs w:val="28"/>
+        </w:rPr>
+        <w:t xml:space="preserve"> glows or blinks as feedback to show that the vote has been recorded successfully.</w:t>
+      </w:r>
+    </w:p>
+    <w:p>
+      <w:pPr>
+        <w:spacing w:before="100" w:beforeAutospacing="1" w:after="100" w:afterAutospacing="1" w:line="240" w:lineRule="auto"/>
+        <w:rPr>
+          <w:rFonts w:eastAsia="Times New Roman" w:cstheme="minorHAnsi"/>
+          <w:sz w:val="28"/>
+          <w:szCs w:val="28"/>
+        </w:rPr>
+      </w:pPr>
+      <w:r>
+        <w:rPr>
+          <w:rFonts w:eastAsia="Times New Roman" w:cstheme="minorHAnsi"/>
+          <w:sz w:val="28"/>
+          <w:szCs w:val="28"/>
+        </w:rPr>
+        <w:t>This simulates a real-world voting machine, where each vote is securely processed and counted.</w:t>
+      </w:r>
+    </w:p>
+    <w:p>
+      <w:pPr>
+        <w:spacing w:after="0" w:line="240" w:lineRule="auto"/>
+        <w:rPr>
+          <w:rFonts w:eastAsia="Times New Roman" w:cstheme="minorHAnsi"/>
+          <w:sz w:val="28"/>
+          <w:szCs w:val="28"/>
+        </w:rPr>
+      </w:pPr>
+    </w:p>
+    <w:p>
+      <w:pPr>
+        <w:spacing w:after="0" w:line="240" w:lineRule="auto"/>
+        <w:rPr>
+          <w:rFonts w:eastAsia="Times New Roman" w:cstheme="minorHAnsi"/>
+          <w:sz w:val="28"/>
+          <w:szCs w:val="28"/>
+        </w:rPr>
+      </w:pPr>
+    </w:p>
+    <w:p>
+      <w:pPr>
+        <w:spacing w:before="100" w:beforeAutospacing="1" w:after="100" w:afterAutospacing="1" w:line="240" w:lineRule="auto"/>
+        <w:outlineLvl w:val="2"/>
+        <w:rPr>
+          <w:rFonts w:eastAsia="Times New Roman" w:cstheme="minorHAnsi"/>
+          <w:b/>
+          <w:bCs/>
+          <w:sz w:val="28"/>
+          <w:szCs w:val="28"/>
+        </w:rPr>
+      </w:pPr>
+      <w:r>
+        <w:rPr>
+          <w:rFonts w:eastAsia="Times New Roman" w:cstheme="minorHAnsi"/>
+          <w:b/>
+          <w:bCs/>
+          <w:sz w:val="28"/>
+          <w:szCs w:val="28"/>
+        </w:rPr>
+        <w:t>Demonstration</w:t>
+      </w:r>
+    </w:p>
+    <w:p>
+      <w:pPr>
+        <w:spacing w:before="100" w:beforeAutospacing="1" w:after="100" w:afterAutospacing="1" w:line="240" w:lineRule="auto"/>
+        <w:rPr>
+          <w:rFonts w:eastAsia="Times New Roman" w:cstheme="minorHAnsi"/>
+          <w:sz w:val="28"/>
+          <w:szCs w:val="28"/>
+        </w:rPr>
+      </w:pPr>
+      <w:r>
+        <w:rPr>
+          <w:rFonts w:eastAsia="Times New Roman" w:cstheme="minorHAnsi"/>
+          <w:b/>
+          <w:bCs/>
+          <w:sz w:val="28"/>
+          <w:szCs w:val="28"/>
+        </w:rPr>
+        <w:t>Student 4:</w:t>
+      </w:r>
+      <w:r>
+        <w:rPr>
+          <w:rFonts w:eastAsia="Times New Roman" w:cstheme="minorHAnsi"/>
+          <w:sz w:val="28"/>
+          <w:szCs w:val="28"/>
+        </w:rPr>
+        <w:br/>
+        <w:t xml:space="preserve">Hello, I am </w:t>
+      </w:r>
+      <w:r>
+        <w:rPr>
+          <w:rFonts w:eastAsia="Times New Roman" w:cstheme="minorHAnsi"/>
+          <w:b/>
+          <w:bCs/>
+          <w:sz w:val="28"/>
+          <w:szCs w:val="28"/>
+        </w:rPr>
+        <w:t>(Student's Name)</w:t>
+      </w:r>
+      <w:r>
+        <w:rPr>
+          <w:rFonts w:eastAsia="Times New Roman" w:cstheme="minorHAnsi"/>
+          <w:sz w:val="28"/>
+          <w:szCs w:val="28"/>
+        </w:rPr>
+        <w:t>. Here’s how we demonstrate the project:</w:t>
+      </w:r>
+    </w:p>
+    <w:p>
+      <w:pPr>
+        <w:numPr>
+          <w:ilvl w:val="0"/>
+          <w:numId w:val="6"/>
+        </w:numPr>
+        <w:spacing w:before="100" w:beforeAutospacing="1" w:after="100" w:afterAutospacing="1" w:line="240" w:lineRule="auto"/>
+        <w:rPr>
+          <w:rFonts w:eastAsia="Times New Roman" w:cstheme="minorHAnsi"/>
+          <w:sz w:val="28"/>
+          <w:szCs w:val="28"/>
+        </w:rPr>
+      </w:pPr>
+      <w:r>
+        <w:rPr>
+          <w:rFonts w:eastAsia="Times New Roman" w:cstheme="minorHAnsi"/>
+          <w:sz w:val="28"/>
+          <w:szCs w:val="28"/>
+        </w:rPr>
+        <w:t xml:space="preserve">We </w:t>
+      </w:r>
+      <w:r>
+        <w:rPr>
+          <w:rFonts w:eastAsia="Times New Roman" w:cstheme="minorHAnsi"/>
+          <w:b/>
+          <w:bCs/>
+          <w:sz w:val="28"/>
+          <w:szCs w:val="28"/>
+        </w:rPr>
+        <w:t>connect the Qbrick to a mobile phone via Bluetooth</w:t>
+      </w:r>
+      <w:r>
+        <w:rPr>
+          <w:rFonts w:eastAsia="Times New Roman" w:cstheme="minorHAnsi"/>
+          <w:sz w:val="28"/>
+          <w:szCs w:val="28"/>
+        </w:rPr>
+        <w:t>.</w:t>
+      </w:r>
+    </w:p>
+    <w:p>
+      <w:pPr>
+        <w:numPr>
+          <w:ilvl w:val="0"/>
+          <w:numId w:val="6"/>
+        </w:numPr>
+        <w:spacing w:before="100" w:beforeAutospacing="1" w:after="100" w:afterAutospacing="1" w:line="240" w:lineRule="auto"/>
+        <w:rPr>
+          <w:rFonts w:eastAsia="Times New Roman" w:cstheme="minorHAnsi"/>
+          <w:sz w:val="28"/>
+          <w:szCs w:val="28"/>
+        </w:rPr>
+      </w:pPr>
+      <w:r>
+        <w:rPr>
+          <w:rFonts w:eastAsia="Times New Roman" w:cstheme="minorHAnsi"/>
+          <w:sz w:val="28"/>
+          <w:szCs w:val="28"/>
+        </w:rPr>
+        <w:t xml:space="preserve">When a voter presses a </w:t>
+      </w:r>
+      <w:r>
+        <w:rPr>
+          <w:rFonts w:eastAsia="Times New Roman" w:cstheme="minorHAnsi"/>
+          <w:b/>
+          <w:bCs/>
+          <w:sz w:val="28"/>
+          <w:szCs w:val="28"/>
+        </w:rPr>
+        <w:t>limit switch</w:t>
+      </w:r>
+      <w:r>
+        <w:rPr>
+          <w:rFonts w:eastAsia="Times New Roman" w:cstheme="minorHAnsi"/>
+          <w:sz w:val="28"/>
+          <w:szCs w:val="28"/>
+        </w:rPr>
+        <w:t xml:space="preserve">, a </w:t>
+      </w:r>
+      <w:r>
+        <w:rPr>
+          <w:rFonts w:eastAsia="Times New Roman" w:cstheme="minorHAnsi"/>
+          <w:b/>
+          <w:bCs/>
+          <w:sz w:val="28"/>
+          <w:szCs w:val="28"/>
+        </w:rPr>
+        <w:t>vote is registered</w:t>
+      </w:r>
+      <w:r>
+        <w:rPr>
+          <w:rFonts w:eastAsia="Times New Roman" w:cstheme="minorHAnsi"/>
+          <w:sz w:val="28"/>
+          <w:szCs w:val="28"/>
+        </w:rPr>
+        <w:t xml:space="preserve">, and the </w:t>
+      </w:r>
+      <w:r>
+        <w:rPr>
+          <w:rFonts w:eastAsia="Times New Roman" w:cstheme="minorHAnsi"/>
+          <w:b/>
+          <w:bCs/>
+          <w:sz w:val="28"/>
+          <w:szCs w:val="28"/>
+        </w:rPr>
+        <w:t>vote count updates live</w:t>
+      </w:r>
+      <w:r>
+        <w:rPr>
+          <w:rFonts w:eastAsia="Times New Roman" w:cstheme="minorHAnsi"/>
+          <w:sz w:val="28"/>
+          <w:szCs w:val="28"/>
+        </w:rPr>
+        <w:t xml:space="preserve"> on the mobile app.</w:t>
+      </w:r>
+    </w:p>
+    <w:p>
+      <w:pPr>
+        <w:numPr>
+          <w:ilvl w:val="0"/>
+          <w:numId w:val="6"/>
+        </w:numPr>
+        <w:spacing w:before="100" w:beforeAutospacing="1" w:after="100" w:afterAutospacing="1" w:line="240" w:lineRule="auto"/>
+        <w:rPr>
+          <w:rFonts w:eastAsia="Times New Roman" w:cstheme="minorHAnsi"/>
+          <w:sz w:val="28"/>
+          <w:szCs w:val="28"/>
+        </w:rPr>
+      </w:pPr>
+      <w:r>
+        <w:rPr>
+          <w:rFonts w:eastAsia="Times New Roman" w:cstheme="minorHAnsi"/>
+          <w:sz w:val="28"/>
+          <w:szCs w:val="28"/>
+        </w:rPr>
+        <w:t xml:space="preserve">The </w:t>
+      </w:r>
+      <w:r>
+        <w:rPr>
+          <w:rFonts w:eastAsia="Times New Roman" w:cstheme="minorHAnsi"/>
+          <w:b/>
+          <w:bCs/>
+          <w:sz w:val="28"/>
+          <w:szCs w:val="28"/>
+        </w:rPr>
+        <w:t>RGB LED</w:t>
+      </w:r>
+      <w:r>
+        <w:rPr>
+          <w:rFonts w:eastAsia="Times New Roman" w:cstheme="minorHAnsi"/>
+          <w:sz w:val="28"/>
+          <w:szCs w:val="28"/>
+        </w:rPr>
+        <w:t xml:space="preserve"> lights up to confirm the vote has been counted.</w:t>
+      </w:r>
+    </w:p>
+    <w:p>
+      <w:pPr>
+        <w:spacing w:before="100" w:beforeAutospacing="1" w:after="100" w:afterAutospacing="1" w:line="240" w:lineRule="auto"/>
+        <w:rPr>
+          <w:rFonts w:eastAsia="Times New Roman" w:cstheme="minorHAnsi"/>
+          <w:sz w:val="28"/>
+          <w:szCs w:val="28"/>
+        </w:rPr>
+      </w:pPr>
+      <w:r>
+        <w:rPr>
+          <w:rFonts w:eastAsia="Times New Roman" w:cstheme="minorHAnsi"/>
+          <w:sz w:val="28"/>
+          <w:szCs w:val="28"/>
+        </w:rPr>
+        <w:t xml:space="preserve">This shows how a </w:t>
+      </w:r>
+      <w:r>
+        <w:rPr>
+          <w:rFonts w:eastAsia="Times New Roman" w:cstheme="minorHAnsi"/>
+          <w:b/>
+          <w:bCs/>
+          <w:sz w:val="28"/>
+          <w:szCs w:val="28"/>
+        </w:rPr>
+        <w:t>secure, automatic, and real-time voting system</w:t>
+      </w:r>
+      <w:r>
+        <w:rPr>
+          <w:rFonts w:eastAsia="Times New Roman" w:cstheme="minorHAnsi"/>
+          <w:sz w:val="28"/>
+          <w:szCs w:val="28"/>
+        </w:rPr>
+        <w:t xml:space="preserve"> can be implemented using simple electronics and robotics.</w:t>
+      </w:r>
+    </w:p>
     <w:p/>
     <w:sectPr>
       <w:pgSz w:w="11906" w:h="16838"/>
@@ -7226,9 +8492,605 @@
     </w:lvl>
   </w:abstractNum>
   <w:abstractNum w:abstractNumId="1">
+    <w:nsid w:val="0E312C93"/>
+    <w:multiLevelType w:val="multilevel"/>
+    <w:tmpl w:val="75C6918C"/>
+    <w:lvl w:ilvl="0">
+      <w:start w:val="1"/>
+      <w:numFmt w:val="bullet"/>
+      <w:lvlText w:val=""/>
+      <w:lvlJc w:val="left"/>
+      <w:pPr>
+        <w:tabs>
+          <w:tab w:val="num" w:pos="720"/>
+        </w:tabs>
+        <w:ind w:left="720" w:hanging="360"/>
+      </w:pPr>
+      <w:rPr>
+        <w:rFonts w:ascii="Symbol" w:hAnsi="Symbol" w:hint="default"/>
+        <w:sz w:val="20"/>
+      </w:rPr>
+    </w:lvl>
+    <w:lvl w:ilvl="1" w:tentative="1">
+      <w:start w:val="1"/>
+      <w:numFmt w:val="bullet"/>
+      <w:lvlText w:val="o"/>
+      <w:lvlJc w:val="left"/>
+      <w:pPr>
+        <w:tabs>
+          <w:tab w:val="num" w:pos="1440"/>
+        </w:tabs>
+        <w:ind w:left="1440" w:hanging="360"/>
+      </w:pPr>
+      <w:rPr>
+        <w:rFonts w:ascii="Courier New" w:hAnsi="Courier New" w:hint="default"/>
+        <w:sz w:val="20"/>
+      </w:rPr>
+    </w:lvl>
+    <w:lvl w:ilvl="2" w:tentative="1">
+      <w:start w:val="1"/>
+      <w:numFmt w:val="bullet"/>
+      <w:lvlText w:val=""/>
+      <w:lvlJc w:val="left"/>
+      <w:pPr>
+        <w:tabs>
+          <w:tab w:val="num" w:pos="2160"/>
+        </w:tabs>
+        <w:ind w:left="2160" w:hanging="360"/>
+      </w:pPr>
+      <w:rPr>
+        <w:rFonts w:ascii="Wingdings" w:hAnsi="Wingdings" w:hint="default"/>
+        <w:sz w:val="20"/>
+      </w:rPr>
+    </w:lvl>
+    <w:lvl w:ilvl="3" w:tentative="1">
+      <w:start w:val="1"/>
+      <w:numFmt w:val="bullet"/>
+      <w:lvlText w:val=""/>
+      <w:lvlJc w:val="left"/>
+      <w:pPr>
+        <w:tabs>
+          <w:tab w:val="num" w:pos="2880"/>
+        </w:tabs>
+        <w:ind w:left="2880" w:hanging="360"/>
+      </w:pPr>
+      <w:rPr>
+        <w:rFonts w:ascii="Wingdings" w:hAnsi="Wingdings" w:hint="default"/>
+        <w:sz w:val="20"/>
+      </w:rPr>
+    </w:lvl>
+    <w:lvl w:ilvl="4" w:tentative="1">
+      <w:start w:val="1"/>
+      <w:numFmt w:val="bullet"/>
+      <w:lvlText w:val=""/>
+      <w:lvlJc w:val="left"/>
+      <w:pPr>
+        <w:tabs>
+          <w:tab w:val="num" w:pos="3600"/>
+        </w:tabs>
+        <w:ind w:left="3600" w:hanging="360"/>
+      </w:pPr>
+      <w:rPr>
+        <w:rFonts w:ascii="Wingdings" w:hAnsi="Wingdings" w:hint="default"/>
+        <w:sz w:val="20"/>
+      </w:rPr>
+    </w:lvl>
+    <w:lvl w:ilvl="5" w:tentative="1">
+      <w:start w:val="1"/>
+      <w:numFmt w:val="bullet"/>
+      <w:lvlText w:val=""/>
+      <w:lvlJc w:val="left"/>
+      <w:pPr>
+        <w:tabs>
+          <w:tab w:val="num" w:pos="4320"/>
+        </w:tabs>
+        <w:ind w:left="4320" w:hanging="360"/>
+      </w:pPr>
+      <w:rPr>
+        <w:rFonts w:ascii="Wingdings" w:hAnsi="Wingdings" w:hint="default"/>
+        <w:sz w:val="20"/>
+      </w:rPr>
+    </w:lvl>
+    <w:lvl w:ilvl="6" w:tentative="1">
+      <w:start w:val="1"/>
+      <w:numFmt w:val="bullet"/>
+      <w:lvlText w:val=""/>
+      <w:lvlJc w:val="left"/>
+      <w:pPr>
+        <w:tabs>
+          <w:tab w:val="num" w:pos="5040"/>
+        </w:tabs>
+        <w:ind w:left="5040" w:hanging="360"/>
+      </w:pPr>
+      <w:rPr>
+        <w:rFonts w:ascii="Wingdings" w:hAnsi="Wingdings" w:hint="default"/>
+        <w:sz w:val="20"/>
+      </w:rPr>
+    </w:lvl>
+    <w:lvl w:ilvl="7" w:tentative="1">
+      <w:start w:val="1"/>
+      <w:numFmt w:val="bullet"/>
+      <w:lvlText w:val=""/>
+      <w:lvlJc w:val="left"/>
+      <w:pPr>
+        <w:tabs>
+          <w:tab w:val="num" w:pos="5760"/>
+        </w:tabs>
+        <w:ind w:left="5760" w:hanging="360"/>
+      </w:pPr>
+      <w:rPr>
+        <w:rFonts w:ascii="Wingdings" w:hAnsi="Wingdings" w:hint="default"/>
+        <w:sz w:val="20"/>
+      </w:rPr>
+    </w:lvl>
+    <w:lvl w:ilvl="8" w:tentative="1">
+      <w:start w:val="1"/>
+      <w:numFmt w:val="bullet"/>
+      <w:lvlText w:val=""/>
+      <w:lvlJc w:val="left"/>
+      <w:pPr>
+        <w:tabs>
+          <w:tab w:val="num" w:pos="6480"/>
+        </w:tabs>
+        <w:ind w:left="6480" w:hanging="360"/>
+      </w:pPr>
+      <w:rPr>
+        <w:rFonts w:ascii="Wingdings" w:hAnsi="Wingdings" w:hint="default"/>
+        <w:sz w:val="20"/>
+      </w:rPr>
+    </w:lvl>
+  </w:abstractNum>
+  <w:abstractNum w:abstractNumId="2">
+    <w:nsid w:val="1BEB2B95"/>
+    <w:multiLevelType w:val="multilevel"/>
+    <w:tmpl w:val="76ECD2A0"/>
+    <w:lvl w:ilvl="0">
+      <w:start w:val="1"/>
+      <w:numFmt w:val="bullet"/>
+      <w:lvlText w:val=""/>
+      <w:lvlJc w:val="left"/>
+      <w:pPr>
+        <w:tabs>
+          <w:tab w:val="num" w:pos="720"/>
+        </w:tabs>
+        <w:ind w:left="720" w:hanging="360"/>
+      </w:pPr>
+      <w:rPr>
+        <w:rFonts w:ascii="Symbol" w:hAnsi="Symbol" w:hint="default"/>
+        <w:sz w:val="20"/>
+      </w:rPr>
+    </w:lvl>
+    <w:lvl w:ilvl="1" w:tentative="1">
+      <w:start w:val="1"/>
+      <w:numFmt w:val="bullet"/>
+      <w:lvlText w:val="o"/>
+      <w:lvlJc w:val="left"/>
+      <w:pPr>
+        <w:tabs>
+          <w:tab w:val="num" w:pos="1440"/>
+        </w:tabs>
+        <w:ind w:left="1440" w:hanging="360"/>
+      </w:pPr>
+      <w:rPr>
+        <w:rFonts w:ascii="Courier New" w:hAnsi="Courier New" w:hint="default"/>
+        <w:sz w:val="20"/>
+      </w:rPr>
+    </w:lvl>
+    <w:lvl w:ilvl="2" w:tentative="1">
+      <w:start w:val="1"/>
+      <w:numFmt w:val="bullet"/>
+      <w:lvlText w:val=""/>
+      <w:lvlJc w:val="left"/>
+      <w:pPr>
+        <w:tabs>
+          <w:tab w:val="num" w:pos="2160"/>
+        </w:tabs>
+        <w:ind w:left="2160" w:hanging="360"/>
+      </w:pPr>
+      <w:rPr>
+        <w:rFonts w:ascii="Wingdings" w:hAnsi="Wingdings" w:hint="default"/>
+        <w:sz w:val="20"/>
+      </w:rPr>
+    </w:lvl>
+    <w:lvl w:ilvl="3" w:tentative="1">
+      <w:start w:val="1"/>
+      <w:numFmt w:val="bullet"/>
+      <w:lvlText w:val=""/>
+      <w:lvlJc w:val="left"/>
+      <w:pPr>
+        <w:tabs>
+          <w:tab w:val="num" w:pos="2880"/>
+        </w:tabs>
+        <w:ind w:left="2880" w:hanging="360"/>
+      </w:pPr>
+      <w:rPr>
+        <w:rFonts w:ascii="Wingdings" w:hAnsi="Wingdings" w:hint="default"/>
+        <w:sz w:val="20"/>
+      </w:rPr>
+    </w:lvl>
+    <w:lvl w:ilvl="4" w:tentative="1">
+      <w:start w:val="1"/>
+      <w:numFmt w:val="bullet"/>
+      <w:lvlText w:val=""/>
+      <w:lvlJc w:val="left"/>
+      <w:pPr>
+        <w:tabs>
+          <w:tab w:val="num" w:pos="3600"/>
+        </w:tabs>
+        <w:ind w:left="3600" w:hanging="360"/>
+      </w:pPr>
+      <w:rPr>
+        <w:rFonts w:ascii="Wingdings" w:hAnsi="Wingdings" w:hint="default"/>
+        <w:sz w:val="20"/>
+      </w:rPr>
+    </w:lvl>
+    <w:lvl w:ilvl="5" w:tentative="1">
+      <w:start w:val="1"/>
+      <w:numFmt w:val="bullet"/>
+      <w:lvlText w:val=""/>
+      <w:lvlJc w:val="left"/>
+      <w:pPr>
+        <w:tabs>
+          <w:tab w:val="num" w:pos="4320"/>
+        </w:tabs>
+        <w:ind w:left="4320" w:hanging="360"/>
+      </w:pPr>
+      <w:rPr>
+        <w:rFonts w:ascii="Wingdings" w:hAnsi="Wingdings" w:hint="default"/>
+        <w:sz w:val="20"/>
+      </w:rPr>
+    </w:lvl>
+    <w:lvl w:ilvl="6" w:tentative="1">
+      <w:start w:val="1"/>
+      <w:numFmt w:val="bullet"/>
+      <w:lvlText w:val=""/>
+      <w:lvlJc w:val="left"/>
+      <w:pPr>
+        <w:tabs>
+          <w:tab w:val="num" w:pos="5040"/>
+        </w:tabs>
+        <w:ind w:left="5040" w:hanging="360"/>
+      </w:pPr>
+      <w:rPr>
+        <w:rFonts w:ascii="Wingdings" w:hAnsi="Wingdings" w:hint="default"/>
+        <w:sz w:val="20"/>
+      </w:rPr>
+    </w:lvl>
+    <w:lvl w:ilvl="7" w:tentative="1">
+      <w:start w:val="1"/>
+      <w:numFmt w:val="bullet"/>
+      <w:lvlText w:val=""/>
+      <w:lvlJc w:val="left"/>
+      <w:pPr>
+        <w:tabs>
+          <w:tab w:val="num" w:pos="5760"/>
+        </w:tabs>
+        <w:ind w:left="5760" w:hanging="360"/>
+      </w:pPr>
+      <w:rPr>
+        <w:rFonts w:ascii="Wingdings" w:hAnsi="Wingdings" w:hint="default"/>
+        <w:sz w:val="20"/>
+      </w:rPr>
+    </w:lvl>
+    <w:lvl w:ilvl="8" w:tentative="1">
+      <w:start w:val="1"/>
+      <w:numFmt w:val="bullet"/>
+      <w:lvlText w:val=""/>
+      <w:lvlJc w:val="left"/>
+      <w:pPr>
+        <w:tabs>
+          <w:tab w:val="num" w:pos="6480"/>
+        </w:tabs>
+        <w:ind w:left="6480" w:hanging="360"/>
+      </w:pPr>
+      <w:rPr>
+        <w:rFonts w:ascii="Wingdings" w:hAnsi="Wingdings" w:hint="default"/>
+        <w:sz w:val="20"/>
+      </w:rPr>
+    </w:lvl>
+  </w:abstractNum>
+  <w:abstractNum w:abstractNumId="3">
+    <w:nsid w:val="328D1737"/>
+    <w:multiLevelType w:val="multilevel"/>
+    <w:tmpl w:val="AB22AF54"/>
+    <w:lvl w:ilvl="0">
+      <w:start w:val="1"/>
+      <w:numFmt w:val="bullet"/>
+      <w:lvlText w:val=""/>
+      <w:lvlJc w:val="left"/>
+      <w:pPr>
+        <w:tabs>
+          <w:tab w:val="num" w:pos="720"/>
+        </w:tabs>
+        <w:ind w:left="720" w:hanging="360"/>
+      </w:pPr>
+      <w:rPr>
+        <w:rFonts w:ascii="Symbol" w:hAnsi="Symbol" w:hint="default"/>
+        <w:sz w:val="20"/>
+      </w:rPr>
+    </w:lvl>
+    <w:lvl w:ilvl="1" w:tentative="1">
+      <w:start w:val="1"/>
+      <w:numFmt w:val="bullet"/>
+      <w:lvlText w:val="o"/>
+      <w:lvlJc w:val="left"/>
+      <w:pPr>
+        <w:tabs>
+          <w:tab w:val="num" w:pos="1440"/>
+        </w:tabs>
+        <w:ind w:left="1440" w:hanging="360"/>
+      </w:pPr>
+      <w:rPr>
+        <w:rFonts w:ascii="Courier New" w:hAnsi="Courier New" w:hint="default"/>
+        <w:sz w:val="20"/>
+      </w:rPr>
+    </w:lvl>
+    <w:lvl w:ilvl="2" w:tentative="1">
+      <w:start w:val="1"/>
+      <w:numFmt w:val="bullet"/>
+      <w:lvlText w:val=""/>
+      <w:lvlJc w:val="left"/>
+      <w:pPr>
+        <w:tabs>
+          <w:tab w:val="num" w:pos="2160"/>
+        </w:tabs>
+        <w:ind w:left="2160" w:hanging="360"/>
+      </w:pPr>
+      <w:rPr>
+        <w:rFonts w:ascii="Wingdings" w:hAnsi="Wingdings" w:hint="default"/>
+        <w:sz w:val="20"/>
+      </w:rPr>
+    </w:lvl>
+    <w:lvl w:ilvl="3" w:tentative="1">
+      <w:start w:val="1"/>
+      <w:numFmt w:val="bullet"/>
+      <w:lvlText w:val=""/>
+      <w:lvlJc w:val="left"/>
+      <w:pPr>
+        <w:tabs>
+          <w:tab w:val="num" w:pos="2880"/>
+        </w:tabs>
+        <w:ind w:left="2880" w:hanging="360"/>
+      </w:pPr>
+      <w:rPr>
+        <w:rFonts w:ascii="Wingdings" w:hAnsi="Wingdings" w:hint="default"/>
+        <w:sz w:val="20"/>
+      </w:rPr>
+    </w:lvl>
+    <w:lvl w:ilvl="4" w:tentative="1">
+      <w:start w:val="1"/>
+      <w:numFmt w:val="bullet"/>
+      <w:lvlText w:val=""/>
+      <w:lvlJc w:val="left"/>
+      <w:pPr>
+        <w:tabs>
+          <w:tab w:val="num" w:pos="3600"/>
+        </w:tabs>
+        <w:ind w:left="3600" w:hanging="360"/>
+      </w:pPr>
+      <w:rPr>
+        <w:rFonts w:ascii="Wingdings" w:hAnsi="Wingdings" w:hint="default"/>
+        <w:sz w:val="20"/>
+      </w:rPr>
+    </w:lvl>
+    <w:lvl w:ilvl="5" w:tentative="1">
+      <w:start w:val="1"/>
+      <w:numFmt w:val="bullet"/>
+      <w:lvlText w:val=""/>
+      <w:lvlJc w:val="left"/>
+      <w:pPr>
+        <w:tabs>
+          <w:tab w:val="num" w:pos="4320"/>
+        </w:tabs>
+        <w:ind w:left="4320" w:hanging="360"/>
+      </w:pPr>
+      <w:rPr>
+        <w:rFonts w:ascii="Wingdings" w:hAnsi="Wingdings" w:hint="default"/>
+        <w:sz w:val="20"/>
+      </w:rPr>
+    </w:lvl>
+    <w:lvl w:ilvl="6" w:tentative="1">
+      <w:start w:val="1"/>
+      <w:numFmt w:val="bullet"/>
+      <w:lvlText w:val=""/>
+      <w:lvlJc w:val="left"/>
+      <w:pPr>
+        <w:tabs>
+          <w:tab w:val="num" w:pos="5040"/>
+        </w:tabs>
+        <w:ind w:left="5040" w:hanging="360"/>
+      </w:pPr>
+      <w:rPr>
+        <w:rFonts w:ascii="Wingdings" w:hAnsi="Wingdings" w:hint="default"/>
+        <w:sz w:val="20"/>
+      </w:rPr>
+    </w:lvl>
+    <w:lvl w:ilvl="7" w:tentative="1">
+      <w:start w:val="1"/>
+      <w:numFmt w:val="bullet"/>
+      <w:lvlText w:val=""/>
+      <w:lvlJc w:val="left"/>
+      <w:pPr>
+        <w:tabs>
+          <w:tab w:val="num" w:pos="5760"/>
+        </w:tabs>
+        <w:ind w:left="5760" w:hanging="360"/>
+      </w:pPr>
+      <w:rPr>
+        <w:rFonts w:ascii="Wingdings" w:hAnsi="Wingdings" w:hint="default"/>
+        <w:sz w:val="20"/>
+      </w:rPr>
+    </w:lvl>
+    <w:lvl w:ilvl="8" w:tentative="1">
+      <w:start w:val="1"/>
+      <w:numFmt w:val="bullet"/>
+      <w:lvlText w:val=""/>
+      <w:lvlJc w:val="left"/>
+      <w:pPr>
+        <w:tabs>
+          <w:tab w:val="num" w:pos="6480"/>
+        </w:tabs>
+        <w:ind w:left="6480" w:hanging="360"/>
+      </w:pPr>
+      <w:rPr>
+        <w:rFonts w:ascii="Wingdings" w:hAnsi="Wingdings" w:hint="default"/>
+        <w:sz w:val="20"/>
+      </w:rPr>
+    </w:lvl>
+  </w:abstractNum>
+  <w:abstractNum w:abstractNumId="4">
     <w:nsid w:val="42B43108"/>
     <w:multiLevelType w:val="multilevel"/>
     <w:tmpl w:val="8CD42176"/>
+    <w:lvl w:ilvl="0">
+      <w:start w:val="1"/>
+      <w:numFmt w:val="bullet"/>
+      <w:lvlText w:val=""/>
+      <w:lvlJc w:val="left"/>
+      <w:pPr>
+        <w:tabs>
+          <w:tab w:val="num" w:pos="720"/>
+        </w:tabs>
+        <w:ind w:left="720" w:hanging="360"/>
+      </w:pPr>
+      <w:rPr>
+        <w:rFonts w:ascii="Symbol" w:hAnsi="Symbol" w:hint="default"/>
+        <w:sz w:val="20"/>
+      </w:rPr>
+    </w:lvl>
+    <w:lvl w:ilvl="1" w:tentative="1">
+      <w:start w:val="1"/>
+      <w:numFmt w:val="bullet"/>
+      <w:lvlText w:val="o"/>
+      <w:lvlJc w:val="left"/>
+      <w:pPr>
+        <w:tabs>
+          <w:tab w:val="num" w:pos="1440"/>
+        </w:tabs>
+        <w:ind w:left="1440" w:hanging="360"/>
+      </w:pPr>
+      <w:rPr>
+        <w:rFonts w:ascii="Courier New" w:hAnsi="Courier New" w:hint="default"/>
+        <w:sz w:val="20"/>
+      </w:rPr>
+    </w:lvl>
+    <w:lvl w:ilvl="2" w:tentative="1">
+      <w:start w:val="1"/>
+      <w:numFmt w:val="bullet"/>
+      <w:lvlText w:val=""/>
+      <w:lvlJc w:val="left"/>
+      <w:pPr>
+        <w:tabs>
+          <w:tab w:val="num" w:pos="2160"/>
+        </w:tabs>
+        <w:ind w:left="2160" w:hanging="360"/>
+      </w:pPr>
+      <w:rPr>
+        <w:rFonts w:ascii="Wingdings" w:hAnsi="Wingdings" w:hint="default"/>
+        <w:sz w:val="20"/>
+      </w:rPr>
+    </w:lvl>
+    <w:lvl w:ilvl="3" w:tentative="1">
+      <w:start w:val="1"/>
+      <w:numFmt w:val="bullet"/>
+      <w:lvlText w:val=""/>
+      <w:lvlJc w:val="left"/>
+      <w:pPr>
+        <w:tabs>
+          <w:tab w:val="num" w:pos="2880"/>
+        </w:tabs>
+        <w:ind w:left="2880" w:hanging="360"/>
+      </w:pPr>
+      <w:rPr>
+        <w:rFonts w:ascii="Wingdings" w:hAnsi="Wingdings" w:hint="default"/>
+        <w:sz w:val="20"/>
+      </w:rPr>
+    </w:lvl>
+    <w:lvl w:ilvl="4" w:tentative="1">
+      <w:start w:val="1"/>
+      <w:numFmt w:val="bullet"/>
+      <w:lvlText w:val=""/>
+      <w:lvlJc w:val="left"/>
+      <w:pPr>
+        <w:tabs>
+          <w:tab w:val="num" w:pos="3600"/>
+        </w:tabs>
+        <w:ind w:left="3600" w:hanging="360"/>
+      </w:pPr>
+      <w:rPr>
+        <w:rFonts w:ascii="Wingdings" w:hAnsi="Wingdings" w:hint="default"/>
+        <w:sz w:val="20"/>
+      </w:rPr>
+    </w:lvl>
+    <w:lvl w:ilvl="5" w:tentative="1">
+      <w:start w:val="1"/>
+      <w:numFmt w:val="bullet"/>
+      <w:lvlText w:val=""/>
+      <w:lvlJc w:val="left"/>
+      <w:pPr>
+        <w:tabs>
+          <w:tab w:val="num" w:pos="4320"/>
+        </w:tabs>
+        <w:ind w:left="4320" w:hanging="360"/>
+      </w:pPr>
+      <w:rPr>
+        <w:rFonts w:ascii="Wingdings" w:hAnsi="Wingdings" w:hint="default"/>
+        <w:sz w:val="20"/>
+      </w:rPr>
+    </w:lvl>
+    <w:lvl w:ilvl="6" w:tentative="1">
+      <w:start w:val="1"/>
+      <w:numFmt w:val="bullet"/>
+      <w:lvlText w:val=""/>
+      <w:lvlJc w:val="left"/>
+      <w:pPr>
+        <w:tabs>
+          <w:tab w:val="num" w:pos="5040"/>
+        </w:tabs>
+        <w:ind w:left="5040" w:hanging="360"/>
+      </w:pPr>
+      <w:rPr>
+        <w:rFonts w:ascii="Wingdings" w:hAnsi="Wingdings" w:hint="default"/>
+        <w:sz w:val="20"/>
+      </w:rPr>
+    </w:lvl>
+    <w:lvl w:ilvl="7" w:tentative="1">
+      <w:start w:val="1"/>
+      <w:numFmt w:val="bullet"/>
+      <w:lvlText w:val=""/>
+      <w:lvlJc w:val="left"/>
+      <w:pPr>
+        <w:tabs>
+          <w:tab w:val="num" w:pos="5760"/>
+        </w:tabs>
+        <w:ind w:left="5760" w:hanging="360"/>
+      </w:pPr>
+      <w:rPr>
+        <w:rFonts w:ascii="Wingdings" w:hAnsi="Wingdings" w:hint="default"/>
+        <w:sz w:val="20"/>
+      </w:rPr>
+    </w:lvl>
+    <w:lvl w:ilvl="8" w:tentative="1">
+      <w:start w:val="1"/>
+      <w:numFmt w:val="bullet"/>
+      <w:lvlText w:val=""/>
+      <w:lvlJc w:val="left"/>
+      <w:pPr>
+        <w:tabs>
+          <w:tab w:val="num" w:pos="6480"/>
+        </w:tabs>
+        <w:ind w:left="6480" w:hanging="360"/>
+      </w:pPr>
+      <w:rPr>
+        <w:rFonts w:ascii="Wingdings" w:hAnsi="Wingdings" w:hint="default"/>
+        <w:sz w:val="20"/>
+      </w:rPr>
+    </w:lvl>
+  </w:abstractNum>
+  <w:abstractNum w:abstractNumId="5">
+    <w:nsid w:val="4FE12F1E"/>
+    <w:multiLevelType w:val="multilevel"/>
+    <w:tmpl w:val="7CF2D61A"/>
     <w:lvl w:ilvl="0">
       <w:start w:val="1"/>
       <w:numFmt w:val="bullet"/>
@@ -7389,7 +9251,19 @@
     </w:lvlOverride>
   </w:num>
   <w:num w:numId="2">
+    <w:abstractNumId w:val="4"/>
+  </w:num>
+  <w:num w:numId="3">
+    <w:abstractNumId w:val="3"/>
+  </w:num>
+  <w:num w:numId="4">
+    <w:abstractNumId w:val="5"/>
+  </w:num>
+  <w:num w:numId="5">
     <w:abstractNumId w:val="1"/>
+  </w:num>
+  <w:num w:numId="6">
+    <w:abstractNumId w:val="2"/>
   </w:num>
 </w:numbering>
 </file>
@@ -7559,6 +9433,44 @@
       <w:lang w:eastAsia="en-IN"/>
     </w:rPr>
   </w:style>
+  <w:style w:type="paragraph" w:styleId="Heading2">
+    <w:name w:val="heading 2"/>
+    <w:basedOn w:val="Normal"/>
+    <w:link w:val="Heading2Char"/>
+    <w:uiPriority w:val="9"/>
+    <w:qFormat/>
+    <w:rsid w:val="00E6260C"/>
+    <w:pPr>
+      <w:spacing w:before="100" w:beforeAutospacing="1" w:after="100" w:afterAutospacing="1" w:line="240" w:lineRule="auto"/>
+      <w:outlineLvl w:val="1"/>
+    </w:pPr>
+    <w:rPr>
+      <w:rFonts w:ascii="Times New Roman" w:eastAsia="Times New Roman" w:hAnsi="Times New Roman"/>
+      <w:b/>
+      <w:bCs/>
+      <w:sz w:val="36"/>
+      <w:szCs w:val="36"/>
+    </w:rPr>
+  </w:style>
+  <w:style w:type="paragraph" w:styleId="Heading3">
+    <w:name w:val="heading 3"/>
+    <w:basedOn w:val="Normal"/>
+    <w:link w:val="Heading3Char"/>
+    <w:uiPriority w:val="9"/>
+    <w:qFormat/>
+    <w:rsid w:val="00E6260C"/>
+    <w:pPr>
+      <w:spacing w:before="100" w:beforeAutospacing="1" w:after="100" w:afterAutospacing="1" w:line="240" w:lineRule="auto"/>
+      <w:outlineLvl w:val="2"/>
+    </w:pPr>
+    <w:rPr>
+      <w:rFonts w:ascii="Times New Roman" w:eastAsia="Times New Roman" w:hAnsi="Times New Roman"/>
+      <w:b/>
+      <w:bCs/>
+      <w:sz w:val="27"/>
+      <w:szCs w:val="27"/>
+    </w:rPr>
+  </w:style>
   <w:style w:type="character" w:default="1" w:styleId="DefaultParagraphFont">
     <w:name w:val="Default Paragraph Font"/>
     <w:uiPriority w:val="1"/>
@@ -7599,6 +9511,58 @@
       <w:rFonts w:ascii="Times New Roman" w:hAnsi="Times New Roman"/>
       <w:sz w:val="24"/>
       <w:szCs w:val="24"/>
+    </w:rPr>
+  </w:style>
+  <w:style w:type="character" w:customStyle="1" w:styleId="Heading2Char">
+    <w:name w:val="Heading 2 Char"/>
+    <w:basedOn w:val="DefaultParagraphFont"/>
+    <w:link w:val="Heading2"/>
+    <w:uiPriority w:val="9"/>
+    <w:rsid w:val="00E6260C"/>
+    <w:rPr>
+      <w:rFonts w:ascii="Times New Roman" w:eastAsia="Times New Roman" w:hAnsi="Times New Roman" w:cs="Times New Roman"/>
+      <w:b/>
+      <w:bCs/>
+      <w:sz w:val="36"/>
+      <w:szCs w:val="36"/>
+      <w:lang w:eastAsia="en-IN"/>
+    </w:rPr>
+  </w:style>
+  <w:style w:type="character" w:customStyle="1" w:styleId="Heading3Char">
+    <w:name w:val="Heading 3 Char"/>
+    <w:basedOn w:val="DefaultParagraphFont"/>
+    <w:link w:val="Heading3"/>
+    <w:uiPriority w:val="9"/>
+    <w:rsid w:val="00E6260C"/>
+    <w:rPr>
+      <w:rFonts w:ascii="Times New Roman" w:eastAsia="Times New Roman" w:hAnsi="Times New Roman" w:cs="Times New Roman"/>
+      <w:b/>
+      <w:bCs/>
+      <w:sz w:val="27"/>
+      <w:szCs w:val="27"/>
+      <w:lang w:eastAsia="en-IN"/>
+    </w:rPr>
+  </w:style>
+  <w:style w:type="character" w:styleId="Strong">
+    <w:name w:val="Strong"/>
+    <w:basedOn w:val="DefaultParagraphFont"/>
+    <w:uiPriority w:val="22"/>
+    <w:qFormat/>
+    <w:rsid w:val="00E6260C"/>
+    <w:rPr>
+      <w:b/>
+      <w:bCs/>
+    </w:rPr>
+  </w:style>
+  <w:style w:type="character" w:styleId="Emphasis">
+    <w:name w:val="Emphasis"/>
+    <w:basedOn w:val="DefaultParagraphFont"/>
+    <w:uiPriority w:val="20"/>
+    <w:qFormat/>
+    <w:rsid w:val="00E6260C"/>
+    <w:rPr>
+      <w:i/>
+      <w:iCs/>
     </w:rPr>
   </w:style>
 </w:styles>
@@ -7769,6 +9733,44 @@
       <w:lang w:eastAsia="en-IN"/>
     </w:rPr>
   </w:style>
+  <w:style w:type="paragraph" w:styleId="Heading2">
+    <w:name w:val="heading 2"/>
+    <w:basedOn w:val="Normal"/>
+    <w:link w:val="Heading2Char"/>
+    <w:uiPriority w:val="9"/>
+    <w:qFormat/>
+    <w:rsid w:val="00E6260C"/>
+    <w:pPr>
+      <w:spacing w:before="100" w:beforeAutospacing="1" w:after="100" w:afterAutospacing="1" w:line="240" w:lineRule="auto"/>
+      <w:outlineLvl w:val="1"/>
+    </w:pPr>
+    <w:rPr>
+      <w:rFonts w:ascii="Times New Roman" w:eastAsia="Times New Roman" w:hAnsi="Times New Roman"/>
+      <w:b/>
+      <w:bCs/>
+      <w:sz w:val="36"/>
+      <w:szCs w:val="36"/>
+    </w:rPr>
+  </w:style>
+  <w:style w:type="paragraph" w:styleId="Heading3">
+    <w:name w:val="heading 3"/>
+    <w:basedOn w:val="Normal"/>
+    <w:link w:val="Heading3Char"/>
+    <w:uiPriority w:val="9"/>
+    <w:qFormat/>
+    <w:rsid w:val="00E6260C"/>
+    <w:pPr>
+      <w:spacing w:before="100" w:beforeAutospacing="1" w:after="100" w:afterAutospacing="1" w:line="240" w:lineRule="auto"/>
+      <w:outlineLvl w:val="2"/>
+    </w:pPr>
+    <w:rPr>
+      <w:rFonts w:ascii="Times New Roman" w:eastAsia="Times New Roman" w:hAnsi="Times New Roman"/>
+      <w:b/>
+      <w:bCs/>
+      <w:sz w:val="27"/>
+      <w:szCs w:val="27"/>
+    </w:rPr>
+  </w:style>
   <w:style w:type="character" w:default="1" w:styleId="DefaultParagraphFont">
     <w:name w:val="Default Paragraph Font"/>
     <w:uiPriority w:val="1"/>
@@ -7809,6 +9811,58 @@
       <w:rFonts w:ascii="Times New Roman" w:hAnsi="Times New Roman"/>
       <w:sz w:val="24"/>
       <w:szCs w:val="24"/>
+    </w:rPr>
+  </w:style>
+  <w:style w:type="character" w:customStyle="1" w:styleId="Heading2Char">
+    <w:name w:val="Heading 2 Char"/>
+    <w:basedOn w:val="DefaultParagraphFont"/>
+    <w:link w:val="Heading2"/>
+    <w:uiPriority w:val="9"/>
+    <w:rsid w:val="00E6260C"/>
+    <w:rPr>
+      <w:rFonts w:ascii="Times New Roman" w:eastAsia="Times New Roman" w:hAnsi="Times New Roman" w:cs="Times New Roman"/>
+      <w:b/>
+      <w:bCs/>
+      <w:sz w:val="36"/>
+      <w:szCs w:val="36"/>
+      <w:lang w:eastAsia="en-IN"/>
+    </w:rPr>
+  </w:style>
+  <w:style w:type="character" w:customStyle="1" w:styleId="Heading3Char">
+    <w:name w:val="Heading 3 Char"/>
+    <w:basedOn w:val="DefaultParagraphFont"/>
+    <w:link w:val="Heading3"/>
+    <w:uiPriority w:val="9"/>
+    <w:rsid w:val="00E6260C"/>
+    <w:rPr>
+      <w:rFonts w:ascii="Times New Roman" w:eastAsia="Times New Roman" w:hAnsi="Times New Roman" w:cs="Times New Roman"/>
+      <w:b/>
+      <w:bCs/>
+      <w:sz w:val="27"/>
+      <w:szCs w:val="27"/>
+      <w:lang w:eastAsia="en-IN"/>
+    </w:rPr>
+  </w:style>
+  <w:style w:type="character" w:styleId="Strong">
+    <w:name w:val="Strong"/>
+    <w:basedOn w:val="DefaultParagraphFont"/>
+    <w:uiPriority w:val="22"/>
+    <w:qFormat/>
+    <w:rsid w:val="00E6260C"/>
+    <w:rPr>
+      <w:b/>
+      <w:bCs/>
+    </w:rPr>
+  </w:style>
+  <w:style w:type="character" w:styleId="Emphasis">
+    <w:name w:val="Emphasis"/>
+    <w:basedOn w:val="DefaultParagraphFont"/>
+    <w:uiPriority w:val="20"/>
+    <w:qFormat/>
+    <w:rsid w:val="00E6260C"/>
+    <w:rPr>
+      <w:i/>
+      <w:iCs/>
     </w:rPr>
   </w:style>
 </w:styles>

</xml_diff>

<commit_message>
update the dox for the exhibiton on voting machine and natioal flag project
</commit_message>
<xml_diff>
--- a/QTPI/Scripts for exhibiton.docx
+++ b/QTPI/Scripts for exhibiton.docx
@@ -8024,8 +8024,6 @@
           <w:szCs w:val="24"/>
         </w:rPr>
       </w:pPr>
-      <w:bookmarkStart w:id="0" w:name="_GoBack"/>
-      <w:bookmarkEnd w:id="0"/>
     </w:p>
     <w:p>
       <w:pPr>
@@ -8253,25 +8251,7 @@
           <w:sz w:val="24"/>
           <w:szCs w:val="24"/>
         </w:rPr>
-        <w:t xml:space="preserve"> glow in different </w:t>
-      </w:r>
-      <w:proofErr w:type="spellStart"/>
-      <w:r>
-        <w:rPr>
-          <w:rFonts w:ascii="Times New Roman" w:eastAsia="Times New Roman" w:hAnsi="Times New Roman"/>
-          <w:sz w:val="24"/>
-          <w:szCs w:val="24"/>
-        </w:rPr>
-        <w:t>colors</w:t>
-      </w:r>
-      <w:proofErr w:type="spellEnd"/>
-      <w:r>
-        <w:rPr>
-          <w:rFonts w:ascii="Times New Roman" w:eastAsia="Times New Roman" w:hAnsi="Times New Roman"/>
-          <w:sz w:val="24"/>
-          <w:szCs w:val="24"/>
-        </w:rPr>
-        <w:t>, giving the robot a realistic and expressive look.</w:t>
+        <w:t xml:space="preserve"> glow in different colors, giving the robot a realistic and expressive look.</w:t>
       </w:r>
     </w:p>
     <w:p>
@@ -8594,6 +8574,2317 @@
           <w:szCs w:val="24"/>
         </w:rPr>
         <w:t>.</w:t>
+      </w:r>
+    </w:p>
+    <w:p/>
+    <w:p/>
+    <w:p/>
+    <w:p/>
+    <w:p/>
+    <w:p/>
+    <w:p/>
+    <w:p/>
+    <w:p/>
+    <w:p/>
+    <w:p>
+      <w:pPr>
+        <w:spacing w:before="100" w:beforeAutospacing="1" w:after="100" w:afterAutospacing="1" w:line="240" w:lineRule="auto"/>
+        <w:outlineLvl w:val="1"/>
+        <w:rPr>
+          <w:rFonts w:ascii="Times New Roman" w:eastAsia="Times New Roman" w:hAnsi="Times New Roman"/>
+          <w:b/>
+          <w:bCs/>
+          <w:sz w:val="36"/>
+          <w:szCs w:val="36"/>
+        </w:rPr>
+      </w:pPr>
+      <w:r>
+        <w:rPr>
+          <w:rFonts w:ascii="Times New Roman" w:eastAsia="Times New Roman" w:hAnsi="Times New Roman"/>
+          <w:b/>
+          <w:bCs/>
+          <w:sz w:val="36"/>
+          <w:szCs w:val="36"/>
+        </w:rPr>
+        <w:lastRenderedPageBreak/>
+        <w:t>PROJECT – Vending Machine (Christmas Greeting App)</w:t>
+      </w:r>
+    </w:p>
+    <w:p>
+      <w:pPr>
+        <w:spacing w:after="0" w:line="240" w:lineRule="auto"/>
+        <w:rPr>
+          <w:rFonts w:ascii="Times New Roman" w:eastAsia="Times New Roman" w:hAnsi="Times New Roman"/>
+          <w:sz w:val="24"/>
+          <w:szCs w:val="24"/>
+        </w:rPr>
+      </w:pPr>
+      <w:r>
+        <w:rPr>
+          <w:rFonts w:ascii="Times New Roman" w:eastAsia="Times New Roman" w:hAnsi="Times New Roman"/>
+          <w:sz w:val="24"/>
+          <w:szCs w:val="24"/>
+        </w:rPr>
+        <w:pict>
+          <v:rect id="_x0000_i1033" style="width:0;height:1.5pt" o:hralign="center" o:hrstd="t" o:hr="t" fillcolor="#a0a0a0" stroked="f"/>
+        </w:pict>
+      </w:r>
+    </w:p>
+    <w:p>
+      <w:pPr>
+        <w:spacing w:before="100" w:beforeAutospacing="1" w:after="100" w:afterAutospacing="1" w:line="240" w:lineRule="auto"/>
+        <w:outlineLvl w:val="2"/>
+        <w:rPr>
+          <w:rFonts w:ascii="Times New Roman" w:eastAsia="Times New Roman" w:hAnsi="Times New Roman"/>
+          <w:b/>
+          <w:bCs/>
+          <w:sz w:val="27"/>
+          <w:szCs w:val="27"/>
+        </w:rPr>
+      </w:pPr>
+      <w:r>
+        <w:rPr>
+          <w:rFonts w:ascii="Times New Roman" w:eastAsia="Times New Roman" w:hAnsi="Times New Roman"/>
+          <w:b/>
+          <w:bCs/>
+          <w:sz w:val="27"/>
+          <w:szCs w:val="27"/>
+        </w:rPr>
+        <w:t>Student 1 (Introduction)</w:t>
+      </w:r>
+    </w:p>
+    <w:p>
+      <w:pPr>
+        <w:spacing w:before="100" w:beforeAutospacing="1" w:after="100" w:afterAutospacing="1" w:line="240" w:lineRule="auto"/>
+        <w:rPr>
+          <w:rFonts w:ascii="Times New Roman" w:eastAsia="Times New Roman" w:hAnsi="Times New Roman"/>
+          <w:sz w:val="24"/>
+          <w:szCs w:val="24"/>
+        </w:rPr>
+      </w:pPr>
+      <w:r>
+        <w:rPr>
+          <w:rFonts w:ascii="Times New Roman" w:eastAsia="Times New Roman" w:hAnsi="Times New Roman"/>
+          <w:sz w:val="24"/>
+          <w:szCs w:val="24"/>
+        </w:rPr>
+        <w:t>Good morning / Good afternoon everyone.</w:t>
+      </w:r>
+      <w:r>
+        <w:rPr>
+          <w:rFonts w:ascii="Times New Roman" w:eastAsia="Times New Roman" w:hAnsi="Times New Roman"/>
+          <w:sz w:val="24"/>
+          <w:szCs w:val="24"/>
+        </w:rPr>
+        <w:br/>
+        <w:t xml:space="preserve">My name is </w:t>
+      </w:r>
+      <w:r>
+        <w:rPr>
+          <w:rFonts w:ascii="Times New Roman" w:eastAsia="Times New Roman" w:hAnsi="Times New Roman"/>
+          <w:b/>
+          <w:bCs/>
+          <w:sz w:val="24"/>
+          <w:szCs w:val="24"/>
+        </w:rPr>
+        <w:t>(student’s name)</w:t>
+      </w:r>
+      <w:r>
+        <w:rPr>
+          <w:rFonts w:ascii="Times New Roman" w:eastAsia="Times New Roman" w:hAnsi="Times New Roman"/>
+          <w:sz w:val="24"/>
+          <w:szCs w:val="24"/>
+        </w:rPr>
+        <w:t xml:space="preserve"> and I am studying in </w:t>
+      </w:r>
+      <w:r>
+        <w:rPr>
+          <w:rFonts w:ascii="Times New Roman" w:eastAsia="Times New Roman" w:hAnsi="Times New Roman"/>
+          <w:b/>
+          <w:bCs/>
+          <w:sz w:val="24"/>
+          <w:szCs w:val="24"/>
+        </w:rPr>
+        <w:t>Grade (student’s grade)</w:t>
+      </w:r>
+      <w:r>
+        <w:rPr>
+          <w:rFonts w:ascii="Times New Roman" w:eastAsia="Times New Roman" w:hAnsi="Times New Roman"/>
+          <w:sz w:val="24"/>
+          <w:szCs w:val="24"/>
+        </w:rPr>
+        <w:t>.</w:t>
+      </w:r>
+    </w:p>
+    <w:p>
+      <w:pPr>
+        <w:spacing w:before="100" w:beforeAutospacing="1" w:after="100" w:afterAutospacing="1" w:line="240" w:lineRule="auto"/>
+        <w:rPr>
+          <w:rFonts w:ascii="Times New Roman" w:eastAsia="Times New Roman" w:hAnsi="Times New Roman"/>
+          <w:sz w:val="24"/>
+          <w:szCs w:val="24"/>
+        </w:rPr>
+      </w:pPr>
+      <w:r>
+        <w:rPr>
+          <w:rFonts w:ascii="Times New Roman" w:eastAsia="Times New Roman" w:hAnsi="Times New Roman"/>
+          <w:sz w:val="24"/>
+          <w:szCs w:val="24"/>
+        </w:rPr>
+        <w:t xml:space="preserve">Our project is called </w:t>
+      </w:r>
+      <w:r>
+        <w:rPr>
+          <w:rFonts w:ascii="Times New Roman" w:eastAsia="Times New Roman" w:hAnsi="Times New Roman"/>
+          <w:b/>
+          <w:bCs/>
+          <w:sz w:val="24"/>
+          <w:szCs w:val="24"/>
+        </w:rPr>
+        <w:t>Smart Vending Machine – Christmas Edition</w:t>
+      </w:r>
+      <w:r>
+        <w:rPr>
+          <w:rFonts w:ascii="Times New Roman" w:eastAsia="Times New Roman" w:hAnsi="Times New Roman"/>
+          <w:sz w:val="24"/>
+          <w:szCs w:val="24"/>
+        </w:rPr>
+        <w:t>.</w:t>
+      </w:r>
+      <w:r>
+        <w:rPr>
+          <w:rFonts w:ascii="Times New Roman" w:eastAsia="Times New Roman" w:hAnsi="Times New Roman"/>
+          <w:sz w:val="24"/>
+          <w:szCs w:val="24"/>
+        </w:rPr>
+        <w:br/>
+        <w:t xml:space="preserve">The aim of this project is to understand how </w:t>
+      </w:r>
+      <w:r>
+        <w:rPr>
+          <w:rFonts w:ascii="Times New Roman" w:eastAsia="Times New Roman" w:hAnsi="Times New Roman"/>
+          <w:b/>
+          <w:bCs/>
+          <w:sz w:val="24"/>
+          <w:szCs w:val="24"/>
+        </w:rPr>
+        <w:t>automatic vending machines work in real life</w:t>
+      </w:r>
+      <w:r>
+        <w:rPr>
+          <w:rFonts w:ascii="Times New Roman" w:eastAsia="Times New Roman" w:hAnsi="Times New Roman"/>
+          <w:sz w:val="24"/>
+          <w:szCs w:val="24"/>
+        </w:rPr>
+        <w:t xml:space="preserve">. In this project, chocolates are automatically dispensed when we say </w:t>
+      </w:r>
+      <w:r>
+        <w:rPr>
+          <w:rFonts w:ascii="Times New Roman" w:eastAsia="Times New Roman" w:hAnsi="Times New Roman"/>
+          <w:b/>
+          <w:bCs/>
+          <w:sz w:val="24"/>
+          <w:szCs w:val="24"/>
+        </w:rPr>
+        <w:t>“Merry Christmas”</w:t>
+      </w:r>
+      <w:r>
+        <w:rPr>
+          <w:rFonts w:ascii="Times New Roman" w:eastAsia="Times New Roman" w:hAnsi="Times New Roman"/>
+          <w:sz w:val="24"/>
+          <w:szCs w:val="24"/>
+        </w:rPr>
+        <w:t xml:space="preserve"> through a mobile application.</w:t>
+      </w:r>
+    </w:p>
+    <w:p>
+      <w:pPr>
+        <w:spacing w:before="100" w:beforeAutospacing="1" w:after="100" w:afterAutospacing="1" w:line="240" w:lineRule="auto"/>
+        <w:rPr>
+          <w:rFonts w:ascii="Times New Roman" w:eastAsia="Times New Roman" w:hAnsi="Times New Roman"/>
+          <w:sz w:val="24"/>
+          <w:szCs w:val="24"/>
+        </w:rPr>
+      </w:pPr>
+      <w:r>
+        <w:rPr>
+          <w:rFonts w:ascii="Times New Roman" w:eastAsia="Times New Roman" w:hAnsi="Times New Roman"/>
+          <w:sz w:val="24"/>
+          <w:szCs w:val="24"/>
+        </w:rPr>
+        <w:t>The structure of the vending machine is built using basic blocks and connectors. The electronic components and working will be explained by my friends.</w:t>
+      </w:r>
+    </w:p>
+    <w:p>
+      <w:pPr>
+        <w:spacing w:after="0" w:line="240" w:lineRule="auto"/>
+        <w:rPr>
+          <w:rFonts w:ascii="Times New Roman" w:eastAsia="Times New Roman" w:hAnsi="Times New Roman"/>
+          <w:sz w:val="24"/>
+          <w:szCs w:val="24"/>
+        </w:rPr>
+      </w:pPr>
+      <w:r>
+        <w:rPr>
+          <w:rFonts w:ascii="Times New Roman" w:eastAsia="Times New Roman" w:hAnsi="Times New Roman"/>
+          <w:sz w:val="24"/>
+          <w:szCs w:val="24"/>
+        </w:rPr>
+        <w:pict>
+          <v:rect id="_x0000_i1034" style="width:0;height:1.5pt" o:hralign="center" o:hrstd="t" o:hr="t" fillcolor="#a0a0a0" stroked="f"/>
+        </w:pict>
+      </w:r>
+    </w:p>
+    <w:p>
+      <w:pPr>
+        <w:spacing w:before="100" w:beforeAutospacing="1" w:after="100" w:afterAutospacing="1" w:line="240" w:lineRule="auto"/>
+        <w:outlineLvl w:val="2"/>
+        <w:rPr>
+          <w:rFonts w:ascii="Times New Roman" w:eastAsia="Times New Roman" w:hAnsi="Times New Roman"/>
+          <w:b/>
+          <w:bCs/>
+          <w:sz w:val="27"/>
+          <w:szCs w:val="27"/>
+        </w:rPr>
+      </w:pPr>
+      <w:r>
+        <w:rPr>
+          <w:rFonts w:ascii="Times New Roman" w:eastAsia="Times New Roman" w:hAnsi="Times New Roman"/>
+          <w:b/>
+          <w:bCs/>
+          <w:sz w:val="27"/>
+          <w:szCs w:val="27"/>
+        </w:rPr>
+        <w:t>Student 2 (Components Used)</w:t>
+      </w:r>
+    </w:p>
+    <w:p>
+      <w:pPr>
+        <w:spacing w:before="100" w:beforeAutospacing="1" w:after="100" w:afterAutospacing="1" w:line="240" w:lineRule="auto"/>
+        <w:rPr>
+          <w:rFonts w:ascii="Times New Roman" w:eastAsia="Times New Roman" w:hAnsi="Times New Roman"/>
+          <w:sz w:val="24"/>
+          <w:szCs w:val="24"/>
+        </w:rPr>
+      </w:pPr>
+      <w:r>
+        <w:rPr>
+          <w:rFonts w:ascii="Times New Roman" w:eastAsia="Times New Roman" w:hAnsi="Times New Roman"/>
+          <w:sz w:val="24"/>
+          <w:szCs w:val="24"/>
+        </w:rPr>
+        <w:t>Good morning / Good afternoon.</w:t>
+      </w:r>
+      <w:r>
+        <w:rPr>
+          <w:rFonts w:ascii="Times New Roman" w:eastAsia="Times New Roman" w:hAnsi="Times New Roman"/>
+          <w:sz w:val="24"/>
+          <w:szCs w:val="24"/>
+        </w:rPr>
+        <w:br/>
+        <w:t xml:space="preserve">My name is </w:t>
+      </w:r>
+      <w:r>
+        <w:rPr>
+          <w:rFonts w:ascii="Times New Roman" w:eastAsia="Times New Roman" w:hAnsi="Times New Roman"/>
+          <w:b/>
+          <w:bCs/>
+          <w:sz w:val="24"/>
+          <w:szCs w:val="24"/>
+        </w:rPr>
+        <w:t>(student’s name)</w:t>
+      </w:r>
+      <w:r>
+        <w:rPr>
+          <w:rFonts w:ascii="Times New Roman" w:eastAsia="Times New Roman" w:hAnsi="Times New Roman"/>
+          <w:sz w:val="24"/>
+          <w:szCs w:val="24"/>
+        </w:rPr>
+        <w:t>.</w:t>
+      </w:r>
+    </w:p>
+    <w:p>
+      <w:pPr>
+        <w:spacing w:before="100" w:beforeAutospacing="1" w:after="100" w:afterAutospacing="1" w:line="240" w:lineRule="auto"/>
+        <w:rPr>
+          <w:rFonts w:ascii="Times New Roman" w:eastAsia="Times New Roman" w:hAnsi="Times New Roman"/>
+          <w:sz w:val="24"/>
+          <w:szCs w:val="24"/>
+        </w:rPr>
+      </w:pPr>
+      <w:r>
+        <w:rPr>
+          <w:rFonts w:ascii="Times New Roman" w:eastAsia="Times New Roman" w:hAnsi="Times New Roman"/>
+          <w:sz w:val="24"/>
+          <w:szCs w:val="24"/>
+        </w:rPr>
+        <w:t xml:space="preserve">I will explain the </w:t>
+      </w:r>
+      <w:r>
+        <w:rPr>
+          <w:rFonts w:ascii="Times New Roman" w:eastAsia="Times New Roman" w:hAnsi="Times New Roman"/>
+          <w:b/>
+          <w:bCs/>
+          <w:sz w:val="24"/>
+          <w:szCs w:val="24"/>
+        </w:rPr>
+        <w:t>electronic components</w:t>
+      </w:r>
+      <w:r>
+        <w:rPr>
+          <w:rFonts w:ascii="Times New Roman" w:eastAsia="Times New Roman" w:hAnsi="Times New Roman"/>
+          <w:sz w:val="24"/>
+          <w:szCs w:val="24"/>
+        </w:rPr>
+        <w:t xml:space="preserve"> used in this project. They are:</w:t>
+      </w:r>
+    </w:p>
+    <w:p>
+      <w:pPr>
+        <w:numPr>
+          <w:ilvl w:val="0"/>
+          <w:numId w:val="14"/>
+        </w:numPr>
+        <w:spacing w:before="100" w:beforeAutospacing="1" w:after="100" w:afterAutospacing="1" w:line="240" w:lineRule="auto"/>
+        <w:rPr>
+          <w:rFonts w:ascii="Times New Roman" w:eastAsia="Times New Roman" w:hAnsi="Times New Roman"/>
+          <w:sz w:val="24"/>
+          <w:szCs w:val="24"/>
+        </w:rPr>
+      </w:pPr>
+      <w:r>
+        <w:rPr>
+          <w:rFonts w:ascii="Times New Roman" w:eastAsia="Times New Roman" w:hAnsi="Times New Roman"/>
+          <w:b/>
+          <w:bCs/>
+          <w:sz w:val="24"/>
+          <w:szCs w:val="24"/>
+        </w:rPr>
+        <w:t>Qbrick (Motherboard)</w:t>
+      </w:r>
+    </w:p>
+    <w:p>
+      <w:pPr>
+        <w:numPr>
+          <w:ilvl w:val="0"/>
+          <w:numId w:val="14"/>
+        </w:numPr>
+        <w:spacing w:before="100" w:beforeAutospacing="1" w:after="100" w:afterAutospacing="1" w:line="240" w:lineRule="auto"/>
+        <w:rPr>
+          <w:rFonts w:ascii="Times New Roman" w:eastAsia="Times New Roman" w:hAnsi="Times New Roman"/>
+          <w:sz w:val="24"/>
+          <w:szCs w:val="24"/>
+        </w:rPr>
+      </w:pPr>
+      <w:r>
+        <w:rPr>
+          <w:rFonts w:ascii="Times New Roman" w:eastAsia="Times New Roman" w:hAnsi="Times New Roman"/>
+          <w:b/>
+          <w:bCs/>
+          <w:sz w:val="24"/>
+          <w:szCs w:val="24"/>
+        </w:rPr>
+        <w:t>RJ Cables</w:t>
+      </w:r>
+    </w:p>
+    <w:p>
+      <w:pPr>
+        <w:numPr>
+          <w:ilvl w:val="0"/>
+          <w:numId w:val="14"/>
+        </w:numPr>
+        <w:spacing w:before="100" w:beforeAutospacing="1" w:after="100" w:afterAutospacing="1" w:line="240" w:lineRule="auto"/>
+        <w:rPr>
+          <w:rFonts w:ascii="Times New Roman" w:eastAsia="Times New Roman" w:hAnsi="Times New Roman"/>
+          <w:sz w:val="24"/>
+          <w:szCs w:val="24"/>
+        </w:rPr>
+      </w:pPr>
+      <w:r>
+        <w:rPr>
+          <w:rFonts w:ascii="Times New Roman" w:eastAsia="Times New Roman" w:hAnsi="Times New Roman"/>
+          <w:b/>
+          <w:bCs/>
+          <w:sz w:val="24"/>
+          <w:szCs w:val="24"/>
+        </w:rPr>
+        <w:t>Servo Motor</w:t>
+      </w:r>
+    </w:p>
+    <w:p>
+      <w:pPr>
+        <w:spacing w:before="100" w:beforeAutospacing="1" w:after="100" w:afterAutospacing="1" w:line="240" w:lineRule="auto"/>
+        <w:rPr>
+          <w:rFonts w:ascii="Times New Roman" w:eastAsia="Times New Roman" w:hAnsi="Times New Roman"/>
+          <w:sz w:val="24"/>
+          <w:szCs w:val="24"/>
+        </w:rPr>
+      </w:pPr>
+      <w:r>
+        <w:rPr>
+          <w:rFonts w:ascii="Times New Roman" w:eastAsia="Times New Roman" w:hAnsi="Times New Roman"/>
+          <w:sz w:val="24"/>
+          <w:szCs w:val="24"/>
+        </w:rPr>
+        <w:t xml:space="preserve">The Qbrick acts as the control unit, RJ cables are used for connections, and the servo motor helps in </w:t>
+      </w:r>
+      <w:r>
+        <w:rPr>
+          <w:rFonts w:ascii="Times New Roman" w:eastAsia="Times New Roman" w:hAnsi="Times New Roman"/>
+          <w:b/>
+          <w:bCs/>
+          <w:sz w:val="24"/>
+          <w:szCs w:val="24"/>
+        </w:rPr>
+        <w:t>dispensing or dropping the chocolates</w:t>
+      </w:r>
+      <w:r>
+        <w:rPr>
+          <w:rFonts w:ascii="Times New Roman" w:eastAsia="Times New Roman" w:hAnsi="Times New Roman"/>
+          <w:sz w:val="24"/>
+          <w:szCs w:val="24"/>
+        </w:rPr>
+        <w:t>.</w:t>
+      </w:r>
+    </w:p>
+    <w:p>
+      <w:pPr>
+        <w:spacing w:before="100" w:beforeAutospacing="1" w:after="100" w:afterAutospacing="1" w:line="240" w:lineRule="auto"/>
+        <w:rPr>
+          <w:rFonts w:ascii="Times New Roman" w:eastAsia="Times New Roman" w:hAnsi="Times New Roman"/>
+          <w:sz w:val="24"/>
+          <w:szCs w:val="24"/>
+        </w:rPr>
+      </w:pPr>
+      <w:r>
+        <w:rPr>
+          <w:rFonts w:ascii="Times New Roman" w:eastAsia="Times New Roman" w:hAnsi="Times New Roman"/>
+          <w:sz w:val="24"/>
+          <w:szCs w:val="24"/>
+        </w:rPr>
+        <w:t>Now, my friend will explain the working of the project.</w:t>
+      </w:r>
+    </w:p>
+    <w:p>
+      <w:pPr>
+        <w:spacing w:after="0" w:line="240" w:lineRule="auto"/>
+        <w:rPr>
+          <w:rFonts w:ascii="Times New Roman" w:eastAsia="Times New Roman" w:hAnsi="Times New Roman"/>
+          <w:sz w:val="24"/>
+          <w:szCs w:val="24"/>
+        </w:rPr>
+      </w:pPr>
+      <w:r>
+        <w:rPr>
+          <w:rFonts w:ascii="Times New Roman" w:eastAsia="Times New Roman" w:hAnsi="Times New Roman"/>
+          <w:sz w:val="24"/>
+          <w:szCs w:val="24"/>
+        </w:rPr>
+        <w:pict>
+          <v:rect id="_x0000_i1035" style="width:0;height:1.5pt" o:hralign="center" o:hrstd="t" o:hr="t" fillcolor="#a0a0a0" stroked="f"/>
+        </w:pict>
+      </w:r>
+    </w:p>
+    <w:p>
+      <w:pPr>
+        <w:spacing w:before="100" w:beforeAutospacing="1" w:after="100" w:afterAutospacing="1" w:line="240" w:lineRule="auto"/>
+        <w:outlineLvl w:val="2"/>
+        <w:rPr>
+          <w:rFonts w:ascii="Times New Roman" w:eastAsia="Times New Roman" w:hAnsi="Times New Roman"/>
+          <w:b/>
+          <w:bCs/>
+          <w:sz w:val="27"/>
+          <w:szCs w:val="27"/>
+        </w:rPr>
+      </w:pPr>
+      <w:r>
+        <w:rPr>
+          <w:rFonts w:ascii="Times New Roman" w:eastAsia="Times New Roman" w:hAnsi="Times New Roman"/>
+          <w:b/>
+          <w:bCs/>
+          <w:sz w:val="27"/>
+          <w:szCs w:val="27"/>
+        </w:rPr>
+        <w:t>Student 3 (Working of the Project)</w:t>
+      </w:r>
+    </w:p>
+    <w:p>
+      <w:pPr>
+        <w:spacing w:before="100" w:beforeAutospacing="1" w:after="100" w:afterAutospacing="1" w:line="240" w:lineRule="auto"/>
+        <w:rPr>
+          <w:rFonts w:ascii="Times New Roman" w:eastAsia="Times New Roman" w:hAnsi="Times New Roman"/>
+          <w:sz w:val="24"/>
+          <w:szCs w:val="24"/>
+        </w:rPr>
+      </w:pPr>
+      <w:r>
+        <w:rPr>
+          <w:rFonts w:ascii="Times New Roman" w:eastAsia="Times New Roman" w:hAnsi="Times New Roman"/>
+          <w:sz w:val="24"/>
+          <w:szCs w:val="24"/>
+        </w:rPr>
+        <w:t>Good morning / Good afternoon.</w:t>
+      </w:r>
+      <w:r>
+        <w:rPr>
+          <w:rFonts w:ascii="Times New Roman" w:eastAsia="Times New Roman" w:hAnsi="Times New Roman"/>
+          <w:sz w:val="24"/>
+          <w:szCs w:val="24"/>
+        </w:rPr>
+        <w:br/>
+        <w:t xml:space="preserve">My name is </w:t>
+      </w:r>
+      <w:r>
+        <w:rPr>
+          <w:rFonts w:ascii="Times New Roman" w:eastAsia="Times New Roman" w:hAnsi="Times New Roman"/>
+          <w:b/>
+          <w:bCs/>
+          <w:sz w:val="24"/>
+          <w:szCs w:val="24"/>
+        </w:rPr>
+        <w:t>(student’s name)</w:t>
+      </w:r>
+      <w:r>
+        <w:rPr>
+          <w:rFonts w:ascii="Times New Roman" w:eastAsia="Times New Roman" w:hAnsi="Times New Roman"/>
+          <w:sz w:val="24"/>
+          <w:szCs w:val="24"/>
+        </w:rPr>
+        <w:t>.</w:t>
+      </w:r>
+    </w:p>
+    <w:p>
+      <w:pPr>
+        <w:spacing w:before="100" w:beforeAutospacing="1" w:after="100" w:afterAutospacing="1" w:line="240" w:lineRule="auto"/>
+        <w:rPr>
+          <w:rFonts w:ascii="Times New Roman" w:eastAsia="Times New Roman" w:hAnsi="Times New Roman"/>
+          <w:sz w:val="24"/>
+          <w:szCs w:val="24"/>
+        </w:rPr>
+      </w:pPr>
+      <w:r>
+        <w:rPr>
+          <w:rFonts w:ascii="Times New Roman" w:eastAsia="Times New Roman" w:hAnsi="Times New Roman"/>
+          <w:sz w:val="24"/>
+          <w:szCs w:val="24"/>
+        </w:rPr>
+        <w:t xml:space="preserve">This is the </w:t>
+      </w:r>
+      <w:r>
+        <w:rPr>
+          <w:rFonts w:ascii="Times New Roman" w:eastAsia="Times New Roman" w:hAnsi="Times New Roman"/>
+          <w:b/>
+          <w:bCs/>
+          <w:sz w:val="24"/>
+          <w:szCs w:val="24"/>
+        </w:rPr>
+        <w:t>Qbrick</w:t>
+      </w:r>
+      <w:r>
+        <w:rPr>
+          <w:rFonts w:ascii="Times New Roman" w:eastAsia="Times New Roman" w:hAnsi="Times New Roman"/>
+          <w:sz w:val="24"/>
+          <w:szCs w:val="24"/>
+        </w:rPr>
+        <w:t xml:space="preserve">, which works as the </w:t>
+      </w:r>
+      <w:r>
+        <w:rPr>
+          <w:rFonts w:ascii="Times New Roman" w:eastAsia="Times New Roman" w:hAnsi="Times New Roman"/>
+          <w:b/>
+          <w:bCs/>
+          <w:sz w:val="24"/>
+          <w:szCs w:val="24"/>
+        </w:rPr>
+        <w:t>brain of the vending machine</w:t>
+      </w:r>
+      <w:r>
+        <w:rPr>
+          <w:rFonts w:ascii="Times New Roman" w:eastAsia="Times New Roman" w:hAnsi="Times New Roman"/>
+          <w:sz w:val="24"/>
+          <w:szCs w:val="24"/>
+        </w:rPr>
+        <w:t>. It supplies power to all the components and processes the commands received from the mobile app.</w:t>
+      </w:r>
+    </w:p>
+    <w:p>
+      <w:pPr>
+        <w:spacing w:before="100" w:beforeAutospacing="1" w:after="100" w:afterAutospacing="1" w:line="240" w:lineRule="auto"/>
+        <w:rPr>
+          <w:rFonts w:ascii="Times New Roman" w:eastAsia="Times New Roman" w:hAnsi="Times New Roman"/>
+          <w:sz w:val="24"/>
+          <w:szCs w:val="24"/>
+        </w:rPr>
+      </w:pPr>
+      <w:r>
+        <w:rPr>
+          <w:rFonts w:ascii="Times New Roman" w:eastAsia="Times New Roman" w:hAnsi="Times New Roman"/>
+          <w:sz w:val="24"/>
+          <w:szCs w:val="24"/>
+        </w:rPr>
+        <w:t xml:space="preserve">When we say </w:t>
+      </w:r>
+      <w:r>
+        <w:rPr>
+          <w:rFonts w:ascii="Times New Roman" w:eastAsia="Times New Roman" w:hAnsi="Times New Roman"/>
+          <w:b/>
+          <w:bCs/>
+          <w:sz w:val="24"/>
+          <w:szCs w:val="24"/>
+        </w:rPr>
+        <w:t>“Merry Christmas”</w:t>
+      </w:r>
+      <w:r>
+        <w:rPr>
+          <w:rFonts w:ascii="Times New Roman" w:eastAsia="Times New Roman" w:hAnsi="Times New Roman"/>
+          <w:sz w:val="24"/>
+          <w:szCs w:val="24"/>
+        </w:rPr>
+        <w:t xml:space="preserve"> in the app, the voice command is sent to the Qbrick using </w:t>
+      </w:r>
+      <w:r>
+        <w:rPr>
+          <w:rFonts w:ascii="Times New Roman" w:eastAsia="Times New Roman" w:hAnsi="Times New Roman"/>
+          <w:b/>
+          <w:bCs/>
+          <w:sz w:val="24"/>
+          <w:szCs w:val="24"/>
+        </w:rPr>
+        <w:t>Bluetooth</w:t>
+      </w:r>
+      <w:r>
+        <w:rPr>
+          <w:rFonts w:ascii="Times New Roman" w:eastAsia="Times New Roman" w:hAnsi="Times New Roman"/>
+          <w:sz w:val="24"/>
+          <w:szCs w:val="24"/>
+        </w:rPr>
+        <w:t>. The Qbrick processes this command according to the program written inside it.</w:t>
+      </w:r>
+    </w:p>
+    <w:p>
+      <w:pPr>
+        <w:spacing w:before="100" w:beforeAutospacing="1" w:after="100" w:afterAutospacing="1" w:line="240" w:lineRule="auto"/>
+        <w:rPr>
+          <w:rFonts w:ascii="Times New Roman" w:eastAsia="Times New Roman" w:hAnsi="Times New Roman"/>
+          <w:sz w:val="24"/>
+          <w:szCs w:val="24"/>
+        </w:rPr>
+      </w:pPr>
+      <w:r>
+        <w:rPr>
+          <w:rFonts w:ascii="Times New Roman" w:eastAsia="Times New Roman" w:hAnsi="Times New Roman"/>
+          <w:sz w:val="24"/>
+          <w:szCs w:val="24"/>
+        </w:rPr>
+        <w:t xml:space="preserve">After recognizing the command, the Qbrick sends a signal to the </w:t>
+      </w:r>
+      <w:r>
+        <w:rPr>
+          <w:rFonts w:ascii="Times New Roman" w:eastAsia="Times New Roman" w:hAnsi="Times New Roman"/>
+          <w:b/>
+          <w:bCs/>
+          <w:sz w:val="24"/>
+          <w:szCs w:val="24"/>
+        </w:rPr>
+        <w:t>servo motor</w:t>
+      </w:r>
+      <w:r>
+        <w:rPr>
+          <w:rFonts w:ascii="Times New Roman" w:eastAsia="Times New Roman" w:hAnsi="Times New Roman"/>
+          <w:sz w:val="24"/>
+          <w:szCs w:val="24"/>
+        </w:rPr>
+        <w:t>.</w:t>
+      </w:r>
+    </w:p>
+    <w:p>
+      <w:pPr>
+        <w:spacing w:after="0" w:line="240" w:lineRule="auto"/>
+        <w:rPr>
+          <w:rFonts w:ascii="Times New Roman" w:eastAsia="Times New Roman" w:hAnsi="Times New Roman"/>
+          <w:sz w:val="24"/>
+          <w:szCs w:val="24"/>
+        </w:rPr>
+      </w:pPr>
+      <w:r>
+        <w:rPr>
+          <w:rFonts w:ascii="Times New Roman" w:eastAsia="Times New Roman" w:hAnsi="Times New Roman"/>
+          <w:sz w:val="24"/>
+          <w:szCs w:val="24"/>
+        </w:rPr>
+        <w:lastRenderedPageBreak/>
+        <w:pict>
+          <v:rect id="_x0000_i1036" style="width:0;height:1.5pt" o:hralign="center" o:hrstd="t" o:hr="t" fillcolor="#a0a0a0" stroked="f"/>
+        </w:pict>
+      </w:r>
+    </w:p>
+    <w:p>
+      <w:pPr>
+        <w:spacing w:before="100" w:beforeAutospacing="1" w:after="100" w:afterAutospacing="1" w:line="240" w:lineRule="auto"/>
+        <w:outlineLvl w:val="2"/>
+        <w:rPr>
+          <w:rFonts w:ascii="Times New Roman" w:eastAsia="Times New Roman" w:hAnsi="Times New Roman"/>
+          <w:b/>
+          <w:bCs/>
+          <w:sz w:val="27"/>
+          <w:szCs w:val="27"/>
+        </w:rPr>
+      </w:pPr>
+      <w:r>
+        <w:rPr>
+          <w:rFonts w:ascii="Times New Roman" w:eastAsia="Times New Roman" w:hAnsi="Times New Roman"/>
+          <w:b/>
+          <w:bCs/>
+          <w:sz w:val="27"/>
+          <w:szCs w:val="27"/>
+        </w:rPr>
+        <w:t>Student 4 (Demonstration &amp; Output)</w:t>
+      </w:r>
+    </w:p>
+    <w:p>
+      <w:pPr>
+        <w:spacing w:before="100" w:beforeAutospacing="1" w:after="100" w:afterAutospacing="1" w:line="240" w:lineRule="auto"/>
+        <w:rPr>
+          <w:rFonts w:ascii="Times New Roman" w:eastAsia="Times New Roman" w:hAnsi="Times New Roman"/>
+          <w:sz w:val="24"/>
+          <w:szCs w:val="24"/>
+        </w:rPr>
+      </w:pPr>
+      <w:r>
+        <w:rPr>
+          <w:rFonts w:ascii="Times New Roman" w:eastAsia="Times New Roman" w:hAnsi="Times New Roman"/>
+          <w:sz w:val="24"/>
+          <w:szCs w:val="24"/>
+        </w:rPr>
+        <w:t>Good morning / Good afternoon.</w:t>
+      </w:r>
+      <w:r>
+        <w:rPr>
+          <w:rFonts w:ascii="Times New Roman" w:eastAsia="Times New Roman" w:hAnsi="Times New Roman"/>
+          <w:sz w:val="24"/>
+          <w:szCs w:val="24"/>
+        </w:rPr>
+        <w:br/>
+        <w:t xml:space="preserve">My name is </w:t>
+      </w:r>
+      <w:r>
+        <w:rPr>
+          <w:rFonts w:ascii="Times New Roman" w:eastAsia="Times New Roman" w:hAnsi="Times New Roman"/>
+          <w:b/>
+          <w:bCs/>
+          <w:sz w:val="24"/>
+          <w:szCs w:val="24"/>
+        </w:rPr>
+        <w:t>(student’s name)</w:t>
+      </w:r>
+      <w:r>
+        <w:rPr>
+          <w:rFonts w:ascii="Times New Roman" w:eastAsia="Times New Roman" w:hAnsi="Times New Roman"/>
+          <w:sz w:val="24"/>
+          <w:szCs w:val="24"/>
+        </w:rPr>
+        <w:t>.</w:t>
+      </w:r>
+    </w:p>
+    <w:p>
+      <w:pPr>
+        <w:spacing w:before="100" w:beforeAutospacing="1" w:after="100" w:afterAutospacing="1" w:line="240" w:lineRule="auto"/>
+        <w:rPr>
+          <w:rFonts w:ascii="Times New Roman" w:eastAsia="Times New Roman" w:hAnsi="Times New Roman"/>
+          <w:sz w:val="24"/>
+          <w:szCs w:val="24"/>
+        </w:rPr>
+      </w:pPr>
+      <w:r>
+        <w:rPr>
+          <w:rFonts w:ascii="Times New Roman" w:eastAsia="Times New Roman" w:hAnsi="Times New Roman"/>
+          <w:sz w:val="24"/>
+          <w:szCs w:val="24"/>
+        </w:rPr>
+        <w:t xml:space="preserve">When the servo motor receives the signal from the Qbrick, it </w:t>
+      </w:r>
+      <w:r>
+        <w:rPr>
+          <w:rFonts w:ascii="Times New Roman" w:eastAsia="Times New Roman" w:hAnsi="Times New Roman"/>
+          <w:b/>
+          <w:bCs/>
+          <w:sz w:val="24"/>
+          <w:szCs w:val="24"/>
+        </w:rPr>
+        <w:t>rotates to open the vending slot</w:t>
+      </w:r>
+      <w:r>
+        <w:rPr>
+          <w:rFonts w:ascii="Times New Roman" w:eastAsia="Times New Roman" w:hAnsi="Times New Roman"/>
+          <w:sz w:val="24"/>
+          <w:szCs w:val="24"/>
+        </w:rPr>
+        <w:t>, allowing the chocolate to drop.</w:t>
+      </w:r>
+    </w:p>
+    <w:p>
+      <w:pPr>
+        <w:spacing w:before="100" w:beforeAutospacing="1" w:after="100" w:afterAutospacing="1" w:line="240" w:lineRule="auto"/>
+        <w:rPr>
+          <w:rFonts w:ascii="Times New Roman" w:eastAsia="Times New Roman" w:hAnsi="Times New Roman"/>
+          <w:sz w:val="24"/>
+          <w:szCs w:val="24"/>
+        </w:rPr>
+      </w:pPr>
+      <w:r>
+        <w:rPr>
+          <w:rFonts w:ascii="Times New Roman" w:eastAsia="Times New Roman" w:hAnsi="Times New Roman"/>
+          <w:sz w:val="24"/>
+          <w:szCs w:val="24"/>
+        </w:rPr>
+        <w:t xml:space="preserve">At the same time, the app displays a </w:t>
+      </w:r>
+      <w:r>
+        <w:rPr>
+          <w:rFonts w:ascii="Times New Roman" w:eastAsia="Times New Roman" w:hAnsi="Times New Roman"/>
+          <w:b/>
+          <w:bCs/>
+          <w:sz w:val="24"/>
+          <w:szCs w:val="24"/>
+        </w:rPr>
+        <w:t>“Happy Christmas”</w:t>
+      </w:r>
+      <w:r>
+        <w:rPr>
+          <w:rFonts w:ascii="Times New Roman" w:eastAsia="Times New Roman" w:hAnsi="Times New Roman"/>
+          <w:sz w:val="24"/>
+          <w:szCs w:val="24"/>
+        </w:rPr>
+        <w:t xml:space="preserve"> or </w:t>
+      </w:r>
+      <w:r>
+        <w:rPr>
+          <w:rFonts w:ascii="Times New Roman" w:eastAsia="Times New Roman" w:hAnsi="Times New Roman"/>
+          <w:b/>
+          <w:bCs/>
+          <w:sz w:val="24"/>
+          <w:szCs w:val="24"/>
+        </w:rPr>
+        <w:t>“Merry Christmas”</w:t>
+      </w:r>
+      <w:r>
+        <w:rPr>
+          <w:rFonts w:ascii="Times New Roman" w:eastAsia="Times New Roman" w:hAnsi="Times New Roman"/>
+          <w:sz w:val="24"/>
+          <w:szCs w:val="24"/>
+        </w:rPr>
+        <w:t xml:space="preserve"> message, making the project interactive and festive.</w:t>
+      </w:r>
+    </w:p>
+    <w:p>
+      <w:pPr>
+        <w:spacing w:before="100" w:beforeAutospacing="1" w:after="100" w:afterAutospacing="1" w:line="240" w:lineRule="auto"/>
+        <w:rPr>
+          <w:rFonts w:ascii="Times New Roman" w:eastAsia="Times New Roman" w:hAnsi="Times New Roman"/>
+          <w:sz w:val="24"/>
+          <w:szCs w:val="24"/>
+        </w:rPr>
+      </w:pPr>
+      <w:r>
+        <w:rPr>
+          <w:rFonts w:ascii="Times New Roman" w:eastAsia="Times New Roman" w:hAnsi="Times New Roman"/>
+          <w:b/>
+          <w:bCs/>
+          <w:sz w:val="24"/>
+          <w:szCs w:val="24"/>
+        </w:rPr>
+        <w:t>(Live Demonstration – Say “Merry Christmas” → Chocolate Dispensed)</w:t>
+      </w:r>
+    </w:p>
+    <w:p>
+      <w:pPr>
+        <w:spacing w:before="100" w:beforeAutospacing="1" w:after="100" w:afterAutospacing="1" w:line="240" w:lineRule="auto"/>
+        <w:rPr>
+          <w:rFonts w:ascii="Times New Roman" w:eastAsia="Times New Roman" w:hAnsi="Times New Roman"/>
+          <w:sz w:val="24"/>
+          <w:szCs w:val="24"/>
+        </w:rPr>
+      </w:pPr>
+      <w:r>
+        <w:rPr>
+          <w:rFonts w:ascii="Times New Roman" w:eastAsia="Times New Roman" w:hAnsi="Times New Roman"/>
+          <w:sz w:val="24"/>
+          <w:szCs w:val="24"/>
+        </w:rPr>
+        <w:t>Thank you.</w:t>
+      </w:r>
+    </w:p>
+    <w:p>
+      <w:pPr>
+        <w:spacing w:after="0" w:line="240" w:lineRule="auto"/>
+        <w:rPr>
+          <w:rFonts w:ascii="Times New Roman" w:eastAsia="Times New Roman" w:hAnsi="Times New Roman"/>
+          <w:sz w:val="24"/>
+          <w:szCs w:val="24"/>
+        </w:rPr>
+      </w:pPr>
+      <w:r>
+        <w:rPr>
+          <w:rFonts w:ascii="Times New Roman" w:eastAsia="Times New Roman" w:hAnsi="Times New Roman"/>
+          <w:sz w:val="24"/>
+          <w:szCs w:val="24"/>
+        </w:rPr>
+        <w:pict>
+          <v:rect id="_x0000_i1037" style="width:0;height:1.5pt" o:hralign="center" o:hrstd="t" o:hr="t" fillcolor="#a0a0a0" stroked="f"/>
+        </w:pict>
+      </w:r>
+    </w:p>
+    <w:p>
+      <w:pPr>
+        <w:spacing w:before="100" w:beforeAutospacing="1" w:after="100" w:afterAutospacing="1" w:line="240" w:lineRule="auto"/>
+        <w:outlineLvl w:val="2"/>
+        <w:rPr>
+          <w:rFonts w:ascii="Times New Roman" w:eastAsia="Times New Roman" w:hAnsi="Times New Roman"/>
+          <w:b/>
+          <w:bCs/>
+          <w:sz w:val="27"/>
+          <w:szCs w:val="27"/>
+        </w:rPr>
+      </w:pPr>
+      <w:r>
+        <w:rPr>
+          <w:rFonts w:ascii="Times New Roman" w:eastAsia="Times New Roman" w:hAnsi="Times New Roman"/>
+          <w:b/>
+          <w:bCs/>
+          <w:sz w:val="27"/>
+          <w:szCs w:val="27"/>
+        </w:rPr>
+        <w:t>Conclusion</w:t>
+      </w:r>
+    </w:p>
+    <w:p>
+      <w:pPr>
+        <w:spacing w:before="100" w:beforeAutospacing="1" w:after="100" w:afterAutospacing="1" w:line="240" w:lineRule="auto"/>
+        <w:rPr>
+          <w:rFonts w:ascii="Times New Roman" w:eastAsia="Times New Roman" w:hAnsi="Times New Roman"/>
+          <w:sz w:val="24"/>
+          <w:szCs w:val="24"/>
+        </w:rPr>
+      </w:pPr>
+      <w:r>
+        <w:rPr>
+          <w:rFonts w:ascii="Times New Roman" w:eastAsia="Times New Roman" w:hAnsi="Times New Roman"/>
+          <w:sz w:val="24"/>
+          <w:szCs w:val="24"/>
+        </w:rPr>
+        <w:t xml:space="preserve">This project helps us understand the working of </w:t>
+      </w:r>
+      <w:r>
+        <w:rPr>
+          <w:rFonts w:ascii="Times New Roman" w:eastAsia="Times New Roman" w:hAnsi="Times New Roman"/>
+          <w:b/>
+          <w:bCs/>
+          <w:sz w:val="24"/>
+          <w:szCs w:val="24"/>
+        </w:rPr>
+        <w:t>vending machines, automation, voice control, and motor-based mechanisms</w:t>
+      </w:r>
+      <w:r>
+        <w:rPr>
+          <w:rFonts w:ascii="Times New Roman" w:eastAsia="Times New Roman" w:hAnsi="Times New Roman"/>
+          <w:sz w:val="24"/>
+          <w:szCs w:val="24"/>
+        </w:rPr>
+        <w:t>. It also shows how mobile apps can interact with hardware using Bluetooth technology.</w:t>
+      </w:r>
+    </w:p>
+    <w:p>
+      <w:pPr>
+        <w:spacing w:after="0" w:line="240" w:lineRule="auto"/>
+        <w:rPr>
+          <w:rFonts w:ascii="Times New Roman" w:eastAsia="Times New Roman" w:hAnsi="Times New Roman"/>
+          <w:sz w:val="24"/>
+          <w:szCs w:val="24"/>
+        </w:rPr>
+      </w:pPr>
+      <w:r>
+        <w:rPr>
+          <w:rFonts w:ascii="Times New Roman" w:eastAsia="Times New Roman" w:hAnsi="Times New Roman"/>
+          <w:sz w:val="24"/>
+          <w:szCs w:val="24"/>
+        </w:rPr>
+        <w:pict>
+          <v:rect id="_x0000_i1038" style="width:0;height:1.5pt" o:hralign="center" o:hrstd="t" o:hr="t" fillcolor="#a0a0a0" stroked="f"/>
+        </w:pict>
+      </w:r>
+    </w:p>
+    <w:p/>
+    <w:p/>
+    <w:p/>
+    <w:p/>
+    <w:p/>
+    <w:p/>
+    <w:p/>
+    <w:p/>
+    <w:p/>
+    <w:p/>
+    <w:p/>
+    <w:p/>
+    <w:p/>
+    <w:p>
+      <w:pPr>
+        <w:spacing w:before="100" w:beforeAutospacing="1" w:after="100" w:afterAutospacing="1" w:line="240" w:lineRule="auto"/>
+        <w:outlineLvl w:val="1"/>
+        <w:rPr>
+          <w:rFonts w:ascii="Times New Roman" w:eastAsia="Times New Roman" w:hAnsi="Times New Roman"/>
+          <w:b/>
+          <w:bCs/>
+          <w:sz w:val="36"/>
+          <w:szCs w:val="36"/>
+        </w:rPr>
+      </w:pPr>
+      <w:r>
+        <w:rPr>
+          <w:rFonts w:ascii="Times New Roman" w:eastAsia="Times New Roman" w:hAnsi="Times New Roman"/>
+          <w:b/>
+          <w:bCs/>
+          <w:sz w:val="36"/>
+          <w:szCs w:val="36"/>
+        </w:rPr>
+        <w:lastRenderedPageBreak/>
+        <w:t>PROJECT – Remote Controlled Flag Hoisting</w:t>
+      </w:r>
+      <w:bookmarkStart w:id="0" w:name="_GoBack"/>
+      <w:bookmarkEnd w:id="0"/>
+      <w:r>
+        <w:rPr>
+          <w:rFonts w:ascii="Times New Roman" w:eastAsia="Times New Roman" w:hAnsi="Times New Roman"/>
+          <w:sz w:val="24"/>
+          <w:szCs w:val="24"/>
+        </w:rPr>
+        <w:pict>
+          <v:rect id="_x0000_i1039" style="width:0;height:1.5pt" o:hralign="center" o:hrstd="t" o:hr="t" fillcolor="#a0a0a0" stroked="f"/>
+        </w:pict>
+      </w:r>
+    </w:p>
+    <w:p>
+      <w:pPr>
+        <w:spacing w:before="100" w:beforeAutospacing="1" w:after="100" w:afterAutospacing="1" w:line="240" w:lineRule="auto"/>
+        <w:outlineLvl w:val="2"/>
+        <w:rPr>
+          <w:rFonts w:ascii="Times New Roman" w:eastAsia="Times New Roman" w:hAnsi="Times New Roman"/>
+          <w:b/>
+          <w:bCs/>
+          <w:sz w:val="27"/>
+          <w:szCs w:val="27"/>
+        </w:rPr>
+      </w:pPr>
+      <w:r>
+        <w:rPr>
+          <w:rFonts w:ascii="Times New Roman" w:eastAsia="Times New Roman" w:hAnsi="Times New Roman"/>
+          <w:b/>
+          <w:bCs/>
+          <w:sz w:val="27"/>
+          <w:szCs w:val="27"/>
+        </w:rPr>
+        <w:t>Student 1 (Introduction)</w:t>
+      </w:r>
+    </w:p>
+    <w:p>
+      <w:pPr>
+        <w:spacing w:before="100" w:beforeAutospacing="1" w:after="100" w:afterAutospacing="1" w:line="240" w:lineRule="auto"/>
+        <w:rPr>
+          <w:rFonts w:ascii="Times New Roman" w:eastAsia="Times New Roman" w:hAnsi="Times New Roman"/>
+          <w:sz w:val="24"/>
+          <w:szCs w:val="24"/>
+        </w:rPr>
+      </w:pPr>
+      <w:r>
+        <w:rPr>
+          <w:rFonts w:ascii="Times New Roman" w:eastAsia="Times New Roman" w:hAnsi="Times New Roman"/>
+          <w:sz w:val="24"/>
+          <w:szCs w:val="24"/>
+        </w:rPr>
+        <w:t>Good morning / Good afternoon everyone.</w:t>
+      </w:r>
+      <w:r>
+        <w:rPr>
+          <w:rFonts w:ascii="Times New Roman" w:eastAsia="Times New Roman" w:hAnsi="Times New Roman"/>
+          <w:sz w:val="24"/>
+          <w:szCs w:val="24"/>
+        </w:rPr>
+        <w:br/>
+        <w:t xml:space="preserve">My name is </w:t>
+      </w:r>
+      <w:r>
+        <w:rPr>
+          <w:rFonts w:ascii="Times New Roman" w:eastAsia="Times New Roman" w:hAnsi="Times New Roman"/>
+          <w:b/>
+          <w:bCs/>
+          <w:sz w:val="24"/>
+          <w:szCs w:val="24"/>
+        </w:rPr>
+        <w:t>(student’s name)</w:t>
+      </w:r>
+      <w:r>
+        <w:rPr>
+          <w:rFonts w:ascii="Times New Roman" w:eastAsia="Times New Roman" w:hAnsi="Times New Roman"/>
+          <w:sz w:val="24"/>
+          <w:szCs w:val="24"/>
+        </w:rPr>
+        <w:t xml:space="preserve"> and I am studying in </w:t>
+      </w:r>
+      <w:r>
+        <w:rPr>
+          <w:rFonts w:ascii="Times New Roman" w:eastAsia="Times New Roman" w:hAnsi="Times New Roman"/>
+          <w:b/>
+          <w:bCs/>
+          <w:sz w:val="24"/>
+          <w:szCs w:val="24"/>
+        </w:rPr>
+        <w:t>Grade (student’s grade)</w:t>
+      </w:r>
+      <w:r>
+        <w:rPr>
+          <w:rFonts w:ascii="Times New Roman" w:eastAsia="Times New Roman" w:hAnsi="Times New Roman"/>
+          <w:sz w:val="24"/>
+          <w:szCs w:val="24"/>
+        </w:rPr>
+        <w:t>.</w:t>
+      </w:r>
+    </w:p>
+    <w:p>
+      <w:pPr>
+        <w:spacing w:before="100" w:beforeAutospacing="1" w:after="100" w:afterAutospacing="1" w:line="240" w:lineRule="auto"/>
+        <w:rPr>
+          <w:rFonts w:ascii="Times New Roman" w:eastAsia="Times New Roman" w:hAnsi="Times New Roman"/>
+          <w:sz w:val="24"/>
+          <w:szCs w:val="24"/>
+        </w:rPr>
+      </w:pPr>
+      <w:r>
+        <w:rPr>
+          <w:rFonts w:ascii="Times New Roman" w:eastAsia="Times New Roman" w:hAnsi="Times New Roman"/>
+          <w:sz w:val="24"/>
+          <w:szCs w:val="24"/>
+        </w:rPr>
+        <w:t xml:space="preserve">Our project is called </w:t>
+      </w:r>
+      <w:r>
+        <w:rPr>
+          <w:rFonts w:ascii="Times New Roman" w:eastAsia="Times New Roman" w:hAnsi="Times New Roman"/>
+          <w:b/>
+          <w:bCs/>
+          <w:sz w:val="24"/>
+          <w:szCs w:val="24"/>
+        </w:rPr>
+        <w:t>Remote Controlled Flag Hoisting System</w:t>
+      </w:r>
+      <w:r>
+        <w:rPr>
+          <w:rFonts w:ascii="Times New Roman" w:eastAsia="Times New Roman" w:hAnsi="Times New Roman"/>
+          <w:sz w:val="24"/>
+          <w:szCs w:val="24"/>
+        </w:rPr>
+        <w:t>.</w:t>
+      </w:r>
+      <w:r>
+        <w:rPr>
+          <w:rFonts w:ascii="Times New Roman" w:eastAsia="Times New Roman" w:hAnsi="Times New Roman"/>
+          <w:sz w:val="24"/>
+          <w:szCs w:val="24"/>
+        </w:rPr>
+        <w:br/>
+        <w:t xml:space="preserve">The aim of this project is to understand how </w:t>
+      </w:r>
+      <w:r>
+        <w:rPr>
+          <w:rFonts w:ascii="Times New Roman" w:eastAsia="Times New Roman" w:hAnsi="Times New Roman"/>
+          <w:b/>
+          <w:bCs/>
+          <w:sz w:val="24"/>
+          <w:szCs w:val="24"/>
+        </w:rPr>
+        <w:t>remote-controlled systems and motor-based mechanisms</w:t>
+      </w:r>
+      <w:r>
+        <w:rPr>
+          <w:rFonts w:ascii="Times New Roman" w:eastAsia="Times New Roman" w:hAnsi="Times New Roman"/>
+          <w:sz w:val="24"/>
+          <w:szCs w:val="24"/>
+        </w:rPr>
+        <w:t xml:space="preserve"> work in real life. In this project, the flag is raised and lowered using a </w:t>
+      </w:r>
+      <w:r>
+        <w:rPr>
+          <w:rFonts w:ascii="Times New Roman" w:eastAsia="Times New Roman" w:hAnsi="Times New Roman"/>
+          <w:b/>
+          <w:bCs/>
+          <w:sz w:val="24"/>
+          <w:szCs w:val="24"/>
+        </w:rPr>
+        <w:t>remote control</w:t>
+      </w:r>
+      <w:r>
+        <w:rPr>
+          <w:rFonts w:ascii="Times New Roman" w:eastAsia="Times New Roman" w:hAnsi="Times New Roman"/>
+          <w:sz w:val="24"/>
+          <w:szCs w:val="24"/>
+        </w:rPr>
+        <w:t>.</w:t>
+      </w:r>
+    </w:p>
+    <w:p>
+      <w:pPr>
+        <w:spacing w:before="100" w:beforeAutospacing="1" w:after="100" w:afterAutospacing="1" w:line="240" w:lineRule="auto"/>
+        <w:rPr>
+          <w:rFonts w:ascii="Times New Roman" w:eastAsia="Times New Roman" w:hAnsi="Times New Roman"/>
+          <w:sz w:val="24"/>
+          <w:szCs w:val="24"/>
+        </w:rPr>
+      </w:pPr>
+      <w:r>
+        <w:rPr>
+          <w:rFonts w:ascii="Times New Roman" w:eastAsia="Times New Roman" w:hAnsi="Times New Roman"/>
+          <w:sz w:val="24"/>
+          <w:szCs w:val="24"/>
+        </w:rPr>
+        <w:t xml:space="preserve">This is a </w:t>
+      </w:r>
+      <w:proofErr w:type="spellStart"/>
+      <w:r>
+        <w:rPr>
+          <w:rFonts w:ascii="Times New Roman" w:eastAsia="Times New Roman" w:hAnsi="Times New Roman"/>
+          <w:b/>
+          <w:bCs/>
+          <w:sz w:val="24"/>
+          <w:szCs w:val="24"/>
+        </w:rPr>
+        <w:t>QTip</w:t>
+      </w:r>
+      <w:proofErr w:type="spellEnd"/>
+      <w:r>
+        <w:rPr>
+          <w:rFonts w:ascii="Times New Roman" w:eastAsia="Times New Roman" w:hAnsi="Times New Roman"/>
+          <w:b/>
+          <w:bCs/>
+          <w:sz w:val="24"/>
+          <w:szCs w:val="24"/>
+        </w:rPr>
+        <w:t xml:space="preserve"> project</w:t>
+      </w:r>
+      <w:r>
+        <w:rPr>
+          <w:rFonts w:ascii="Times New Roman" w:eastAsia="Times New Roman" w:hAnsi="Times New Roman"/>
+          <w:sz w:val="24"/>
+          <w:szCs w:val="24"/>
+        </w:rPr>
+        <w:t>, and it focuses on simple automation and control using motors.</w:t>
+      </w:r>
+    </w:p>
+    <w:p>
+      <w:pPr>
+        <w:spacing w:before="100" w:beforeAutospacing="1" w:after="100" w:afterAutospacing="1" w:line="240" w:lineRule="auto"/>
+        <w:rPr>
+          <w:rFonts w:ascii="Times New Roman" w:eastAsia="Times New Roman" w:hAnsi="Times New Roman"/>
+          <w:sz w:val="24"/>
+          <w:szCs w:val="24"/>
+        </w:rPr>
+      </w:pPr>
+      <w:r>
+        <w:rPr>
+          <w:rFonts w:ascii="Times New Roman" w:eastAsia="Times New Roman" w:hAnsi="Times New Roman"/>
+          <w:sz w:val="24"/>
+          <w:szCs w:val="24"/>
+        </w:rPr>
+        <w:t>The electronic components and working of the project will be explained by my friends.</w:t>
+      </w:r>
+    </w:p>
+    <w:p>
+      <w:pPr>
+        <w:spacing w:after="0" w:line="240" w:lineRule="auto"/>
+        <w:rPr>
+          <w:rFonts w:ascii="Times New Roman" w:eastAsia="Times New Roman" w:hAnsi="Times New Roman"/>
+          <w:sz w:val="24"/>
+          <w:szCs w:val="24"/>
+        </w:rPr>
+      </w:pPr>
+      <w:r>
+        <w:rPr>
+          <w:rFonts w:ascii="Times New Roman" w:eastAsia="Times New Roman" w:hAnsi="Times New Roman"/>
+          <w:sz w:val="24"/>
+          <w:szCs w:val="24"/>
+        </w:rPr>
+        <w:pict>
+          <v:rect id="_x0000_i1040" style="width:0;height:1.5pt" o:hralign="center" o:hrstd="t" o:hr="t" fillcolor="#a0a0a0" stroked="f"/>
+        </w:pict>
+      </w:r>
+    </w:p>
+    <w:p>
+      <w:pPr>
+        <w:spacing w:before="100" w:beforeAutospacing="1" w:after="100" w:afterAutospacing="1" w:line="240" w:lineRule="auto"/>
+        <w:outlineLvl w:val="2"/>
+        <w:rPr>
+          <w:rFonts w:ascii="Times New Roman" w:eastAsia="Times New Roman" w:hAnsi="Times New Roman"/>
+          <w:b/>
+          <w:bCs/>
+          <w:sz w:val="27"/>
+          <w:szCs w:val="27"/>
+        </w:rPr>
+      </w:pPr>
+      <w:r>
+        <w:rPr>
+          <w:rFonts w:ascii="Times New Roman" w:eastAsia="Times New Roman" w:hAnsi="Times New Roman"/>
+          <w:b/>
+          <w:bCs/>
+          <w:sz w:val="27"/>
+          <w:szCs w:val="27"/>
+        </w:rPr>
+        <w:t>Student 2 (Components Used)</w:t>
+      </w:r>
+    </w:p>
+    <w:p>
+      <w:pPr>
+        <w:spacing w:before="100" w:beforeAutospacing="1" w:after="100" w:afterAutospacing="1" w:line="240" w:lineRule="auto"/>
+        <w:rPr>
+          <w:rFonts w:ascii="Times New Roman" w:eastAsia="Times New Roman" w:hAnsi="Times New Roman"/>
+          <w:sz w:val="24"/>
+          <w:szCs w:val="24"/>
+        </w:rPr>
+      </w:pPr>
+      <w:r>
+        <w:rPr>
+          <w:rFonts w:ascii="Times New Roman" w:eastAsia="Times New Roman" w:hAnsi="Times New Roman"/>
+          <w:sz w:val="24"/>
+          <w:szCs w:val="24"/>
+        </w:rPr>
+        <w:t>Good morning / Good afternoon.</w:t>
+      </w:r>
+      <w:r>
+        <w:rPr>
+          <w:rFonts w:ascii="Times New Roman" w:eastAsia="Times New Roman" w:hAnsi="Times New Roman"/>
+          <w:sz w:val="24"/>
+          <w:szCs w:val="24"/>
+        </w:rPr>
+        <w:br/>
+        <w:t xml:space="preserve">My name is </w:t>
+      </w:r>
+      <w:r>
+        <w:rPr>
+          <w:rFonts w:ascii="Times New Roman" w:eastAsia="Times New Roman" w:hAnsi="Times New Roman"/>
+          <w:b/>
+          <w:bCs/>
+          <w:sz w:val="24"/>
+          <w:szCs w:val="24"/>
+        </w:rPr>
+        <w:t>(student’s name)</w:t>
+      </w:r>
+      <w:r>
+        <w:rPr>
+          <w:rFonts w:ascii="Times New Roman" w:eastAsia="Times New Roman" w:hAnsi="Times New Roman"/>
+          <w:sz w:val="24"/>
+          <w:szCs w:val="24"/>
+        </w:rPr>
+        <w:t>.</w:t>
+      </w:r>
+    </w:p>
+    <w:p>
+      <w:pPr>
+        <w:spacing w:before="100" w:beforeAutospacing="1" w:after="100" w:afterAutospacing="1" w:line="240" w:lineRule="auto"/>
+        <w:rPr>
+          <w:rFonts w:ascii="Times New Roman" w:eastAsia="Times New Roman" w:hAnsi="Times New Roman"/>
+          <w:sz w:val="24"/>
+          <w:szCs w:val="24"/>
+        </w:rPr>
+      </w:pPr>
+      <w:r>
+        <w:rPr>
+          <w:rFonts w:ascii="Times New Roman" w:eastAsia="Times New Roman" w:hAnsi="Times New Roman"/>
+          <w:sz w:val="24"/>
+          <w:szCs w:val="24"/>
+        </w:rPr>
+        <w:t xml:space="preserve">I will explain the </w:t>
+      </w:r>
+      <w:r>
+        <w:rPr>
+          <w:rFonts w:ascii="Times New Roman" w:eastAsia="Times New Roman" w:hAnsi="Times New Roman"/>
+          <w:b/>
+          <w:bCs/>
+          <w:sz w:val="24"/>
+          <w:szCs w:val="24"/>
+        </w:rPr>
+        <w:t>electronic components</w:t>
+      </w:r>
+      <w:r>
+        <w:rPr>
+          <w:rFonts w:ascii="Times New Roman" w:eastAsia="Times New Roman" w:hAnsi="Times New Roman"/>
+          <w:sz w:val="24"/>
+          <w:szCs w:val="24"/>
+        </w:rPr>
+        <w:t xml:space="preserve"> used in this project. They are:</w:t>
+      </w:r>
+    </w:p>
+    <w:p>
+      <w:pPr>
+        <w:numPr>
+          <w:ilvl w:val="0"/>
+          <w:numId w:val="15"/>
+        </w:numPr>
+        <w:spacing w:before="100" w:beforeAutospacing="1" w:after="100" w:afterAutospacing="1" w:line="240" w:lineRule="auto"/>
+        <w:rPr>
+          <w:rFonts w:ascii="Times New Roman" w:eastAsia="Times New Roman" w:hAnsi="Times New Roman"/>
+          <w:sz w:val="24"/>
+          <w:szCs w:val="24"/>
+        </w:rPr>
+      </w:pPr>
+      <w:r>
+        <w:rPr>
+          <w:rFonts w:ascii="Times New Roman" w:eastAsia="Times New Roman" w:hAnsi="Times New Roman"/>
+          <w:b/>
+          <w:bCs/>
+          <w:sz w:val="24"/>
+          <w:szCs w:val="24"/>
+        </w:rPr>
+        <w:t>Qbrick (Motherboard)</w:t>
+      </w:r>
+    </w:p>
+    <w:p>
+      <w:pPr>
+        <w:numPr>
+          <w:ilvl w:val="0"/>
+          <w:numId w:val="15"/>
+        </w:numPr>
+        <w:spacing w:before="100" w:beforeAutospacing="1" w:after="100" w:afterAutospacing="1" w:line="240" w:lineRule="auto"/>
+        <w:rPr>
+          <w:rFonts w:ascii="Times New Roman" w:eastAsia="Times New Roman" w:hAnsi="Times New Roman"/>
+          <w:sz w:val="24"/>
+          <w:szCs w:val="24"/>
+        </w:rPr>
+      </w:pPr>
+      <w:r>
+        <w:rPr>
+          <w:rFonts w:ascii="Times New Roman" w:eastAsia="Times New Roman" w:hAnsi="Times New Roman"/>
+          <w:b/>
+          <w:bCs/>
+          <w:sz w:val="24"/>
+          <w:szCs w:val="24"/>
+        </w:rPr>
+        <w:t>DC Motor</w:t>
+      </w:r>
+    </w:p>
+    <w:p>
+      <w:pPr>
+        <w:numPr>
+          <w:ilvl w:val="0"/>
+          <w:numId w:val="15"/>
+        </w:numPr>
+        <w:spacing w:before="100" w:beforeAutospacing="1" w:after="100" w:afterAutospacing="1" w:line="240" w:lineRule="auto"/>
+        <w:rPr>
+          <w:rFonts w:ascii="Times New Roman" w:eastAsia="Times New Roman" w:hAnsi="Times New Roman"/>
+          <w:sz w:val="24"/>
+          <w:szCs w:val="24"/>
+        </w:rPr>
+      </w:pPr>
+      <w:r>
+        <w:rPr>
+          <w:rFonts w:ascii="Times New Roman" w:eastAsia="Times New Roman" w:hAnsi="Times New Roman"/>
+          <w:b/>
+          <w:bCs/>
+          <w:sz w:val="24"/>
+          <w:szCs w:val="24"/>
+        </w:rPr>
+        <w:t>Wheels / Pulley Mechanism</w:t>
+      </w:r>
+    </w:p>
+    <w:p>
+      <w:pPr>
+        <w:numPr>
+          <w:ilvl w:val="0"/>
+          <w:numId w:val="15"/>
+        </w:numPr>
+        <w:spacing w:before="100" w:beforeAutospacing="1" w:after="100" w:afterAutospacing="1" w:line="240" w:lineRule="auto"/>
+        <w:rPr>
+          <w:rFonts w:ascii="Times New Roman" w:eastAsia="Times New Roman" w:hAnsi="Times New Roman"/>
+          <w:sz w:val="24"/>
+          <w:szCs w:val="24"/>
+        </w:rPr>
+      </w:pPr>
+      <w:r>
+        <w:rPr>
+          <w:rFonts w:ascii="Times New Roman" w:eastAsia="Times New Roman" w:hAnsi="Times New Roman"/>
+          <w:b/>
+          <w:bCs/>
+          <w:sz w:val="24"/>
+          <w:szCs w:val="24"/>
+        </w:rPr>
+        <w:t>Remote Control</w:t>
+      </w:r>
+    </w:p>
+    <w:p>
+      <w:pPr>
+        <w:spacing w:before="100" w:beforeAutospacing="1" w:after="100" w:afterAutospacing="1" w:line="240" w:lineRule="auto"/>
+        <w:rPr>
+          <w:rFonts w:ascii="Times New Roman" w:eastAsia="Times New Roman" w:hAnsi="Times New Roman"/>
+          <w:sz w:val="24"/>
+          <w:szCs w:val="24"/>
+        </w:rPr>
+      </w:pPr>
+      <w:r>
+        <w:rPr>
+          <w:rFonts w:ascii="Times New Roman" w:eastAsia="Times New Roman" w:hAnsi="Times New Roman"/>
+          <w:sz w:val="24"/>
+          <w:szCs w:val="24"/>
+        </w:rPr>
+        <w:t xml:space="preserve">In this project, we </w:t>
+      </w:r>
+      <w:r>
+        <w:rPr>
+          <w:rFonts w:ascii="Times New Roman" w:eastAsia="Times New Roman" w:hAnsi="Times New Roman"/>
+          <w:b/>
+          <w:bCs/>
+          <w:sz w:val="24"/>
+          <w:szCs w:val="24"/>
+        </w:rPr>
+        <w:t>do not use RJ cables</w:t>
+      </w:r>
+      <w:r>
+        <w:rPr>
+          <w:rFonts w:ascii="Times New Roman" w:eastAsia="Times New Roman" w:hAnsi="Times New Roman"/>
+          <w:sz w:val="24"/>
+          <w:szCs w:val="24"/>
+        </w:rPr>
+        <w:t>. The DC motor and wheels are used to move the flag up and down.</w:t>
+      </w:r>
+    </w:p>
+    <w:p>
+      <w:pPr>
+        <w:spacing w:before="100" w:beforeAutospacing="1" w:after="100" w:afterAutospacing="1" w:line="240" w:lineRule="auto"/>
+        <w:rPr>
+          <w:rFonts w:ascii="Times New Roman" w:eastAsia="Times New Roman" w:hAnsi="Times New Roman"/>
+          <w:sz w:val="24"/>
+          <w:szCs w:val="24"/>
+        </w:rPr>
+      </w:pPr>
+      <w:r>
+        <w:rPr>
+          <w:rFonts w:ascii="Times New Roman" w:eastAsia="Times New Roman" w:hAnsi="Times New Roman"/>
+          <w:sz w:val="24"/>
+          <w:szCs w:val="24"/>
+        </w:rPr>
+        <w:t>Now, my friend will explain the working of the project.</w:t>
+      </w:r>
+    </w:p>
+    <w:p>
+      <w:pPr>
+        <w:spacing w:after="0" w:line="240" w:lineRule="auto"/>
+        <w:rPr>
+          <w:rFonts w:ascii="Times New Roman" w:eastAsia="Times New Roman" w:hAnsi="Times New Roman"/>
+          <w:sz w:val="24"/>
+          <w:szCs w:val="24"/>
+        </w:rPr>
+      </w:pPr>
+      <w:r>
+        <w:rPr>
+          <w:rFonts w:ascii="Times New Roman" w:eastAsia="Times New Roman" w:hAnsi="Times New Roman"/>
+          <w:sz w:val="24"/>
+          <w:szCs w:val="24"/>
+        </w:rPr>
+        <w:pict>
+          <v:rect id="_x0000_i1041" style="width:0;height:1.5pt" o:hralign="center" o:hrstd="t" o:hr="t" fillcolor="#a0a0a0" stroked="f"/>
+        </w:pict>
+      </w:r>
+    </w:p>
+    <w:p>
+      <w:pPr>
+        <w:spacing w:before="100" w:beforeAutospacing="1" w:after="100" w:afterAutospacing="1" w:line="240" w:lineRule="auto"/>
+        <w:outlineLvl w:val="2"/>
+        <w:rPr>
+          <w:rFonts w:ascii="Times New Roman" w:eastAsia="Times New Roman" w:hAnsi="Times New Roman"/>
+          <w:b/>
+          <w:bCs/>
+          <w:sz w:val="27"/>
+          <w:szCs w:val="27"/>
+        </w:rPr>
+      </w:pPr>
+      <w:r>
+        <w:rPr>
+          <w:rFonts w:ascii="Times New Roman" w:eastAsia="Times New Roman" w:hAnsi="Times New Roman"/>
+          <w:b/>
+          <w:bCs/>
+          <w:sz w:val="27"/>
+          <w:szCs w:val="27"/>
+        </w:rPr>
+        <w:t>Student 3 (Working of the Project)</w:t>
+      </w:r>
+    </w:p>
+    <w:p>
+      <w:pPr>
+        <w:spacing w:before="100" w:beforeAutospacing="1" w:after="100" w:afterAutospacing="1" w:line="240" w:lineRule="auto"/>
+        <w:rPr>
+          <w:rFonts w:ascii="Times New Roman" w:eastAsia="Times New Roman" w:hAnsi="Times New Roman"/>
+          <w:sz w:val="24"/>
+          <w:szCs w:val="24"/>
+        </w:rPr>
+      </w:pPr>
+      <w:r>
+        <w:rPr>
+          <w:rFonts w:ascii="Times New Roman" w:eastAsia="Times New Roman" w:hAnsi="Times New Roman"/>
+          <w:sz w:val="24"/>
+          <w:szCs w:val="24"/>
+        </w:rPr>
+        <w:t>Good morning / Good afternoon.</w:t>
+      </w:r>
+      <w:r>
+        <w:rPr>
+          <w:rFonts w:ascii="Times New Roman" w:eastAsia="Times New Roman" w:hAnsi="Times New Roman"/>
+          <w:sz w:val="24"/>
+          <w:szCs w:val="24"/>
+        </w:rPr>
+        <w:br/>
+        <w:t xml:space="preserve">My name is </w:t>
+      </w:r>
+      <w:r>
+        <w:rPr>
+          <w:rFonts w:ascii="Times New Roman" w:eastAsia="Times New Roman" w:hAnsi="Times New Roman"/>
+          <w:b/>
+          <w:bCs/>
+          <w:sz w:val="24"/>
+          <w:szCs w:val="24"/>
+        </w:rPr>
+        <w:t>(student’s name)</w:t>
+      </w:r>
+      <w:r>
+        <w:rPr>
+          <w:rFonts w:ascii="Times New Roman" w:eastAsia="Times New Roman" w:hAnsi="Times New Roman"/>
+          <w:sz w:val="24"/>
+          <w:szCs w:val="24"/>
+        </w:rPr>
+        <w:t>.</w:t>
+      </w:r>
+    </w:p>
+    <w:p>
+      <w:pPr>
+        <w:spacing w:before="100" w:beforeAutospacing="1" w:after="100" w:afterAutospacing="1" w:line="240" w:lineRule="auto"/>
+        <w:rPr>
+          <w:rFonts w:ascii="Times New Roman" w:eastAsia="Times New Roman" w:hAnsi="Times New Roman"/>
+          <w:sz w:val="24"/>
+          <w:szCs w:val="24"/>
+        </w:rPr>
+      </w:pPr>
+      <w:r>
+        <w:rPr>
+          <w:rFonts w:ascii="Times New Roman" w:eastAsia="Times New Roman" w:hAnsi="Times New Roman"/>
+          <w:sz w:val="24"/>
+          <w:szCs w:val="24"/>
+        </w:rPr>
+        <w:t xml:space="preserve">This is the </w:t>
+      </w:r>
+      <w:r>
+        <w:rPr>
+          <w:rFonts w:ascii="Times New Roman" w:eastAsia="Times New Roman" w:hAnsi="Times New Roman"/>
+          <w:b/>
+          <w:bCs/>
+          <w:sz w:val="24"/>
+          <w:szCs w:val="24"/>
+        </w:rPr>
+        <w:t>Qbrick</w:t>
+      </w:r>
+      <w:r>
+        <w:rPr>
+          <w:rFonts w:ascii="Times New Roman" w:eastAsia="Times New Roman" w:hAnsi="Times New Roman"/>
+          <w:sz w:val="24"/>
+          <w:szCs w:val="24"/>
+        </w:rPr>
+        <w:t xml:space="preserve">, which acts as the </w:t>
+      </w:r>
+      <w:r>
+        <w:rPr>
+          <w:rFonts w:ascii="Times New Roman" w:eastAsia="Times New Roman" w:hAnsi="Times New Roman"/>
+          <w:b/>
+          <w:bCs/>
+          <w:sz w:val="24"/>
+          <w:szCs w:val="24"/>
+        </w:rPr>
+        <w:t>control unit</w:t>
+      </w:r>
+      <w:r>
+        <w:rPr>
+          <w:rFonts w:ascii="Times New Roman" w:eastAsia="Times New Roman" w:hAnsi="Times New Roman"/>
+          <w:sz w:val="24"/>
+          <w:szCs w:val="24"/>
+        </w:rPr>
+        <w:t xml:space="preserve"> of the project. It receives signals from the </w:t>
+      </w:r>
+      <w:r>
+        <w:rPr>
+          <w:rFonts w:ascii="Times New Roman" w:eastAsia="Times New Roman" w:hAnsi="Times New Roman"/>
+          <w:b/>
+          <w:bCs/>
+          <w:sz w:val="24"/>
+          <w:szCs w:val="24"/>
+        </w:rPr>
+        <w:t>remote control</w:t>
+      </w:r>
+      <w:r>
+        <w:rPr>
+          <w:rFonts w:ascii="Times New Roman" w:eastAsia="Times New Roman" w:hAnsi="Times New Roman"/>
+          <w:sz w:val="24"/>
+          <w:szCs w:val="24"/>
+        </w:rPr>
+        <w:t>.</w:t>
+      </w:r>
+    </w:p>
+    <w:p>
+      <w:pPr>
+        <w:spacing w:before="100" w:beforeAutospacing="1" w:after="100" w:afterAutospacing="1" w:line="240" w:lineRule="auto"/>
+        <w:rPr>
+          <w:rFonts w:ascii="Times New Roman" w:eastAsia="Times New Roman" w:hAnsi="Times New Roman"/>
+          <w:sz w:val="24"/>
+          <w:szCs w:val="24"/>
+        </w:rPr>
+      </w:pPr>
+      <w:r>
+        <w:rPr>
+          <w:rFonts w:ascii="Times New Roman" w:eastAsia="Times New Roman" w:hAnsi="Times New Roman"/>
+          <w:sz w:val="24"/>
+          <w:szCs w:val="24"/>
+        </w:rPr>
+        <w:lastRenderedPageBreak/>
+        <w:t xml:space="preserve">Unlike other projects, we </w:t>
+      </w:r>
+      <w:r>
+        <w:rPr>
+          <w:rFonts w:ascii="Times New Roman" w:eastAsia="Times New Roman" w:hAnsi="Times New Roman"/>
+          <w:b/>
+          <w:bCs/>
+          <w:sz w:val="24"/>
+          <w:szCs w:val="24"/>
+        </w:rPr>
+        <w:t>do not use red or green buttons</w:t>
+      </w:r>
+      <w:r>
+        <w:rPr>
+          <w:rFonts w:ascii="Times New Roman" w:eastAsia="Times New Roman" w:hAnsi="Times New Roman"/>
+          <w:sz w:val="24"/>
+          <w:szCs w:val="24"/>
+        </w:rPr>
+        <w:t xml:space="preserve">. Instead, we use the </w:t>
+      </w:r>
+      <w:r>
+        <w:rPr>
+          <w:rFonts w:ascii="Times New Roman" w:eastAsia="Times New Roman" w:hAnsi="Times New Roman"/>
+          <w:b/>
+          <w:bCs/>
+          <w:sz w:val="24"/>
+          <w:szCs w:val="24"/>
+        </w:rPr>
+        <w:t>UP and DOWN buttons</w:t>
+      </w:r>
+      <w:r>
+        <w:rPr>
+          <w:rFonts w:ascii="Times New Roman" w:eastAsia="Times New Roman" w:hAnsi="Times New Roman"/>
+          <w:sz w:val="24"/>
+          <w:szCs w:val="24"/>
+        </w:rPr>
+        <w:t xml:space="preserve"> on the remote control.</w:t>
+      </w:r>
+    </w:p>
+    <w:p>
+      <w:pPr>
+        <w:spacing w:before="100" w:beforeAutospacing="1" w:after="100" w:afterAutospacing="1" w:line="240" w:lineRule="auto"/>
+        <w:rPr>
+          <w:rFonts w:ascii="Times New Roman" w:eastAsia="Times New Roman" w:hAnsi="Times New Roman"/>
+          <w:sz w:val="24"/>
+          <w:szCs w:val="24"/>
+        </w:rPr>
+      </w:pPr>
+      <w:r>
+        <w:rPr>
+          <w:rFonts w:ascii="Times New Roman" w:eastAsia="Times New Roman" w:hAnsi="Times New Roman"/>
+          <w:sz w:val="24"/>
+          <w:szCs w:val="24"/>
+        </w:rPr>
+        <w:t xml:space="preserve">When the </w:t>
+      </w:r>
+      <w:r>
+        <w:rPr>
+          <w:rFonts w:ascii="Times New Roman" w:eastAsia="Times New Roman" w:hAnsi="Times New Roman"/>
+          <w:b/>
+          <w:bCs/>
+          <w:sz w:val="24"/>
+          <w:szCs w:val="24"/>
+        </w:rPr>
+        <w:t>UP button</w:t>
+      </w:r>
+      <w:r>
+        <w:rPr>
+          <w:rFonts w:ascii="Times New Roman" w:eastAsia="Times New Roman" w:hAnsi="Times New Roman"/>
+          <w:sz w:val="24"/>
+          <w:szCs w:val="24"/>
+        </w:rPr>
+        <w:t xml:space="preserve"> is pressed, the Qbrick sends a signal to the </w:t>
+      </w:r>
+      <w:r>
+        <w:rPr>
+          <w:rFonts w:ascii="Times New Roman" w:eastAsia="Times New Roman" w:hAnsi="Times New Roman"/>
+          <w:b/>
+          <w:bCs/>
+          <w:sz w:val="24"/>
+          <w:szCs w:val="24"/>
+        </w:rPr>
+        <w:t>DC motor</w:t>
+      </w:r>
+      <w:r>
+        <w:rPr>
+          <w:rFonts w:ascii="Times New Roman" w:eastAsia="Times New Roman" w:hAnsi="Times New Roman"/>
+          <w:sz w:val="24"/>
+          <w:szCs w:val="24"/>
+        </w:rPr>
+        <w:t xml:space="preserve">, and the motor rotates in one direction to </w:t>
+      </w:r>
+      <w:r>
+        <w:rPr>
+          <w:rFonts w:ascii="Times New Roman" w:eastAsia="Times New Roman" w:hAnsi="Times New Roman"/>
+          <w:b/>
+          <w:bCs/>
+          <w:sz w:val="24"/>
+          <w:szCs w:val="24"/>
+        </w:rPr>
+        <w:t>raise the flag</w:t>
+      </w:r>
+      <w:r>
+        <w:rPr>
+          <w:rFonts w:ascii="Times New Roman" w:eastAsia="Times New Roman" w:hAnsi="Times New Roman"/>
+          <w:sz w:val="24"/>
+          <w:szCs w:val="24"/>
+        </w:rPr>
+        <w:t>.</w:t>
+      </w:r>
+    </w:p>
+    <w:p>
+      <w:pPr>
+        <w:spacing w:before="100" w:beforeAutospacing="1" w:after="100" w:afterAutospacing="1" w:line="240" w:lineRule="auto"/>
+        <w:rPr>
+          <w:rFonts w:ascii="Times New Roman" w:eastAsia="Times New Roman" w:hAnsi="Times New Roman"/>
+          <w:sz w:val="24"/>
+          <w:szCs w:val="24"/>
+        </w:rPr>
+      </w:pPr>
+      <w:r>
+        <w:rPr>
+          <w:rFonts w:ascii="Times New Roman" w:eastAsia="Times New Roman" w:hAnsi="Times New Roman"/>
+          <w:sz w:val="24"/>
+          <w:szCs w:val="24"/>
+        </w:rPr>
+        <w:t xml:space="preserve">When the </w:t>
+      </w:r>
+      <w:r>
+        <w:rPr>
+          <w:rFonts w:ascii="Times New Roman" w:eastAsia="Times New Roman" w:hAnsi="Times New Roman"/>
+          <w:b/>
+          <w:bCs/>
+          <w:sz w:val="24"/>
+          <w:szCs w:val="24"/>
+        </w:rPr>
+        <w:t>DOWN button</w:t>
+      </w:r>
+      <w:r>
+        <w:rPr>
+          <w:rFonts w:ascii="Times New Roman" w:eastAsia="Times New Roman" w:hAnsi="Times New Roman"/>
+          <w:sz w:val="24"/>
+          <w:szCs w:val="24"/>
+        </w:rPr>
+        <w:t xml:space="preserve"> is pressed, the motor rotates in the opposite direction to </w:t>
+      </w:r>
+      <w:r>
+        <w:rPr>
+          <w:rFonts w:ascii="Times New Roman" w:eastAsia="Times New Roman" w:hAnsi="Times New Roman"/>
+          <w:b/>
+          <w:bCs/>
+          <w:sz w:val="24"/>
+          <w:szCs w:val="24"/>
+        </w:rPr>
+        <w:t>lower the flag</w:t>
+      </w:r>
+      <w:r>
+        <w:rPr>
+          <w:rFonts w:ascii="Times New Roman" w:eastAsia="Times New Roman" w:hAnsi="Times New Roman"/>
+          <w:sz w:val="24"/>
+          <w:szCs w:val="24"/>
+        </w:rPr>
+        <w:t>.</w:t>
+      </w:r>
+    </w:p>
+    <w:p>
+      <w:pPr>
+        <w:spacing w:after="0" w:line="240" w:lineRule="auto"/>
+        <w:rPr>
+          <w:rFonts w:ascii="Times New Roman" w:eastAsia="Times New Roman" w:hAnsi="Times New Roman"/>
+          <w:sz w:val="24"/>
+          <w:szCs w:val="24"/>
+        </w:rPr>
+      </w:pPr>
+      <w:r>
+        <w:rPr>
+          <w:rFonts w:ascii="Times New Roman" w:eastAsia="Times New Roman" w:hAnsi="Times New Roman"/>
+          <w:sz w:val="24"/>
+          <w:szCs w:val="24"/>
+        </w:rPr>
+        <w:pict>
+          <v:rect id="_x0000_i1042" style="width:0;height:1.5pt" o:hralign="center" o:hrstd="t" o:hr="t" fillcolor="#a0a0a0" stroked="f"/>
+        </w:pict>
+      </w:r>
+    </w:p>
+    <w:p>
+      <w:pPr>
+        <w:spacing w:before="100" w:beforeAutospacing="1" w:after="100" w:afterAutospacing="1" w:line="240" w:lineRule="auto"/>
+        <w:outlineLvl w:val="2"/>
+        <w:rPr>
+          <w:rFonts w:ascii="Times New Roman" w:eastAsia="Times New Roman" w:hAnsi="Times New Roman"/>
+          <w:b/>
+          <w:bCs/>
+          <w:sz w:val="27"/>
+          <w:szCs w:val="27"/>
+        </w:rPr>
+      </w:pPr>
+      <w:r>
+        <w:rPr>
+          <w:rFonts w:ascii="Times New Roman" w:eastAsia="Times New Roman" w:hAnsi="Times New Roman"/>
+          <w:b/>
+          <w:bCs/>
+          <w:sz w:val="27"/>
+          <w:szCs w:val="27"/>
+        </w:rPr>
+        <w:t>Student 4 (Demonstration &amp; Output)</w:t>
+      </w:r>
+    </w:p>
+    <w:p>
+      <w:pPr>
+        <w:spacing w:before="100" w:beforeAutospacing="1" w:after="100" w:afterAutospacing="1" w:line="240" w:lineRule="auto"/>
+        <w:rPr>
+          <w:rFonts w:ascii="Times New Roman" w:eastAsia="Times New Roman" w:hAnsi="Times New Roman"/>
+          <w:sz w:val="24"/>
+          <w:szCs w:val="24"/>
+        </w:rPr>
+      </w:pPr>
+      <w:r>
+        <w:rPr>
+          <w:rFonts w:ascii="Times New Roman" w:eastAsia="Times New Roman" w:hAnsi="Times New Roman"/>
+          <w:sz w:val="24"/>
+          <w:szCs w:val="24"/>
+        </w:rPr>
+        <w:t>Good morning / Good afternoon.</w:t>
+      </w:r>
+      <w:r>
+        <w:rPr>
+          <w:rFonts w:ascii="Times New Roman" w:eastAsia="Times New Roman" w:hAnsi="Times New Roman"/>
+          <w:sz w:val="24"/>
+          <w:szCs w:val="24"/>
+        </w:rPr>
+        <w:br/>
+        <w:t xml:space="preserve">My name is </w:t>
+      </w:r>
+      <w:r>
+        <w:rPr>
+          <w:rFonts w:ascii="Times New Roman" w:eastAsia="Times New Roman" w:hAnsi="Times New Roman"/>
+          <w:b/>
+          <w:bCs/>
+          <w:sz w:val="24"/>
+          <w:szCs w:val="24"/>
+        </w:rPr>
+        <w:t>(student’s name)</w:t>
+      </w:r>
+      <w:r>
+        <w:rPr>
+          <w:rFonts w:ascii="Times New Roman" w:eastAsia="Times New Roman" w:hAnsi="Times New Roman"/>
+          <w:sz w:val="24"/>
+          <w:szCs w:val="24"/>
+        </w:rPr>
+        <w:t>.</w:t>
+      </w:r>
+    </w:p>
+    <w:p>
+      <w:pPr>
+        <w:spacing w:before="100" w:beforeAutospacing="1" w:after="100" w:afterAutospacing="1" w:line="240" w:lineRule="auto"/>
+        <w:rPr>
+          <w:rFonts w:ascii="Times New Roman" w:eastAsia="Times New Roman" w:hAnsi="Times New Roman"/>
+          <w:sz w:val="24"/>
+          <w:szCs w:val="24"/>
+        </w:rPr>
+      </w:pPr>
+      <w:r>
+        <w:rPr>
+          <w:rFonts w:ascii="Times New Roman" w:eastAsia="Times New Roman" w:hAnsi="Times New Roman"/>
+          <w:sz w:val="24"/>
+          <w:szCs w:val="24"/>
+        </w:rPr>
+        <w:t>Using the remote control:</w:t>
+      </w:r>
+    </w:p>
+    <w:p>
+      <w:pPr>
+        <w:numPr>
+          <w:ilvl w:val="0"/>
+          <w:numId w:val="16"/>
+        </w:numPr>
+        <w:spacing w:before="100" w:beforeAutospacing="1" w:after="100" w:afterAutospacing="1" w:line="240" w:lineRule="auto"/>
+        <w:rPr>
+          <w:rFonts w:ascii="Times New Roman" w:eastAsia="Times New Roman" w:hAnsi="Times New Roman"/>
+          <w:sz w:val="24"/>
+          <w:szCs w:val="24"/>
+        </w:rPr>
+      </w:pPr>
+      <w:r>
+        <w:rPr>
+          <w:rFonts w:ascii="Times New Roman" w:eastAsia="Times New Roman" w:hAnsi="Times New Roman"/>
+          <w:sz w:val="24"/>
+          <w:szCs w:val="24"/>
+        </w:rPr>
+        <w:t xml:space="preserve">Pressing the </w:t>
+      </w:r>
+      <w:r>
+        <w:rPr>
+          <w:rFonts w:ascii="Times New Roman" w:eastAsia="Times New Roman" w:hAnsi="Times New Roman"/>
+          <w:b/>
+          <w:bCs/>
+          <w:sz w:val="24"/>
+          <w:szCs w:val="24"/>
+        </w:rPr>
+        <w:t>UP button</w:t>
+      </w:r>
+      <w:r>
+        <w:rPr>
+          <w:rFonts w:ascii="Times New Roman" w:eastAsia="Times New Roman" w:hAnsi="Times New Roman"/>
+          <w:sz w:val="24"/>
+          <w:szCs w:val="24"/>
+        </w:rPr>
+        <w:t xml:space="preserve"> lifts the flag smoothly</w:t>
+      </w:r>
+    </w:p>
+    <w:p>
+      <w:pPr>
+        <w:numPr>
+          <w:ilvl w:val="0"/>
+          <w:numId w:val="16"/>
+        </w:numPr>
+        <w:spacing w:before="100" w:beforeAutospacing="1" w:after="100" w:afterAutospacing="1" w:line="240" w:lineRule="auto"/>
+        <w:rPr>
+          <w:rFonts w:ascii="Times New Roman" w:eastAsia="Times New Roman" w:hAnsi="Times New Roman"/>
+          <w:sz w:val="24"/>
+          <w:szCs w:val="24"/>
+        </w:rPr>
+      </w:pPr>
+      <w:r>
+        <w:rPr>
+          <w:rFonts w:ascii="Times New Roman" w:eastAsia="Times New Roman" w:hAnsi="Times New Roman"/>
+          <w:sz w:val="24"/>
+          <w:szCs w:val="24"/>
+        </w:rPr>
+        <w:t xml:space="preserve">Pressing the </w:t>
+      </w:r>
+      <w:r>
+        <w:rPr>
+          <w:rFonts w:ascii="Times New Roman" w:eastAsia="Times New Roman" w:hAnsi="Times New Roman"/>
+          <w:b/>
+          <w:bCs/>
+          <w:sz w:val="24"/>
+          <w:szCs w:val="24"/>
+        </w:rPr>
+        <w:t>DOWN button</w:t>
+      </w:r>
+      <w:r>
+        <w:rPr>
+          <w:rFonts w:ascii="Times New Roman" w:eastAsia="Times New Roman" w:hAnsi="Times New Roman"/>
+          <w:sz w:val="24"/>
+          <w:szCs w:val="24"/>
+        </w:rPr>
+        <w:t xml:space="preserve"> brings the flag down</w:t>
+      </w:r>
+    </w:p>
+    <w:p>
+      <w:pPr>
+        <w:spacing w:before="100" w:beforeAutospacing="1" w:after="100" w:afterAutospacing="1" w:line="240" w:lineRule="auto"/>
+        <w:rPr>
+          <w:rFonts w:ascii="Times New Roman" w:eastAsia="Times New Roman" w:hAnsi="Times New Roman"/>
+          <w:sz w:val="24"/>
+          <w:szCs w:val="24"/>
+        </w:rPr>
+      </w:pPr>
+      <w:r>
+        <w:rPr>
+          <w:rFonts w:ascii="Times New Roman" w:eastAsia="Times New Roman" w:hAnsi="Times New Roman"/>
+          <w:sz w:val="24"/>
+          <w:szCs w:val="24"/>
+        </w:rPr>
+        <w:t xml:space="preserve">The wheels and pulley mechanism help in </w:t>
+      </w:r>
+      <w:r>
+        <w:rPr>
+          <w:rFonts w:ascii="Times New Roman" w:eastAsia="Times New Roman" w:hAnsi="Times New Roman"/>
+          <w:b/>
+          <w:bCs/>
+          <w:sz w:val="24"/>
+          <w:szCs w:val="24"/>
+        </w:rPr>
+        <w:t>controlled and stable flag movement</w:t>
+      </w:r>
+      <w:r>
+        <w:rPr>
+          <w:rFonts w:ascii="Times New Roman" w:eastAsia="Times New Roman" w:hAnsi="Times New Roman"/>
+          <w:sz w:val="24"/>
+          <w:szCs w:val="24"/>
+        </w:rPr>
+        <w:t>.</w:t>
+      </w:r>
+    </w:p>
+    <w:p>
+      <w:pPr>
+        <w:spacing w:before="100" w:beforeAutospacing="1" w:after="100" w:afterAutospacing="1" w:line="240" w:lineRule="auto"/>
+        <w:rPr>
+          <w:rFonts w:ascii="Times New Roman" w:eastAsia="Times New Roman" w:hAnsi="Times New Roman"/>
+          <w:sz w:val="24"/>
+          <w:szCs w:val="24"/>
+        </w:rPr>
+      </w:pPr>
+      <w:r>
+        <w:rPr>
+          <w:rFonts w:ascii="Times New Roman" w:eastAsia="Times New Roman" w:hAnsi="Times New Roman"/>
+          <w:b/>
+          <w:bCs/>
+          <w:sz w:val="24"/>
+          <w:szCs w:val="24"/>
+        </w:rPr>
+        <w:t>(Live Demonstration – Flag Up &amp; Down using Remote Control)</w:t>
+      </w:r>
+    </w:p>
+    <w:p>
+      <w:pPr>
+        <w:spacing w:before="100" w:beforeAutospacing="1" w:after="100" w:afterAutospacing="1" w:line="240" w:lineRule="auto"/>
+        <w:rPr>
+          <w:rFonts w:ascii="Times New Roman" w:eastAsia="Times New Roman" w:hAnsi="Times New Roman"/>
+          <w:sz w:val="24"/>
+          <w:szCs w:val="24"/>
+        </w:rPr>
+      </w:pPr>
+      <w:r>
+        <w:rPr>
+          <w:rFonts w:ascii="Times New Roman" w:eastAsia="Times New Roman" w:hAnsi="Times New Roman"/>
+          <w:sz w:val="24"/>
+          <w:szCs w:val="24"/>
+        </w:rPr>
+        <w:t>Thank you.</w:t>
+      </w:r>
+    </w:p>
+    <w:p>
+      <w:pPr>
+        <w:spacing w:after="0" w:line="240" w:lineRule="auto"/>
+        <w:rPr>
+          <w:rFonts w:ascii="Times New Roman" w:eastAsia="Times New Roman" w:hAnsi="Times New Roman"/>
+          <w:sz w:val="24"/>
+          <w:szCs w:val="24"/>
+        </w:rPr>
+      </w:pPr>
+      <w:r>
+        <w:rPr>
+          <w:rFonts w:ascii="Times New Roman" w:eastAsia="Times New Roman" w:hAnsi="Times New Roman"/>
+          <w:sz w:val="24"/>
+          <w:szCs w:val="24"/>
+        </w:rPr>
+        <w:pict>
+          <v:rect id="_x0000_i1043" style="width:0;height:1.5pt" o:hralign="center" o:hrstd="t" o:hr="t" fillcolor="#a0a0a0" stroked="f"/>
+        </w:pict>
+      </w:r>
+    </w:p>
+    <w:p>
+      <w:pPr>
+        <w:spacing w:before="100" w:beforeAutospacing="1" w:after="100" w:afterAutospacing="1" w:line="240" w:lineRule="auto"/>
+        <w:outlineLvl w:val="2"/>
+        <w:rPr>
+          <w:rFonts w:ascii="Times New Roman" w:eastAsia="Times New Roman" w:hAnsi="Times New Roman"/>
+          <w:b/>
+          <w:bCs/>
+          <w:sz w:val="27"/>
+          <w:szCs w:val="27"/>
+        </w:rPr>
+      </w:pPr>
+      <w:r>
+        <w:rPr>
+          <w:rFonts w:ascii="Times New Roman" w:eastAsia="Times New Roman" w:hAnsi="Times New Roman"/>
+          <w:b/>
+          <w:bCs/>
+          <w:sz w:val="27"/>
+          <w:szCs w:val="27"/>
+        </w:rPr>
+        <w:t>Conclusion</w:t>
+      </w:r>
+    </w:p>
+    <w:p>
+      <w:pPr>
+        <w:spacing w:before="100" w:beforeAutospacing="1" w:after="100" w:afterAutospacing="1" w:line="240" w:lineRule="auto"/>
+        <w:rPr>
+          <w:rFonts w:ascii="Times New Roman" w:eastAsia="Times New Roman" w:hAnsi="Times New Roman"/>
+          <w:sz w:val="24"/>
+          <w:szCs w:val="24"/>
+        </w:rPr>
+      </w:pPr>
+      <w:r>
+        <w:rPr>
+          <w:rFonts w:ascii="Times New Roman" w:eastAsia="Times New Roman" w:hAnsi="Times New Roman"/>
+          <w:sz w:val="24"/>
+          <w:szCs w:val="24"/>
+        </w:rPr>
+        <w:t xml:space="preserve">This project helps us understand </w:t>
+      </w:r>
+      <w:r>
+        <w:rPr>
+          <w:rFonts w:ascii="Times New Roman" w:eastAsia="Times New Roman" w:hAnsi="Times New Roman"/>
+          <w:b/>
+          <w:bCs/>
+          <w:sz w:val="24"/>
+          <w:szCs w:val="24"/>
+        </w:rPr>
+        <w:t>remote control systems, DC motor operation, direction control, and basic automation</w:t>
+      </w:r>
+      <w:r>
+        <w:rPr>
+          <w:rFonts w:ascii="Times New Roman" w:eastAsia="Times New Roman" w:hAnsi="Times New Roman"/>
+          <w:sz w:val="24"/>
+          <w:szCs w:val="24"/>
+        </w:rPr>
+        <w:t xml:space="preserve">. It also demonstrates how technology can be used in ceremonial applications like </w:t>
+      </w:r>
+      <w:r>
+        <w:rPr>
+          <w:rFonts w:ascii="Times New Roman" w:eastAsia="Times New Roman" w:hAnsi="Times New Roman"/>
+          <w:b/>
+          <w:bCs/>
+          <w:sz w:val="24"/>
+          <w:szCs w:val="24"/>
+        </w:rPr>
+        <w:t>flag hoisting</w:t>
+      </w:r>
+      <w:r>
+        <w:rPr>
+          <w:rFonts w:ascii="Times New Roman" w:eastAsia="Times New Roman" w:hAnsi="Times New Roman"/>
+          <w:sz w:val="24"/>
+          <w:szCs w:val="24"/>
+        </w:rPr>
+        <w:t>.</w:t>
+      </w:r>
+    </w:p>
+    <w:p>
+      <w:pPr>
+        <w:spacing w:after="0" w:line="240" w:lineRule="auto"/>
+        <w:rPr>
+          <w:rFonts w:ascii="Times New Roman" w:eastAsia="Times New Roman" w:hAnsi="Times New Roman"/>
+          <w:sz w:val="24"/>
+          <w:szCs w:val="24"/>
+        </w:rPr>
+      </w:pPr>
+      <w:r>
+        <w:rPr>
+          <w:rFonts w:ascii="Times New Roman" w:eastAsia="Times New Roman" w:hAnsi="Times New Roman"/>
+          <w:sz w:val="24"/>
+          <w:szCs w:val="24"/>
+        </w:rPr>
+        <w:pict>
+          <v:rect id="_x0000_i1044" style="width:0;height:1.5pt" o:hralign="center" o:hrstd="t" o:hr="t" fillcolor="#a0a0a0" stroked="f"/>
+        </w:pict>
       </w:r>
     </w:p>
     <w:p/>
@@ -8769,9 +11060,9 @@
     </w:lvl>
   </w:abstractNum>
   <w:abstractNum w:abstractNumId="2">
-    <w:nsid w:val="0E312C93"/>
+    <w:nsid w:val="0A800DA1"/>
     <w:multiLevelType w:val="multilevel"/>
-    <w:tmpl w:val="75C6918C"/>
+    <w:tmpl w:val="35E636F0"/>
     <w:lvl w:ilvl="0">
       <w:start w:val="1"/>
       <w:numFmt w:val="bullet"/>
@@ -8918,9 +11209,9 @@
     </w:lvl>
   </w:abstractNum>
   <w:abstractNum w:abstractNumId="3">
-    <w:nsid w:val="17804A61"/>
+    <w:nsid w:val="0E312C93"/>
     <w:multiLevelType w:val="multilevel"/>
-    <w:tmpl w:val="77B6FD58"/>
+    <w:tmpl w:val="75C6918C"/>
     <w:lvl w:ilvl="0">
       <w:start w:val="1"/>
       <w:numFmt w:val="bullet"/>
@@ -9067,9 +11358,9 @@
     </w:lvl>
   </w:abstractNum>
   <w:abstractNum w:abstractNumId="4">
-    <w:nsid w:val="1BEB2B95"/>
+    <w:nsid w:val="17804A61"/>
     <w:multiLevelType w:val="multilevel"/>
-    <w:tmpl w:val="76ECD2A0"/>
+    <w:tmpl w:val="77B6FD58"/>
     <w:lvl w:ilvl="0">
       <w:start w:val="1"/>
       <w:numFmt w:val="bullet"/>
@@ -9216,9 +11507,9 @@
     </w:lvl>
   </w:abstractNum>
   <w:abstractNum w:abstractNumId="5">
-    <w:nsid w:val="20192396"/>
+    <w:nsid w:val="1BEB2B95"/>
     <w:multiLevelType w:val="multilevel"/>
-    <w:tmpl w:val="CE845286"/>
+    <w:tmpl w:val="76ECD2A0"/>
     <w:lvl w:ilvl="0">
       <w:start w:val="1"/>
       <w:numFmt w:val="bullet"/>
@@ -9365,9 +11656,9 @@
     </w:lvl>
   </w:abstractNum>
   <w:abstractNum w:abstractNumId="6">
-    <w:nsid w:val="25ED2354"/>
+    <w:nsid w:val="20192396"/>
     <w:multiLevelType w:val="multilevel"/>
-    <w:tmpl w:val="0FC2FA40"/>
+    <w:tmpl w:val="CE845286"/>
     <w:lvl w:ilvl="0">
       <w:start w:val="1"/>
       <w:numFmt w:val="bullet"/>
@@ -9514,9 +11805,9 @@
     </w:lvl>
   </w:abstractNum>
   <w:abstractNum w:abstractNumId="7">
-    <w:nsid w:val="297E0A27"/>
+    <w:nsid w:val="25ED2354"/>
     <w:multiLevelType w:val="multilevel"/>
-    <w:tmpl w:val="415A9680"/>
+    <w:tmpl w:val="0FC2FA40"/>
     <w:lvl w:ilvl="0">
       <w:start w:val="1"/>
       <w:numFmt w:val="bullet"/>
@@ -9663,9 +11954,9 @@
     </w:lvl>
   </w:abstractNum>
   <w:abstractNum w:abstractNumId="8">
-    <w:nsid w:val="328D1737"/>
+    <w:nsid w:val="297E0A27"/>
     <w:multiLevelType w:val="multilevel"/>
-    <w:tmpl w:val="AB22AF54"/>
+    <w:tmpl w:val="415A9680"/>
     <w:lvl w:ilvl="0">
       <w:start w:val="1"/>
       <w:numFmt w:val="bullet"/>
@@ -9812,9 +12103,9 @@
     </w:lvl>
   </w:abstractNum>
   <w:abstractNum w:abstractNumId="9">
-    <w:nsid w:val="42B43108"/>
+    <w:nsid w:val="328D1737"/>
     <w:multiLevelType w:val="multilevel"/>
-    <w:tmpl w:val="8CD42176"/>
+    <w:tmpl w:val="AB22AF54"/>
     <w:lvl w:ilvl="0">
       <w:start w:val="1"/>
       <w:numFmt w:val="bullet"/>
@@ -9961,9 +12252,9 @@
     </w:lvl>
   </w:abstractNum>
   <w:abstractNum w:abstractNumId="10">
-    <w:nsid w:val="4A321E68"/>
+    <w:nsid w:val="42B43108"/>
     <w:multiLevelType w:val="multilevel"/>
-    <w:tmpl w:val="85BC0AD8"/>
+    <w:tmpl w:val="8CD42176"/>
     <w:lvl w:ilvl="0">
       <w:start w:val="1"/>
       <w:numFmt w:val="bullet"/>
@@ -10110,9 +12401,9 @@
     </w:lvl>
   </w:abstractNum>
   <w:abstractNum w:abstractNumId="11">
-    <w:nsid w:val="4FE12F1E"/>
+    <w:nsid w:val="4A321E68"/>
     <w:multiLevelType w:val="multilevel"/>
-    <w:tmpl w:val="7CF2D61A"/>
+    <w:tmpl w:val="85BC0AD8"/>
     <w:lvl w:ilvl="0">
       <w:start w:val="1"/>
       <w:numFmt w:val="bullet"/>
@@ -10259,9 +12550,456 @@
     </w:lvl>
   </w:abstractNum>
   <w:abstractNum w:abstractNumId="12">
+    <w:nsid w:val="4FE12F1E"/>
+    <w:multiLevelType w:val="multilevel"/>
+    <w:tmpl w:val="7CF2D61A"/>
+    <w:lvl w:ilvl="0">
+      <w:start w:val="1"/>
+      <w:numFmt w:val="bullet"/>
+      <w:lvlText w:val=""/>
+      <w:lvlJc w:val="left"/>
+      <w:pPr>
+        <w:tabs>
+          <w:tab w:val="num" w:pos="720"/>
+        </w:tabs>
+        <w:ind w:left="720" w:hanging="360"/>
+      </w:pPr>
+      <w:rPr>
+        <w:rFonts w:ascii="Symbol" w:hAnsi="Symbol" w:hint="default"/>
+        <w:sz w:val="20"/>
+      </w:rPr>
+    </w:lvl>
+    <w:lvl w:ilvl="1" w:tentative="1">
+      <w:start w:val="1"/>
+      <w:numFmt w:val="bullet"/>
+      <w:lvlText w:val="o"/>
+      <w:lvlJc w:val="left"/>
+      <w:pPr>
+        <w:tabs>
+          <w:tab w:val="num" w:pos="1440"/>
+        </w:tabs>
+        <w:ind w:left="1440" w:hanging="360"/>
+      </w:pPr>
+      <w:rPr>
+        <w:rFonts w:ascii="Courier New" w:hAnsi="Courier New" w:hint="default"/>
+        <w:sz w:val="20"/>
+      </w:rPr>
+    </w:lvl>
+    <w:lvl w:ilvl="2" w:tentative="1">
+      <w:start w:val="1"/>
+      <w:numFmt w:val="bullet"/>
+      <w:lvlText w:val=""/>
+      <w:lvlJc w:val="left"/>
+      <w:pPr>
+        <w:tabs>
+          <w:tab w:val="num" w:pos="2160"/>
+        </w:tabs>
+        <w:ind w:left="2160" w:hanging="360"/>
+      </w:pPr>
+      <w:rPr>
+        <w:rFonts w:ascii="Wingdings" w:hAnsi="Wingdings" w:hint="default"/>
+        <w:sz w:val="20"/>
+      </w:rPr>
+    </w:lvl>
+    <w:lvl w:ilvl="3" w:tentative="1">
+      <w:start w:val="1"/>
+      <w:numFmt w:val="bullet"/>
+      <w:lvlText w:val=""/>
+      <w:lvlJc w:val="left"/>
+      <w:pPr>
+        <w:tabs>
+          <w:tab w:val="num" w:pos="2880"/>
+        </w:tabs>
+        <w:ind w:left="2880" w:hanging="360"/>
+      </w:pPr>
+      <w:rPr>
+        <w:rFonts w:ascii="Wingdings" w:hAnsi="Wingdings" w:hint="default"/>
+        <w:sz w:val="20"/>
+      </w:rPr>
+    </w:lvl>
+    <w:lvl w:ilvl="4" w:tentative="1">
+      <w:start w:val="1"/>
+      <w:numFmt w:val="bullet"/>
+      <w:lvlText w:val=""/>
+      <w:lvlJc w:val="left"/>
+      <w:pPr>
+        <w:tabs>
+          <w:tab w:val="num" w:pos="3600"/>
+        </w:tabs>
+        <w:ind w:left="3600" w:hanging="360"/>
+      </w:pPr>
+      <w:rPr>
+        <w:rFonts w:ascii="Wingdings" w:hAnsi="Wingdings" w:hint="default"/>
+        <w:sz w:val="20"/>
+      </w:rPr>
+    </w:lvl>
+    <w:lvl w:ilvl="5" w:tentative="1">
+      <w:start w:val="1"/>
+      <w:numFmt w:val="bullet"/>
+      <w:lvlText w:val=""/>
+      <w:lvlJc w:val="left"/>
+      <w:pPr>
+        <w:tabs>
+          <w:tab w:val="num" w:pos="4320"/>
+        </w:tabs>
+        <w:ind w:left="4320" w:hanging="360"/>
+      </w:pPr>
+      <w:rPr>
+        <w:rFonts w:ascii="Wingdings" w:hAnsi="Wingdings" w:hint="default"/>
+        <w:sz w:val="20"/>
+      </w:rPr>
+    </w:lvl>
+    <w:lvl w:ilvl="6" w:tentative="1">
+      <w:start w:val="1"/>
+      <w:numFmt w:val="bullet"/>
+      <w:lvlText w:val=""/>
+      <w:lvlJc w:val="left"/>
+      <w:pPr>
+        <w:tabs>
+          <w:tab w:val="num" w:pos="5040"/>
+        </w:tabs>
+        <w:ind w:left="5040" w:hanging="360"/>
+      </w:pPr>
+      <w:rPr>
+        <w:rFonts w:ascii="Wingdings" w:hAnsi="Wingdings" w:hint="default"/>
+        <w:sz w:val="20"/>
+      </w:rPr>
+    </w:lvl>
+    <w:lvl w:ilvl="7" w:tentative="1">
+      <w:start w:val="1"/>
+      <w:numFmt w:val="bullet"/>
+      <w:lvlText w:val=""/>
+      <w:lvlJc w:val="left"/>
+      <w:pPr>
+        <w:tabs>
+          <w:tab w:val="num" w:pos="5760"/>
+        </w:tabs>
+        <w:ind w:left="5760" w:hanging="360"/>
+      </w:pPr>
+      <w:rPr>
+        <w:rFonts w:ascii="Wingdings" w:hAnsi="Wingdings" w:hint="default"/>
+        <w:sz w:val="20"/>
+      </w:rPr>
+    </w:lvl>
+    <w:lvl w:ilvl="8" w:tentative="1">
+      <w:start w:val="1"/>
+      <w:numFmt w:val="bullet"/>
+      <w:lvlText w:val=""/>
+      <w:lvlJc w:val="left"/>
+      <w:pPr>
+        <w:tabs>
+          <w:tab w:val="num" w:pos="6480"/>
+        </w:tabs>
+        <w:ind w:left="6480" w:hanging="360"/>
+      </w:pPr>
+      <w:rPr>
+        <w:rFonts w:ascii="Wingdings" w:hAnsi="Wingdings" w:hint="default"/>
+        <w:sz w:val="20"/>
+      </w:rPr>
+    </w:lvl>
+  </w:abstractNum>
+  <w:abstractNum w:abstractNumId="13">
     <w:nsid w:val="5C0874DF"/>
     <w:multiLevelType w:val="multilevel"/>
     <w:tmpl w:val="D02CC67C"/>
+    <w:lvl w:ilvl="0">
+      <w:start w:val="1"/>
+      <w:numFmt w:val="bullet"/>
+      <w:lvlText w:val=""/>
+      <w:lvlJc w:val="left"/>
+      <w:pPr>
+        <w:tabs>
+          <w:tab w:val="num" w:pos="720"/>
+        </w:tabs>
+        <w:ind w:left="720" w:hanging="360"/>
+      </w:pPr>
+      <w:rPr>
+        <w:rFonts w:ascii="Symbol" w:hAnsi="Symbol" w:hint="default"/>
+        <w:sz w:val="20"/>
+      </w:rPr>
+    </w:lvl>
+    <w:lvl w:ilvl="1" w:tentative="1">
+      <w:start w:val="1"/>
+      <w:numFmt w:val="bullet"/>
+      <w:lvlText w:val="o"/>
+      <w:lvlJc w:val="left"/>
+      <w:pPr>
+        <w:tabs>
+          <w:tab w:val="num" w:pos="1440"/>
+        </w:tabs>
+        <w:ind w:left="1440" w:hanging="360"/>
+      </w:pPr>
+      <w:rPr>
+        <w:rFonts w:ascii="Courier New" w:hAnsi="Courier New" w:hint="default"/>
+        <w:sz w:val="20"/>
+      </w:rPr>
+    </w:lvl>
+    <w:lvl w:ilvl="2" w:tentative="1">
+      <w:start w:val="1"/>
+      <w:numFmt w:val="bullet"/>
+      <w:lvlText w:val=""/>
+      <w:lvlJc w:val="left"/>
+      <w:pPr>
+        <w:tabs>
+          <w:tab w:val="num" w:pos="2160"/>
+        </w:tabs>
+        <w:ind w:left="2160" w:hanging="360"/>
+      </w:pPr>
+      <w:rPr>
+        <w:rFonts w:ascii="Wingdings" w:hAnsi="Wingdings" w:hint="default"/>
+        <w:sz w:val="20"/>
+      </w:rPr>
+    </w:lvl>
+    <w:lvl w:ilvl="3" w:tentative="1">
+      <w:start w:val="1"/>
+      <w:numFmt w:val="bullet"/>
+      <w:lvlText w:val=""/>
+      <w:lvlJc w:val="left"/>
+      <w:pPr>
+        <w:tabs>
+          <w:tab w:val="num" w:pos="2880"/>
+        </w:tabs>
+        <w:ind w:left="2880" w:hanging="360"/>
+      </w:pPr>
+      <w:rPr>
+        <w:rFonts w:ascii="Wingdings" w:hAnsi="Wingdings" w:hint="default"/>
+        <w:sz w:val="20"/>
+      </w:rPr>
+    </w:lvl>
+    <w:lvl w:ilvl="4" w:tentative="1">
+      <w:start w:val="1"/>
+      <w:numFmt w:val="bullet"/>
+      <w:lvlText w:val=""/>
+      <w:lvlJc w:val="left"/>
+      <w:pPr>
+        <w:tabs>
+          <w:tab w:val="num" w:pos="3600"/>
+        </w:tabs>
+        <w:ind w:left="3600" w:hanging="360"/>
+      </w:pPr>
+      <w:rPr>
+        <w:rFonts w:ascii="Wingdings" w:hAnsi="Wingdings" w:hint="default"/>
+        <w:sz w:val="20"/>
+      </w:rPr>
+    </w:lvl>
+    <w:lvl w:ilvl="5" w:tentative="1">
+      <w:start w:val="1"/>
+      <w:numFmt w:val="bullet"/>
+      <w:lvlText w:val=""/>
+      <w:lvlJc w:val="left"/>
+      <w:pPr>
+        <w:tabs>
+          <w:tab w:val="num" w:pos="4320"/>
+        </w:tabs>
+        <w:ind w:left="4320" w:hanging="360"/>
+      </w:pPr>
+      <w:rPr>
+        <w:rFonts w:ascii="Wingdings" w:hAnsi="Wingdings" w:hint="default"/>
+        <w:sz w:val="20"/>
+      </w:rPr>
+    </w:lvl>
+    <w:lvl w:ilvl="6" w:tentative="1">
+      <w:start w:val="1"/>
+      <w:numFmt w:val="bullet"/>
+      <w:lvlText w:val=""/>
+      <w:lvlJc w:val="left"/>
+      <w:pPr>
+        <w:tabs>
+          <w:tab w:val="num" w:pos="5040"/>
+        </w:tabs>
+        <w:ind w:left="5040" w:hanging="360"/>
+      </w:pPr>
+      <w:rPr>
+        <w:rFonts w:ascii="Wingdings" w:hAnsi="Wingdings" w:hint="default"/>
+        <w:sz w:val="20"/>
+      </w:rPr>
+    </w:lvl>
+    <w:lvl w:ilvl="7" w:tentative="1">
+      <w:start w:val="1"/>
+      <w:numFmt w:val="bullet"/>
+      <w:lvlText w:val=""/>
+      <w:lvlJc w:val="left"/>
+      <w:pPr>
+        <w:tabs>
+          <w:tab w:val="num" w:pos="5760"/>
+        </w:tabs>
+        <w:ind w:left="5760" w:hanging="360"/>
+      </w:pPr>
+      <w:rPr>
+        <w:rFonts w:ascii="Wingdings" w:hAnsi="Wingdings" w:hint="default"/>
+        <w:sz w:val="20"/>
+      </w:rPr>
+    </w:lvl>
+    <w:lvl w:ilvl="8" w:tentative="1">
+      <w:start w:val="1"/>
+      <w:numFmt w:val="bullet"/>
+      <w:lvlText w:val=""/>
+      <w:lvlJc w:val="left"/>
+      <w:pPr>
+        <w:tabs>
+          <w:tab w:val="num" w:pos="6480"/>
+        </w:tabs>
+        <w:ind w:left="6480" w:hanging="360"/>
+      </w:pPr>
+      <w:rPr>
+        <w:rFonts w:ascii="Wingdings" w:hAnsi="Wingdings" w:hint="default"/>
+        <w:sz w:val="20"/>
+      </w:rPr>
+    </w:lvl>
+  </w:abstractNum>
+  <w:abstractNum w:abstractNumId="14">
+    <w:nsid w:val="6D262933"/>
+    <w:multiLevelType w:val="multilevel"/>
+    <w:tmpl w:val="A3C68F38"/>
+    <w:lvl w:ilvl="0">
+      <w:start w:val="1"/>
+      <w:numFmt w:val="bullet"/>
+      <w:lvlText w:val=""/>
+      <w:lvlJc w:val="left"/>
+      <w:pPr>
+        <w:tabs>
+          <w:tab w:val="num" w:pos="720"/>
+        </w:tabs>
+        <w:ind w:left="720" w:hanging="360"/>
+      </w:pPr>
+      <w:rPr>
+        <w:rFonts w:ascii="Symbol" w:hAnsi="Symbol" w:hint="default"/>
+        <w:sz w:val="20"/>
+      </w:rPr>
+    </w:lvl>
+    <w:lvl w:ilvl="1" w:tentative="1">
+      <w:start w:val="1"/>
+      <w:numFmt w:val="bullet"/>
+      <w:lvlText w:val="o"/>
+      <w:lvlJc w:val="left"/>
+      <w:pPr>
+        <w:tabs>
+          <w:tab w:val="num" w:pos="1440"/>
+        </w:tabs>
+        <w:ind w:left="1440" w:hanging="360"/>
+      </w:pPr>
+      <w:rPr>
+        <w:rFonts w:ascii="Courier New" w:hAnsi="Courier New" w:hint="default"/>
+        <w:sz w:val="20"/>
+      </w:rPr>
+    </w:lvl>
+    <w:lvl w:ilvl="2" w:tentative="1">
+      <w:start w:val="1"/>
+      <w:numFmt w:val="bullet"/>
+      <w:lvlText w:val=""/>
+      <w:lvlJc w:val="left"/>
+      <w:pPr>
+        <w:tabs>
+          <w:tab w:val="num" w:pos="2160"/>
+        </w:tabs>
+        <w:ind w:left="2160" w:hanging="360"/>
+      </w:pPr>
+      <w:rPr>
+        <w:rFonts w:ascii="Wingdings" w:hAnsi="Wingdings" w:hint="default"/>
+        <w:sz w:val="20"/>
+      </w:rPr>
+    </w:lvl>
+    <w:lvl w:ilvl="3" w:tentative="1">
+      <w:start w:val="1"/>
+      <w:numFmt w:val="bullet"/>
+      <w:lvlText w:val=""/>
+      <w:lvlJc w:val="left"/>
+      <w:pPr>
+        <w:tabs>
+          <w:tab w:val="num" w:pos="2880"/>
+        </w:tabs>
+        <w:ind w:left="2880" w:hanging="360"/>
+      </w:pPr>
+      <w:rPr>
+        <w:rFonts w:ascii="Wingdings" w:hAnsi="Wingdings" w:hint="default"/>
+        <w:sz w:val="20"/>
+      </w:rPr>
+    </w:lvl>
+    <w:lvl w:ilvl="4" w:tentative="1">
+      <w:start w:val="1"/>
+      <w:numFmt w:val="bullet"/>
+      <w:lvlText w:val=""/>
+      <w:lvlJc w:val="left"/>
+      <w:pPr>
+        <w:tabs>
+          <w:tab w:val="num" w:pos="3600"/>
+        </w:tabs>
+        <w:ind w:left="3600" w:hanging="360"/>
+      </w:pPr>
+      <w:rPr>
+        <w:rFonts w:ascii="Wingdings" w:hAnsi="Wingdings" w:hint="default"/>
+        <w:sz w:val="20"/>
+      </w:rPr>
+    </w:lvl>
+    <w:lvl w:ilvl="5" w:tentative="1">
+      <w:start w:val="1"/>
+      <w:numFmt w:val="bullet"/>
+      <w:lvlText w:val=""/>
+      <w:lvlJc w:val="left"/>
+      <w:pPr>
+        <w:tabs>
+          <w:tab w:val="num" w:pos="4320"/>
+        </w:tabs>
+        <w:ind w:left="4320" w:hanging="360"/>
+      </w:pPr>
+      <w:rPr>
+        <w:rFonts w:ascii="Wingdings" w:hAnsi="Wingdings" w:hint="default"/>
+        <w:sz w:val="20"/>
+      </w:rPr>
+    </w:lvl>
+    <w:lvl w:ilvl="6" w:tentative="1">
+      <w:start w:val="1"/>
+      <w:numFmt w:val="bullet"/>
+      <w:lvlText w:val=""/>
+      <w:lvlJc w:val="left"/>
+      <w:pPr>
+        <w:tabs>
+          <w:tab w:val="num" w:pos="5040"/>
+        </w:tabs>
+        <w:ind w:left="5040" w:hanging="360"/>
+      </w:pPr>
+      <w:rPr>
+        <w:rFonts w:ascii="Wingdings" w:hAnsi="Wingdings" w:hint="default"/>
+        <w:sz w:val="20"/>
+      </w:rPr>
+    </w:lvl>
+    <w:lvl w:ilvl="7" w:tentative="1">
+      <w:start w:val="1"/>
+      <w:numFmt w:val="bullet"/>
+      <w:lvlText w:val=""/>
+      <w:lvlJc w:val="left"/>
+      <w:pPr>
+        <w:tabs>
+          <w:tab w:val="num" w:pos="5760"/>
+        </w:tabs>
+        <w:ind w:left="5760" w:hanging="360"/>
+      </w:pPr>
+      <w:rPr>
+        <w:rFonts w:ascii="Wingdings" w:hAnsi="Wingdings" w:hint="default"/>
+        <w:sz w:val="20"/>
+      </w:rPr>
+    </w:lvl>
+    <w:lvl w:ilvl="8" w:tentative="1">
+      <w:start w:val="1"/>
+      <w:numFmt w:val="bullet"/>
+      <w:lvlText w:val=""/>
+      <w:lvlJc w:val="left"/>
+      <w:pPr>
+        <w:tabs>
+          <w:tab w:val="num" w:pos="6480"/>
+        </w:tabs>
+        <w:ind w:left="6480" w:hanging="360"/>
+      </w:pPr>
+      <w:rPr>
+        <w:rFonts w:ascii="Wingdings" w:hAnsi="Wingdings" w:hint="default"/>
+        <w:sz w:val="20"/>
+      </w:rPr>
+    </w:lvl>
+  </w:abstractNum>
+  <w:abstractNum w:abstractNumId="15">
+    <w:nsid w:val="77FA102A"/>
+    <w:multiLevelType w:val="multilevel"/>
+    <w:tmpl w:val="92262586"/>
     <w:lvl w:ilvl="0">
       <w:start w:val="1"/>
       <w:numFmt w:val="bullet"/>
@@ -10422,40 +13160,49 @@
     </w:lvlOverride>
   </w:num>
   <w:num w:numId="2">
+    <w:abstractNumId w:val="10"/>
+  </w:num>
+  <w:num w:numId="3">
     <w:abstractNumId w:val="9"/>
   </w:num>
-  <w:num w:numId="3">
-    <w:abstractNumId w:val="8"/>
-  </w:num>
   <w:num w:numId="4">
-    <w:abstractNumId w:val="11"/>
+    <w:abstractNumId w:val="12"/>
   </w:num>
   <w:num w:numId="5">
-    <w:abstractNumId w:val="2"/>
+    <w:abstractNumId w:val="3"/>
   </w:num>
   <w:num w:numId="6">
-    <w:abstractNumId w:val="4"/>
+    <w:abstractNumId w:val="5"/>
   </w:num>
   <w:num w:numId="7">
-    <w:abstractNumId w:val="6"/>
+    <w:abstractNumId w:val="7"/>
   </w:num>
   <w:num w:numId="8">
     <w:abstractNumId w:val="1"/>
   </w:num>
   <w:num w:numId="9">
-    <w:abstractNumId w:val="12"/>
+    <w:abstractNumId w:val="13"/>
   </w:num>
   <w:num w:numId="10">
-    <w:abstractNumId w:val="3"/>
+    <w:abstractNumId w:val="4"/>
   </w:num>
   <w:num w:numId="11">
-    <w:abstractNumId w:val="10"/>
+    <w:abstractNumId w:val="11"/>
   </w:num>
   <w:num w:numId="12">
-    <w:abstractNumId w:val="5"/>
+    <w:abstractNumId w:val="6"/>
   </w:num>
   <w:num w:numId="13">
-    <w:abstractNumId w:val="7"/>
+    <w:abstractNumId w:val="8"/>
+  </w:num>
+  <w:num w:numId="14">
+    <w:abstractNumId w:val="14"/>
+  </w:num>
+  <w:num w:numId="15">
+    <w:abstractNumId w:val="2"/>
+  </w:num>
+  <w:num w:numId="16">
+    <w:abstractNumId w:val="15"/>
   </w:num>
 </w:numbering>
 </file>

</xml_diff>